<commit_message>
80s Park Event Content Update
</commit_message>
<xml_diff>
--- a/PATCH_NOTES_v0.4.8.5.docx
+++ b/PATCH_NOTES_v0.4.8.5.docx
@@ -3556,6 +3556,1609 @@
     </w:p>
     <w:p>
       <w:pPr>
+        <w:pStyle w:val="Heading1"/>
+        <w:spacing w:after="120" w:before="280"/>
+      </w:pPr>
+      <w:r>
+        <w:rPr>
+          <w:rFonts w:ascii="Calibri" w:cs="Calibri" w:eastAsia="Calibri" w:hAnsi="Calibri"/>
+          <w:b/>
+          <w:bCs/>
+          <w:color w:val="C8102E"/>
+          <w:sz w:val="32"/>
+          <w:szCs w:val="32"/>
+        </w:rPr>
+        <w:t xml:space="preserve">Quick patch (Oct 13): And The Beat Goes On</w:t>
+      </w:r>
+    </w:p>
+    <w:p>
+      <w:pPr>
+        <w:spacing w:after="140" w:line="288"/>
+      </w:pPr>
+      <w:r>
+        <w:rPr>
+          <w:rFonts w:ascii="Calibri" w:cs="Calibri" w:eastAsia="Calibri" w:hAnsi="Calibri"/>
+          <w:color w:val="1F2328"/>
+        </w:rPr>
+        <w:t xml:space="preserve">The next park event, </w:t>
+      </w:r>
+      <w:r>
+        <w:rPr>
+          <w:rFonts w:ascii="Calibri" w:cs="Calibri" w:eastAsia="Calibri" w:hAnsi="Calibri"/>
+          <w:b/>
+          <w:bCs/>
+          <w:color w:val="1F2328"/>
+        </w:rPr>
+        <w:t xml:space="preserve">And The Beat Goes On</w:t>
+      </w:r>
+      <w:r>
+        <w:rPr>
+          <w:rFonts w:ascii="Calibri" w:cs="Calibri" w:eastAsia="Calibri" w:hAnsi="Calibri"/>
+          <w:color w:val="1F2328"/>
+        </w:rPr>
+        <w:t xml:space="preserve">, takes over from The Jungle Ballers the moment the Jungle's leaderboard closes: </w:t>
+      </w:r>
+      <w:r>
+        <w:rPr>
+          <w:rFonts w:ascii="Calibri" w:cs="Calibri" w:eastAsia="Calibri" w:hAnsi="Calibri"/>
+          <w:b/>
+          <w:bCs/>
+          <w:color w:val="1F2328"/>
+        </w:rPr>
+        <w:t xml:space="preserve">October 14 at 00:00 UTC</w:t>
+      </w:r>
+      <w:r>
+        <w:rPr>
+          <w:rFonts w:ascii="Calibri" w:cs="Calibri" w:eastAsia="Calibri" w:hAnsi="Calibri"/>
+          <w:color w:val="1F2328"/>
+        </w:rPr>
+        <w:t xml:space="preserve"> (8 pm Eastern, 5 pm Pacific on October 13). Until then the Jungle runs as normal and pays its prizes as normal. After that its park closes, just as the King Tut Cup's did. Nothing of it is deleted, so it can come back for a future event.</w:t>
+      </w:r>
+    </w:p>
+    <w:p>
+      <w:pPr>
+        <w:pStyle w:val="Heading2"/>
+        <w:spacing w:after="80" w:before="200"/>
+      </w:pPr>
+      <w:r>
+        <w:rPr>
+          <w:rFonts w:ascii="Calibri" w:cs="Calibri" w:eastAsia="Calibri" w:hAnsi="Calibri"/>
+          <w:b/>
+          <w:bCs/>
+          <w:color w:val="1F2328"/>
+          <w:sz w:val="26"/>
+          <w:szCs w:val="26"/>
+        </w:rPr>
+        <w:t xml:space="preserve">The park: an 80s city at sundown</w:t>
+      </w:r>
+    </w:p>
+    <w:p>
+      <w:pPr>
+        <w:pStyle w:val="ListParagraph"/>
+        <w:numPr>
+          <w:ilvl w:val="0"/>
+          <w:numId w:val="2"/>
+        </w:numPr>
+        <w:spacing w:after="80" w:line="276"/>
+      </w:pPr>
+      <w:r>
+        <w:rPr>
+          <w:rFonts w:ascii="Calibri" w:cs="Calibri" w:eastAsia="Calibri" w:hAnsi="Calibri"/>
+          <w:b/>
+          <w:bCs/>
+          <w:color w:val="1F2328"/>
+        </w:rPr>
+        <w:t xml:space="preserve">The sun sits right on the horizon</w:t>
+      </w:r>
+      <w:r>
+        <w:rPr>
+          <w:rFonts w:ascii="Calibri" w:cs="Calibri" w:eastAsia="Calibri" w:hAnsi="Calibri"/>
+          <w:color w:val="1F2328"/>
+        </w:rPr>
+        <w:t xml:space="preserve"> and the whole city glows orange. The sky runs from deep indigo overhead through magenta and hot pink to orange at the horizon. A big striped synthwave sun sits low in the west-north-west, with pink clouds across it. The buildings in that direction are low, so you can see the sun above the roofs and down the boulevard between the palms. The shadows are long, but the courts stay bright and the players stay easy to read.</w:t>
+      </w:r>
+    </w:p>
+    <w:p>
+      <w:pPr>
+        <w:pStyle w:val="ListParagraph"/>
+        <w:numPr>
+          <w:ilvl w:val="0"/>
+          <w:numId w:val="2"/>
+        </w:numPr>
+        <w:spacing w:after="80" w:line="276"/>
+      </w:pPr>
+      <w:r>
+        <w:rPr>
+          <w:rFonts w:ascii="Calibri" w:cs="Calibri" w:eastAsia="Calibri" w:hAnsi="Calibri"/>
+          <w:b/>
+          <w:bCs/>
+          <w:color w:val="1F2328"/>
+        </w:rPr>
+        <w:t xml:space="preserve">Retro courts:</w:t>
+      </w:r>
+      <w:r>
+        <w:rPr>
+          <w:rFonts w:ascii="Calibri" w:cs="Calibri" w:eastAsia="Calibri" w:hAnsi="Calibri"/>
+          <w:color w:val="1F2328"/>
+        </w:rPr>
+        <w:t xml:space="preserve"> violet floors, hot-pink aprons, teal keys and cream lines, framed with sunset stripes. Memphis-style squiggles, triangles, dots and zigzags cover the aprons. At center court there's a sunset logo (a striped sun over a neon grid between palms, with BEAT in chrome), and "AND THE BEAT GOES ON" runs along the baselines. The hoops have pink rims and purple poles, and the benches are pink and teal.</w:t>
+      </w:r>
+    </w:p>
+    <w:p>
+      <w:pPr>
+        <w:pStyle w:val="ListParagraph"/>
+        <w:numPr>
+          <w:ilvl w:val="0"/>
+          <w:numId w:val="2"/>
+        </w:numPr>
+        <w:spacing w:after="80" w:line="276"/>
+      </w:pPr>
+      <w:r>
+        <w:rPr>
+          <w:rFonts w:ascii="Calibri" w:cs="Calibri" w:eastAsia="Calibri" w:hAnsi="Calibri"/>
+          <w:b/>
+          <w:bCs/>
+          <w:color w:val="1F2328"/>
+        </w:rPr>
+        <w:t xml:space="preserve">The city:</w:t>
+      </w:r>
+    </w:p>
+    <w:p>
+      <w:pPr>
+        <w:pStyle w:val="ListParagraph"/>
+        <w:numPr>
+          <w:ilvl w:val="1"/>
+          <w:numId w:val="2"/>
+        </w:numPr>
+        <w:spacing w:after="80" w:line="276"/>
+      </w:pPr>
+      <w:r>
+        <w:rPr>
+          <w:rFonts w:ascii="Calibri" w:cs="Calibri" w:eastAsia="Calibri" w:hAnsi="Calibri"/>
+          <w:b/>
+          <w:bCs/>
+          <w:color w:val="1F2328"/>
+        </w:rPr>
+        <w:t xml:space="preserve">Streets and buildings:</w:t>
+      </w:r>
+      <w:r>
+        <w:rPr>
+          <w:rFonts w:ascii="Calibri" w:cs="Calibri" w:eastAsia="Calibri" w:hAnsi="Calibri"/>
+          <w:color w:val="1F2328"/>
+        </w:rPr>
+        <w:t xml:space="preserve"> a palm-lined boulevard (the Strip) runs north of the park, with avenues on both sides. Pastel art-deco blocks have neon trim and racing stripes, and mirror-glass towers have neon crowns.</w:t>
+      </w:r>
+    </w:p>
+    <w:p>
+      <w:pPr>
+        <w:pStyle w:val="ListParagraph"/>
+        <w:numPr>
+          <w:ilvl w:val="1"/>
+          <w:numId w:val="2"/>
+        </w:numPr>
+        <w:spacing w:after="80" w:line="276"/>
+      </w:pPr>
+      <w:r>
+        <w:rPr>
+          <w:rFonts w:ascii="Calibri" w:cs="Calibri" w:eastAsia="Calibri" w:hAnsi="Calibri"/>
+          <w:b/>
+          <w:bCs/>
+          <w:color w:val="1F2328"/>
+        </w:rPr>
+        <w:t xml:space="preserve">Places:</w:t>
+      </w:r>
+      <w:r>
+        <w:rPr>
+          <w:rFonts w:ascii="Calibri" w:cs="Calibri" w:eastAsia="Calibri" w:hAnsi="Calibri"/>
+          <w:color w:val="1F2328"/>
+        </w:rPr>
+        <w:t xml:space="preserve"> a strip of shops faces the plaza (a diner, a cocktail bar, a record store, a pizza place and a live-music club). There's also an arcade, a barrel-roofed roller rink, a motel with a chasing-arrow sign, and a hotel with an AND THE BEAT GOES ON billboard on the roof. The park's mural is now a boombox-and-cassette mural.</w:t>
+      </w:r>
+    </w:p>
+    <w:p>
+      <w:pPr>
+        <w:pStyle w:val="ListParagraph"/>
+        <w:numPr>
+          <w:ilvl w:val="1"/>
+          <w:numId w:val="2"/>
+        </w:numPr>
+        <w:spacing w:after="80" w:line="276"/>
+      </w:pPr>
+      <w:r>
+        <w:rPr>
+          <w:rFonts w:ascii="Calibri" w:cs="Calibri" w:eastAsia="Calibri" w:hAnsi="Calibri"/>
+          <w:b/>
+          <w:bCs/>
+          <w:color w:val="1F2328"/>
+        </w:rPr>
+        <w:t xml:space="preserve">Neon everywhere:</w:t>
+      </w:r>
+      <w:r>
+        <w:rPr>
+          <w:rFonts w:ascii="Calibri" w:cs="Calibri" w:eastAsia="Calibri" w:hAnsi="Calibri"/>
+          <w:color w:val="1F2328"/>
+        </w:rPr>
+        <w:t xml:space="preserve"> some signs hold steady, some flicker, some change colour and some chase their bulbs.</w:t>
+      </w:r>
+    </w:p>
+    <w:p>
+      <w:pPr>
+        <w:pStyle w:val="ListParagraph"/>
+        <w:numPr>
+          <w:ilvl w:val="0"/>
+          <w:numId w:val="2"/>
+        </w:numPr>
+        <w:spacing w:after="80" w:line="276"/>
+      </w:pPr>
+      <w:r>
+        <w:rPr>
+          <w:rFonts w:ascii="Calibri" w:cs="Calibri" w:eastAsia="Calibri" w:hAnsi="Calibri"/>
+          <w:b/>
+          <w:bCs/>
+          <w:color w:val="1F2328"/>
+        </w:rPr>
+        <w:t xml:space="preserve">The disco bar:</w:t>
+      </w:r>
+      <w:r>
+        <w:rPr>
+          <w:rFonts w:ascii="Calibri" w:cs="Calibri" w:eastAsia="Calibri" w:hAnsi="Calibri"/>
+          <w:color w:val="1F2328"/>
+        </w:rPr>
+        <w:t xml:space="preserve"> a black-and-chrome front with DISCO in pink neon, framed by chasing bulbs. A big mirror ball turns over the door, throwing coloured beams down the sidewalk. Through the windows you see a light-up dance floor stepping on the beat, a second mirror ball and the DJ booth. Two searchlights sweep the sky. Dancers spill out of the door, and a line waits behind the velvet rope with a bouncer.</w:t>
+      </w:r>
+    </w:p>
+    <w:p>
+      <w:pPr>
+        <w:pStyle w:val="ListParagraph"/>
+        <w:numPr>
+          <w:ilvl w:val="0"/>
+          <w:numId w:val="2"/>
+        </w:numPr>
+        <w:spacing w:after="80" w:line="276"/>
+      </w:pPr>
+      <w:r>
+        <w:rPr>
+          <w:rFonts w:ascii="Calibri" w:cs="Calibri" w:eastAsia="Calibri" w:hAnsi="Calibri"/>
+          <w:b/>
+          <w:bCs/>
+          <w:color w:val="1F2328"/>
+        </w:rPr>
+        <w:t xml:space="preserve">Lowriders:</w:t>
+      </w:r>
+      <w:r>
+        <w:rPr>
+          <w:rFonts w:ascii="Calibri" w:cs="Calibri" w:eastAsia="Calibri" w:hAnsi="Calibri"/>
+          <w:color w:val="1F2328"/>
+        </w:rPr>
+        <w:t xml:space="preserve"> eleven candy-painted lowriders cruise the Strip and the avenues, and every now and then one pumps its front end or goes up on three wheels. In the lot by the disco, one hops in place (sparks when it lands) and another holds a three-wheel pose. A third bounces its hood at the kerb.</w:t>
+      </w:r>
+    </w:p>
+    <w:p>
+      <w:pPr>
+        <w:pStyle w:val="ListParagraph"/>
+        <w:numPr>
+          <w:ilvl w:val="0"/>
+          <w:numId w:val="2"/>
+        </w:numPr>
+        <w:spacing w:after="80" w:line="276"/>
+      </w:pPr>
+      <w:r>
+        <w:rPr>
+          <w:rFonts w:ascii="Calibri" w:cs="Calibri" w:eastAsia="Calibri" w:hAnsi="Calibri"/>
+          <w:b/>
+          <w:bCs/>
+          <w:color w:val="1F2328"/>
+        </w:rPr>
+        <w:t xml:space="preserve">Dancers:</w:t>
+      </w:r>
+      <w:r>
+        <w:rPr>
+          <w:rFonts w:ascii="Calibri" w:cs="Calibri" w:eastAsia="Calibri" w:hAnsi="Calibri"/>
+          <w:color w:val="1F2328"/>
+        </w:rPr>
+        <w:t xml:space="preserve"> four b-boys take turns on a square of cardboard by the plaza (toprock, six-steps, headspins, windmills and freezes) while people clap. There's also a boombox crew of poppers and a locker, a crowd dancing at the disco door, and roller skaters circling the block.</w:t>
+      </w:r>
+    </w:p>
+    <w:p>
+      <w:pPr>
+        <w:pStyle w:val="ListParagraph"/>
+        <w:numPr>
+          <w:ilvl w:val="0"/>
+          <w:numId w:val="2"/>
+        </w:numPr>
+        <w:spacing w:after="80" w:line="276"/>
+      </w:pPr>
+      <w:r>
+        <w:rPr>
+          <w:rFonts w:ascii="Calibri" w:cs="Calibri" w:eastAsia="Calibri" w:hAnsi="Calibri"/>
+          <w:b/>
+          <w:bCs/>
+          <w:color w:val="1F2328"/>
+        </w:rPr>
+        <w:t xml:space="preserve">Random events</w:t>
+      </w:r>
+      <w:r>
+        <w:rPr>
+          <w:rFonts w:ascii="Calibri" w:cs="Calibri" w:eastAsia="Calibri" w:hAnsi="Calibri"/>
+          <w:color w:val="1F2328"/>
+        </w:rPr>
+        <w:t xml:space="preserve"> (one every half minute or so):</w:t>
+      </w:r>
+    </w:p>
+    <w:p>
+      <w:pPr>
+        <w:pStyle w:val="ListParagraph"/>
+        <w:numPr>
+          <w:ilvl w:val="1"/>
+          <w:numId w:val="2"/>
+        </w:numPr>
+        <w:spacing w:after="80" w:line="276"/>
+      </w:pPr>
+      <w:r>
+        <w:rPr>
+          <w:rFonts w:ascii="Calibri" w:cs="Calibri" w:eastAsia="Calibri" w:hAnsi="Calibri"/>
+          <w:color w:val="1F2328"/>
+        </w:rPr>
+        <w:t xml:space="preserve">a lowrider hop-off on the Strip, with a crowd;</w:t>
+      </w:r>
+    </w:p>
+    <w:p>
+      <w:pPr>
+        <w:pStyle w:val="ListParagraph"/>
+        <w:numPr>
+          <w:ilvl w:val="1"/>
+          <w:numId w:val="2"/>
+        </w:numPr>
+        <w:spacing w:after="80" w:line="276"/>
+      </w:pPr>
+      <w:r>
+        <w:rPr>
+          <w:rFonts w:ascii="Calibri" w:cs="Calibri" w:eastAsia="Calibri" w:hAnsi="Calibri"/>
+          <w:color w:val="1F2328"/>
+        </w:rPr>
+        <w:t xml:space="preserve">a breakdance battle;</w:t>
+      </w:r>
+    </w:p>
+    <w:p>
+      <w:pPr>
+        <w:pStyle w:val="ListParagraph"/>
+        <w:numPr>
+          <w:ilvl w:val="1"/>
+          <w:numId w:val="2"/>
+        </w:numPr>
+        <w:spacing w:after="80" w:line="276"/>
+      </w:pPr>
+      <w:r>
+        <w:rPr>
+          <w:rFonts w:ascii="Calibri" w:cs="Calibri" w:eastAsia="Calibri" w:hAnsi="Calibri"/>
+          <w:color w:val="1F2328"/>
+        </w:rPr>
+        <w:t xml:space="preserve">a roller-skate train;</w:t>
+      </w:r>
+    </w:p>
+    <w:p>
+      <w:pPr>
+        <w:pStyle w:val="ListParagraph"/>
+        <w:numPr>
+          <w:ilvl w:val="1"/>
+          <w:numId w:val="2"/>
+        </w:numPr>
+        <w:spacing w:after="80" w:line="276"/>
+      </w:pPr>
+      <w:r>
+        <w:rPr>
+          <w:rFonts w:ascii="Calibri" w:cs="Calibri" w:eastAsia="Calibri" w:hAnsi="Calibri"/>
+          <w:color w:val="1F2328"/>
+        </w:rPr>
+        <w:t xml:space="preserve">a neon blackout that flickers back on;</w:t>
+      </w:r>
+    </w:p>
+    <w:p>
+      <w:pPr>
+        <w:pStyle w:val="ListParagraph"/>
+        <w:numPr>
+          <w:ilvl w:val="1"/>
+          <w:numId w:val="2"/>
+        </w:numPr>
+        <w:spacing w:after="80" w:line="276"/>
+      </w:pPr>
+      <w:r>
+        <w:rPr>
+          <w:rFonts w:ascii="Calibri" w:cs="Calibri" w:eastAsia="Calibri" w:hAnsi="Calibri"/>
+          <w:color w:val="1F2328"/>
+        </w:rPr>
+        <w:t xml:space="preserve">a plane towing an AND THE BEAT GOES ON banner;</w:t>
+      </w:r>
+    </w:p>
+    <w:p>
+      <w:pPr>
+        <w:pStyle w:val="ListParagraph"/>
+        <w:numPr>
+          <w:ilvl w:val="1"/>
+          <w:numId w:val="2"/>
+        </w:numPr>
+        <w:spacing w:after="80" w:line="276"/>
+      </w:pPr>
+      <w:r>
+        <w:rPr>
+          <w:rFonts w:ascii="Calibri" w:cs="Calibri" w:eastAsia="Calibri" w:hAnsi="Calibri"/>
+          <w:color w:val="1F2328"/>
+        </w:rPr>
+        <w:t xml:space="preserve">a blimp with a scrolling sign;</w:t>
+      </w:r>
+    </w:p>
+    <w:p>
+      <w:pPr>
+        <w:pStyle w:val="ListParagraph"/>
+        <w:numPr>
+          <w:ilvl w:val="1"/>
+          <w:numId w:val="2"/>
+        </w:numPr>
+        <w:spacing w:after="80" w:line="276"/>
+      </w:pPr>
+      <w:r>
+        <w:rPr>
+          <w:rFonts w:ascii="Calibri" w:cs="Calibri" w:eastAsia="Calibri" w:hAnsi="Calibri"/>
+          <w:color w:val="1F2328"/>
+        </w:rPr>
+        <w:t xml:space="preserve">a disco light show with searchlights and lasers in the sky;</w:t>
+      </w:r>
+    </w:p>
+    <w:p>
+      <w:pPr>
+        <w:pStyle w:val="ListParagraph"/>
+        <w:numPr>
+          <w:ilvl w:val="1"/>
+          <w:numId w:val="2"/>
+        </w:numPr>
+        <w:spacing w:after="80" w:line="276"/>
+      </w:pPr>
+      <w:r>
+        <w:rPr>
+          <w:rFonts w:ascii="Calibri" w:cs="Calibri" w:eastAsia="Calibri" w:hAnsi="Calibri"/>
+          <w:color w:val="1F2328"/>
+        </w:rPr>
+        <w:t xml:space="preserve">fireworks over the Strip;</w:t>
+      </w:r>
+    </w:p>
+    <w:p>
+      <w:pPr>
+        <w:pStyle w:val="ListParagraph"/>
+        <w:numPr>
+          <w:ilvl w:val="1"/>
+          <w:numId w:val="2"/>
+        </w:numPr>
+        <w:spacing w:after="80" w:line="276"/>
+      </w:pPr>
+      <w:r>
+        <w:rPr>
+          <w:rFonts w:ascii="Calibri" w:cs="Calibri" w:eastAsia="Calibri" w:hAnsi="Calibri"/>
+          <w:color w:val="1F2328"/>
+        </w:rPr>
+        <w:t xml:space="preserve">a lowrider parade.</w:t>
+      </w:r>
+    </w:p>
+    <w:p>
+      <w:pPr>
+        <w:pStyle w:val="ListParagraph"/>
+        <w:numPr>
+          <w:ilvl w:val="0"/>
+          <w:numId w:val="2"/>
+        </w:numPr>
+        <w:spacing w:after="80" w:line="276"/>
+      </w:pPr>
+      <w:r>
+        <w:rPr>
+          <w:rFonts w:ascii="Calibri" w:cs="Calibri" w:eastAsia="Calibri" w:hAnsi="Calibri"/>
+          <w:b/>
+          <w:bCs/>
+          <w:color w:val="1F2328"/>
+        </w:rPr>
+        <w:t xml:space="preserve">On a win streak the court turns into a disco:</w:t>
+      </w:r>
+    </w:p>
+    <w:p>
+      <w:pPr>
+        <w:pStyle w:val="ListParagraph"/>
+        <w:numPr>
+          <w:ilvl w:val="1"/>
+          <w:numId w:val="2"/>
+        </w:numPr>
+        <w:spacing w:after="80" w:line="276"/>
+      </w:pPr>
+      <w:r>
+        <w:rPr>
+          <w:rFonts w:ascii="Calibri" w:cs="Calibri" w:eastAsia="Calibri" w:hAnsi="Calibri"/>
+          <w:b/>
+          <w:bCs/>
+          <w:color w:val="1F2328"/>
+        </w:rPr>
+        <w:t xml:space="preserve">3 wins:</w:t>
+      </w:r>
+      <w:r>
+        <w:rPr>
+          <w:rFonts w:ascii="Calibri" w:cs="Calibri" w:eastAsia="Calibri" w:hAnsi="Calibri"/>
+          <w:color w:val="1F2328"/>
+        </w:rPr>
+        <w:t xml:space="preserve"> a mirror ball lowers over the court and two spotlights sweep the floor.</w:t>
+      </w:r>
+    </w:p>
+    <w:p>
+      <w:pPr>
+        <w:pStyle w:val="ListParagraph"/>
+        <w:numPr>
+          <w:ilvl w:val="1"/>
+          <w:numId w:val="2"/>
+        </w:numPr>
+        <w:spacing w:after="80" w:line="276"/>
+      </w:pPr>
+      <w:r>
+        <w:rPr>
+          <w:rFonts w:ascii="Calibri" w:cs="Calibri" w:eastAsia="Calibri" w:hAnsi="Calibri"/>
+          <w:b/>
+          <w:bCs/>
+          <w:color w:val="1F2328"/>
+        </w:rPr>
+        <w:t xml:space="preserve">6 wins:</w:t>
+      </w:r>
+      <w:r>
+        <w:rPr>
+          <w:rFonts w:ascii="Calibri" w:cs="Calibri" w:eastAsia="Calibri" w:hAnsi="Calibri"/>
+          <w:color w:val="1F2328"/>
+        </w:rPr>
+        <w:t xml:space="preserve"> more spots, and coloured light on the players.</w:t>
+      </w:r>
+    </w:p>
+    <w:p>
+      <w:pPr>
+        <w:pStyle w:val="ListParagraph"/>
+        <w:numPr>
+          <w:ilvl w:val="1"/>
+          <w:numId w:val="2"/>
+        </w:numPr>
+        <w:spacing w:after="80" w:line="276"/>
+      </w:pPr>
+      <w:r>
+        <w:rPr>
+          <w:rFonts w:ascii="Calibri" w:cs="Calibri" w:eastAsia="Calibri" w:hAnsi="Calibri"/>
+          <w:b/>
+          <w:bCs/>
+          <w:color w:val="1F2328"/>
+        </w:rPr>
+        <w:t xml:space="preserve">9 wins:</w:t>
+      </w:r>
+      <w:r>
+        <w:rPr>
+          <w:rFonts w:ascii="Calibri" w:cs="Calibri" w:eastAsia="Calibri" w:hAnsi="Calibri"/>
+          <w:color w:val="1F2328"/>
+        </w:rPr>
+        <w:t xml:space="preserve"> mirror-ball specks wheel round the court.</w:t>
+      </w:r>
+    </w:p>
+    <w:p>
+      <w:pPr>
+        <w:pStyle w:val="ListParagraph"/>
+        <w:numPr>
+          <w:ilvl w:val="1"/>
+          <w:numId w:val="2"/>
+        </w:numPr>
+        <w:spacing w:after="80" w:line="276"/>
+      </w:pPr>
+      <w:r>
+        <w:rPr>
+          <w:rFonts w:ascii="Calibri" w:cs="Calibri" w:eastAsia="Calibri" w:hAnsi="Calibri"/>
+          <w:b/>
+          <w:bCs/>
+          <w:color w:val="1F2328"/>
+        </w:rPr>
+        <w:t xml:space="preserve">12 wins:</w:t>
+      </w:r>
+      <w:r>
+        <w:rPr>
+          <w:rFonts w:ascii="Calibri" w:cs="Calibri" w:eastAsia="Calibri" w:hAnsi="Calibri"/>
+          <w:color w:val="1F2328"/>
+        </w:rPr>
+        <w:t xml:space="preserve"> the full show, with every spot going, pools of light flashing on the beat, and beams into the sky.</w:t>
+      </w:r>
+    </w:p>
+    <w:p>
+      <w:pPr>
+        <w:pStyle w:val="ListParagraph"/>
+        <w:numPr>
+          <w:ilvl w:val="0"/>
+          <w:numId w:val="2"/>
+        </w:numPr>
+        <w:spacing w:after="80" w:line="276"/>
+      </w:pPr>
+      <w:r>
+        <w:rPr>
+          <w:rFonts w:ascii="Calibri" w:cs="Calibri" w:eastAsia="Calibri" w:hAnsi="Calibri"/>
+          <w:color w:val="1F2328"/>
+        </w:rPr>
+        <w:t xml:space="preserve">The event's leaderboard stands in the park on a neon billboard.</w:t>
+      </w:r>
+    </w:p>
+    <w:p>
+      <w:pPr>
+        <w:pStyle w:val="Heading2"/>
+        <w:spacing w:after="80" w:before="200"/>
+      </w:pPr>
+      <w:r>
+        <w:rPr>
+          <w:rFonts w:ascii="Calibri" w:cs="Calibri" w:eastAsia="Calibri" w:hAnsi="Calibri"/>
+          <w:b/>
+          <w:bCs/>
+          <w:color w:val="1F2328"/>
+          <w:sz w:val="26"/>
+          <w:szCs w:val="26"/>
+        </w:rPr>
+        <w:t xml:space="preserve">Its own soundtrack (a first)</w:t>
+      </w:r>
+    </w:p>
+    <w:p>
+      <w:pPr>
+        <w:pStyle w:val="ListParagraph"/>
+        <w:numPr>
+          <w:ilvl w:val="0"/>
+          <w:numId w:val="2"/>
+        </w:numPr>
+        <w:spacing w:after="80" w:line="276"/>
+      </w:pPr>
+      <w:r>
+        <w:rPr>
+          <w:rFonts w:ascii="Calibri" w:cs="Calibri" w:eastAsia="Calibri" w:hAnsi="Calibri"/>
+          <w:b/>
+          <w:bCs/>
+          <w:color w:val="1F2328"/>
+        </w:rPr>
+        <w:t xml:space="preserve">The park has a soundtrack of its own:</w:t>
+      </w:r>
+      <w:r>
+        <w:rPr>
+          <w:rFonts w:ascii="Calibri" w:cs="Calibri" w:eastAsia="Calibri" w:hAnsi="Calibri"/>
+          <w:color w:val="1F2328"/>
+        </w:rPr>
+        <w:t xml:space="preserve"> 74 minutes of 80s R&amp;B (the mix you sent: New Edition, Janet Jackson, Keith Sweat, Zapp &amp; Roger and more), split into </w:t>
+      </w:r>
+      <w:r>
+        <w:rPr>
+          <w:rFonts w:ascii="Calibri" w:cs="Calibri" w:eastAsia="Calibri" w:hAnsi="Calibri"/>
+          <w:b/>
+          <w:bCs/>
+          <w:color w:val="1F2328"/>
+        </w:rPr>
+        <w:t xml:space="preserve">28 tracks</w:t>
+      </w:r>
+      <w:r>
+        <w:rPr>
+          <w:rFonts w:ascii="Calibri" w:cs="Calibri" w:eastAsia="Calibri" w:hAnsi="Calibri"/>
+          <w:color w:val="1F2328"/>
+        </w:rPr>
+        <w:t xml:space="preserve">.</w:t>
+      </w:r>
+    </w:p>
+    <w:p>
+      <w:pPr>
+        <w:pStyle w:val="ListParagraph"/>
+        <w:numPr>
+          <w:ilvl w:val="0"/>
+          <w:numId w:val="2"/>
+        </w:numPr>
+        <w:spacing w:after="80" w:line="276"/>
+      </w:pPr>
+      <w:r>
+        <w:rPr>
+          <w:rFonts w:ascii="Calibri" w:cs="Calibri" w:eastAsia="Calibri" w:hAnsi="Calibri"/>
+          <w:b/>
+          <w:bCs/>
+          <w:color w:val="1F2328"/>
+        </w:rPr>
+        <w:t xml:space="preserve">They play at the event park and nowhere else.</w:t>
+      </w:r>
+      <w:r>
+        <w:rPr>
+          <w:rFonts w:ascii="Calibri" w:cs="Calibri" w:eastAsia="Calibri" w:hAnsi="Calibri"/>
+          <w:color w:val="1F2328"/>
+        </w:rPr>
+        <w:t xml:space="preserve"> That includes the park games there. The menus, the other parks, the Crew HQ, Pro-Am and the Pro Run never play them. The event park plays nothing from the main soundtrack either.</w:t>
+      </w:r>
+    </w:p>
+    <w:p>
+      <w:pPr>
+        <w:pStyle w:val="ListParagraph"/>
+        <w:numPr>
+          <w:ilvl w:val="0"/>
+          <w:numId w:val="2"/>
+        </w:numPr>
+        <w:spacing w:after="80" w:line="276"/>
+      </w:pPr>
+      <w:r>
+        <w:rPr>
+          <w:rFonts w:ascii="Calibri" w:cs="Calibri" w:eastAsia="Calibri" w:hAnsi="Calibri"/>
+          <w:b/>
+          <w:bCs/>
+          <w:color w:val="1F2328"/>
+        </w:rPr>
+        <w:t xml:space="preserve">A new shuffle every time you arrive at the park.</w:t>
+      </w:r>
+      <w:r>
+        <w:rPr>
+          <w:rFonts w:ascii="Calibri" w:cs="Calibri" w:eastAsia="Calibri" w:hAnsi="Calibri"/>
+          <w:color w:val="1F2328"/>
+        </w:rPr>
+        <w:t xml:space="preserve"> The tracks you heard most recently go to the back of the order. When you leave, the main soundtrack picks up the song it was playing, from where it was.</w:t>
+      </w:r>
+    </w:p>
+    <w:p>
+      <w:pPr>
+        <w:pStyle w:val="ListParagraph"/>
+        <w:numPr>
+          <w:ilvl w:val="0"/>
+          <w:numId w:val="2"/>
+        </w:numPr>
+        <w:spacing w:after="80" w:line="276"/>
+      </w:pPr>
+      <w:r>
+        <w:rPr>
+          <w:rFonts w:ascii="Calibri" w:cs="Calibri" w:eastAsia="Calibri" w:hAnsi="Calibri"/>
+          <w:b/>
+          <w:bCs/>
+          <w:color w:val="1F2328"/>
+        </w:rPr>
+        <w:t xml:space="preserve">How the split was made:</w:t>
+      </w:r>
+      <w:r>
+        <w:rPr>
+          <w:rFonts w:ascii="Calibri" w:cs="Calibri" w:eastAsia="Calibri" w:hAnsi="Calibri"/>
+          <w:color w:val="1F2328"/>
+        </w:rPr>
+        <w:t xml:space="preserve"> the mix is one continuous DJ mix with no gaps between songs, so there were no silences to split at. The cuts are where the music changes most clearly: the key, the sound and the tempo all shift at once. Each cut is at the quietest moment within 4 seconds of the change, with a short fade in and out. That makes tracks of 1½ to 4½ minutes. A few cuts may fall in the middle of a DJ blend rather than exactly between two songs. The Now Playing ticker shows them as "80s R&amp;B Jamz · Cut 1 of 28" and so on (the mix doesn't name its songs). To put song names on them, edit </w:t>
+      </w:r>
+      <w:r>
+        <w:rPr>
+          <w:rFonts w:ascii="Consolas" w:cs="Consolas" w:eastAsia="Consolas" w:hAnsi="Consolas"/>
+          <w:color w:val="0B5394"/>
+          <w:sz w:val="19"/>
+          <w:szCs w:val="19"/>
+        </w:rPr>
+        <w:t xml:space="preserve">client/audio/beat/tracks.json</w:t>
+      </w:r>
+      <w:r>
+        <w:rPr>
+          <w:rFonts w:ascii="Calibri" w:cs="Calibri" w:eastAsia="Calibri" w:hAnsi="Calibri"/>
+          <w:color w:val="1F2328"/>
+        </w:rPr>
+        <w:t xml:space="preserve">.</w:t>
+      </w:r>
+    </w:p>
+    <w:p>
+      <w:pPr>
+        <w:pStyle w:val="ListParagraph"/>
+        <w:numPr>
+          <w:ilvl w:val="0"/>
+          <w:numId w:val="2"/>
+        </w:numPr>
+        <w:spacing w:after="80" w:line="276"/>
+      </w:pPr>
+      <w:r>
+        <w:rPr>
+          <w:rFonts w:ascii="Calibri" w:cs="Calibri" w:eastAsia="Calibri" w:hAnsi="Calibri"/>
+          <w:color w:val="1F2328"/>
+        </w:rPr>
+        <w:t xml:space="preserve">The tracks are in their own folder, </w:t>
+      </w:r>
+      <w:r>
+        <w:rPr>
+          <w:rFonts w:ascii="Consolas" w:cs="Consolas" w:eastAsia="Consolas" w:hAnsi="Consolas"/>
+          <w:color w:val="0B5394"/>
+          <w:sz w:val="19"/>
+          <w:szCs w:val="19"/>
+        </w:rPr>
+        <w:t xml:space="preserve">client/audio/beat</w:t>
+      </w:r>
+      <w:r>
+        <w:rPr>
+          <w:rFonts w:ascii="Calibri" w:cs="Calibri" w:eastAsia="Calibri" w:hAnsi="Calibri"/>
+          <w:color w:val="1F2328"/>
+        </w:rPr>
+        <w:t xml:space="preserve">. Without that folder the event park is simply quiet, as the rest of the game is without its music.</w:t>
+      </w:r>
+    </w:p>
+    <w:p>
+      <w:pPr>
+        <w:pStyle w:val="Heading2"/>
+        <w:spacing w:after="80" w:before="200"/>
+      </w:pPr>
+      <w:r>
+        <w:rPr>
+          <w:rFonts w:ascii="Calibri" w:cs="Calibri" w:eastAsia="Calibri" w:hAnsi="Calibri"/>
+          <w:b/>
+          <w:bCs/>
+          <w:color w:val="1F2328"/>
+          <w:sz w:val="26"/>
+          <w:szCs w:val="26"/>
+        </w:rPr>
+        <w:t xml:space="preserve">Rewards</w:t>
+      </w:r>
+    </w:p>
+    <w:p>
+      <w:pPr>
+        <w:spacing w:after="140" w:line="288"/>
+      </w:pPr>
+      <w:r>
+        <w:rPr>
+          <w:rFonts w:ascii="Calibri" w:cs="Calibri" w:eastAsia="Calibri" w:hAnsi="Calibri"/>
+          <w:color w:val="1F2328"/>
+        </w:rPr>
+        <w:t xml:space="preserve">The same tiers and prizes per place as the King Tut Cup and the Jungle Ballers, with all-new items. None of them can be bought.</w:t>
+      </w:r>
+    </w:p>
+    <w:tbl>
+      <w:tblPr>
+        <w:tblW w:type="dxa" w:w="9360"/>
+        <w:tblBorders>
+          <w:top w:val="single" w:color="auto" w:sz="4"/>
+          <w:left w:val="single" w:color="auto" w:sz="4"/>
+          <w:bottom w:val="single" w:color="auto" w:sz="4"/>
+          <w:right w:val="single" w:color="auto" w:sz="4"/>
+          <w:insideH w:val="single" w:color="auto" w:sz="4"/>
+          <w:insideV w:val="single" w:color="auto" w:sz="4"/>
+        </w:tblBorders>
+      </w:tblPr>
+      <w:tblGrid>
+        <w:gridCol w:w="1446"/>
+        <w:gridCol w:w="1106"/>
+        <w:gridCol w:w="6808"/>
+      </w:tblGrid>
+      <w:tr>
+        <w:trPr>
+          <w:cantSplit/>
+          <w:tblHeader/>
+        </w:trPr>
+        <w:tc>
+          <w:tcPr>
+            <w:tcW w:type="dxa" w:w="1446"/>
+            <w:tcBorders>
+              <w:top w:val="single" w:color="D0D7DE" w:sz="4"/>
+              <w:left w:val="single" w:color="D0D7DE" w:sz="4"/>
+              <w:bottom w:val="single" w:color="D0D7DE" w:sz="4"/>
+              <w:right w:val="single" w:color="D0D7DE" w:sz="4"/>
+            </w:tcBorders>
+            <w:shd w:fill="F3E3E6" w:color="auto" w:val="clear"/>
+            <w:tcMar>
+              <w:top w:type="dxa" w:w="60"/>
+              <w:left w:type="dxa" w:w="100"/>
+              <w:bottom w:type="dxa" w:w="60"/>
+              <w:right w:type="dxa" w:w="100"/>
+            </w:tcMar>
+          </w:tcPr>
+          <w:p>
+            <w:pPr>
+              <w:jc w:val="left"/>
+            </w:pPr>
+            <w:r>
+              <w:rPr>
+                <w:rFonts w:ascii="Calibri" w:cs="Calibri" w:eastAsia="Calibri" w:hAnsi="Calibri"/>
+                <w:b/>
+                <w:bCs/>
+                <w:color w:val="1F2328"/>
+              </w:rPr>
+              <w:t xml:space="preserve">Place</w:t>
+            </w:r>
+          </w:p>
+        </w:tc>
+        <w:tc>
+          <w:tcPr>
+            <w:tcW w:type="dxa" w:w="1106"/>
+            <w:tcBorders>
+              <w:top w:val="single" w:color="D0D7DE" w:sz="4"/>
+              <w:left w:val="single" w:color="D0D7DE" w:sz="4"/>
+              <w:bottom w:val="single" w:color="D0D7DE" w:sz="4"/>
+              <w:right w:val="single" w:color="D0D7DE" w:sz="4"/>
+            </w:tcBorders>
+            <w:shd w:fill="F3E3E6" w:color="auto" w:val="clear"/>
+            <w:tcMar>
+              <w:top w:type="dxa" w:w="60"/>
+              <w:left w:type="dxa" w:w="100"/>
+              <w:bottom w:type="dxa" w:w="60"/>
+              <w:right w:type="dxa" w:w="100"/>
+            </w:tcMar>
+          </w:tcPr>
+          <w:p>
+            <w:pPr>
+              <w:jc w:val="center"/>
+            </w:pPr>
+            <w:r>
+              <w:rPr>
+                <w:rFonts w:ascii="Calibri" w:cs="Calibri" w:eastAsia="Calibri" w:hAnsi="Calibri"/>
+                <w:b/>
+                <w:bCs/>
+                <w:color w:val="1F2328"/>
+              </w:rPr>
+              <w:t xml:space="preserve">VC</w:t>
+            </w:r>
+          </w:p>
+        </w:tc>
+        <w:tc>
+          <w:tcPr>
+            <w:tcW w:type="dxa" w:w="6808"/>
+            <w:tcBorders>
+              <w:top w:val="single" w:color="D0D7DE" w:sz="4"/>
+              <w:left w:val="single" w:color="D0D7DE" w:sz="4"/>
+              <w:bottom w:val="single" w:color="D0D7DE" w:sz="4"/>
+              <w:right w:val="single" w:color="D0D7DE" w:sz="4"/>
+            </w:tcBorders>
+            <w:shd w:fill="F3E3E6" w:color="auto" w:val="clear"/>
+            <w:tcMar>
+              <w:top w:type="dxa" w:w="60"/>
+              <w:left w:type="dxa" w:w="100"/>
+              <w:bottom w:type="dxa" w:w="60"/>
+              <w:right w:type="dxa" w:w="100"/>
+            </w:tcMar>
+          </w:tcPr>
+          <w:p>
+            <w:pPr>
+              <w:jc w:val="left"/>
+            </w:pPr>
+            <w:r>
+              <w:rPr>
+                <w:rFonts w:ascii="Calibri" w:cs="Calibri" w:eastAsia="Calibri" w:hAnsi="Calibri"/>
+                <w:b/>
+                <w:bCs/>
+                <w:color w:val="1F2328"/>
+              </w:rPr>
+              <w:t xml:space="preserve">Items</w:t>
+            </w:r>
+          </w:p>
+        </w:tc>
+      </w:tr>
+      <w:tr>
+        <w:trPr>
+          <w:cantSplit/>
+          <w:tblHeader w:val="false"/>
+        </w:trPr>
+        <w:tc>
+          <w:tcPr>
+            <w:tcW w:type="dxa" w:w="1446"/>
+            <w:tcBorders>
+              <w:top w:val="single" w:color="D0D7DE" w:sz="4"/>
+              <w:left w:val="single" w:color="D0D7DE" w:sz="4"/>
+              <w:bottom w:val="single" w:color="D0D7DE" w:sz="4"/>
+              <w:right w:val="single" w:color="D0D7DE" w:sz="4"/>
+            </w:tcBorders>
+            <w:tcMar>
+              <w:top w:type="dxa" w:w="60"/>
+              <w:left w:type="dxa" w:w="100"/>
+              <w:bottom w:type="dxa" w:w="60"/>
+              <w:right w:type="dxa" w:w="100"/>
+            </w:tcMar>
+          </w:tcPr>
+          <w:p>
+            <w:pPr>
+              <w:jc w:val="left"/>
+            </w:pPr>
+            <w:r>
+              <w:rPr>
+                <w:rFonts w:ascii="Calibri" w:cs="Calibri" w:eastAsia="Calibri" w:hAnsi="Calibri"/>
+                <w:color w:val="1F2328"/>
+              </w:rPr>
+              <w:t xml:space="preserve">1st</w:t>
+            </w:r>
+          </w:p>
+        </w:tc>
+        <w:tc>
+          <w:tcPr>
+            <w:tcW w:type="dxa" w:w="1106"/>
+            <w:tcBorders>
+              <w:top w:val="single" w:color="D0D7DE" w:sz="4"/>
+              <w:left w:val="single" w:color="D0D7DE" w:sz="4"/>
+              <w:bottom w:val="single" w:color="D0D7DE" w:sz="4"/>
+              <w:right w:val="single" w:color="D0D7DE" w:sz="4"/>
+            </w:tcBorders>
+            <w:tcMar>
+              <w:top w:type="dxa" w:w="60"/>
+              <w:left w:type="dxa" w:w="100"/>
+              <w:bottom w:type="dxa" w:w="60"/>
+              <w:right w:type="dxa" w:w="100"/>
+            </w:tcMar>
+          </w:tcPr>
+          <w:p>
+            <w:pPr>
+              <w:jc w:val="center"/>
+            </w:pPr>
+            <w:r>
+              <w:rPr>
+                <w:rFonts w:ascii="Calibri" w:cs="Calibri" w:eastAsia="Calibri" w:hAnsi="Calibri"/>
+                <w:color w:val="1F2328"/>
+              </w:rPr>
+              <w:t xml:space="preserve">150,000</w:t>
+            </w:r>
+          </w:p>
+        </w:tc>
+        <w:tc>
+          <w:tcPr>
+            <w:tcW w:type="dxa" w:w="6808"/>
+            <w:tcBorders>
+              <w:top w:val="single" w:color="D0D7DE" w:sz="4"/>
+              <w:left w:val="single" w:color="D0D7DE" w:sz="4"/>
+              <w:bottom w:val="single" w:color="D0D7DE" w:sz="4"/>
+              <w:right w:val="single" w:color="D0D7DE" w:sz="4"/>
+            </w:tcBorders>
+            <w:tcMar>
+              <w:top w:type="dxa" w:w="60"/>
+              <w:left w:type="dxa" w:w="100"/>
+              <w:bottom w:type="dxa" w:w="60"/>
+              <w:right w:type="dxa" w:w="100"/>
+            </w:tcMar>
+          </w:tcPr>
+          <w:p>
+            <w:pPr>
+              <w:jc w:val="left"/>
+            </w:pPr>
+            <w:r>
+              <w:rPr>
+                <w:rFonts w:ascii="Calibri" w:cs="Calibri" w:eastAsia="Calibri" w:hAnsi="Calibri"/>
+                <w:color w:val="1F2328"/>
+              </w:rPr>
+              <w:t xml:space="preserve">the Beat Goes On tracksuit (windbreaker and track pants), Boombox Hi / Neon, Running Man, Neon Terry Headband, Disco Ball, Eight-O-Eight</w:t>
+            </w:r>
+          </w:p>
+        </w:tc>
+      </w:tr>
+      <w:tr>
+        <w:trPr>
+          <w:cantSplit/>
+          <w:tblHeader w:val="false"/>
+        </w:trPr>
+        <w:tc>
+          <w:tcPr>
+            <w:tcW w:type="dxa" w:w="1446"/>
+            <w:tcBorders>
+              <w:top w:val="single" w:color="D0D7DE" w:sz="4"/>
+              <w:left w:val="single" w:color="D0D7DE" w:sz="4"/>
+              <w:bottom w:val="single" w:color="D0D7DE" w:sz="4"/>
+              <w:right w:val="single" w:color="D0D7DE" w:sz="4"/>
+            </w:tcBorders>
+            <w:tcMar>
+              <w:top w:type="dxa" w:w="60"/>
+              <w:left w:type="dxa" w:w="100"/>
+              <w:bottom w:type="dxa" w:w="60"/>
+              <w:right w:type="dxa" w:w="100"/>
+            </w:tcMar>
+          </w:tcPr>
+          <w:p>
+            <w:pPr>
+              <w:jc w:val="left"/>
+            </w:pPr>
+            <w:r>
+              <w:rPr>
+                <w:rFonts w:ascii="Calibri" w:cs="Calibri" w:eastAsia="Calibri" w:hAnsi="Calibri"/>
+                <w:color w:val="1F2328"/>
+              </w:rPr>
+              <w:t xml:space="preserve">Top 3</w:t>
+            </w:r>
+          </w:p>
+        </w:tc>
+        <w:tc>
+          <w:tcPr>
+            <w:tcW w:type="dxa" w:w="1106"/>
+            <w:tcBorders>
+              <w:top w:val="single" w:color="D0D7DE" w:sz="4"/>
+              <w:left w:val="single" w:color="D0D7DE" w:sz="4"/>
+              <w:bottom w:val="single" w:color="D0D7DE" w:sz="4"/>
+              <w:right w:val="single" w:color="D0D7DE" w:sz="4"/>
+            </w:tcBorders>
+            <w:tcMar>
+              <w:top w:type="dxa" w:w="60"/>
+              <w:left w:type="dxa" w:w="100"/>
+              <w:bottom w:type="dxa" w:w="60"/>
+              <w:right w:type="dxa" w:w="100"/>
+            </w:tcMar>
+          </w:tcPr>
+          <w:p>
+            <w:pPr>
+              <w:jc w:val="center"/>
+            </w:pPr>
+            <w:r>
+              <w:rPr>
+                <w:rFonts w:ascii="Calibri" w:cs="Calibri" w:eastAsia="Calibri" w:hAnsi="Calibri"/>
+                <w:color w:val="1F2328"/>
+              </w:rPr>
+              <w:t xml:space="preserve">60,000</w:t>
+            </w:r>
+          </w:p>
+        </w:tc>
+        <w:tc>
+          <w:tcPr>
+            <w:tcW w:type="dxa" w:w="6808"/>
+            <w:tcBorders>
+              <w:top w:val="single" w:color="D0D7DE" w:sz="4"/>
+              <w:left w:val="single" w:color="D0D7DE" w:sz="4"/>
+              <w:bottom w:val="single" w:color="D0D7DE" w:sz="4"/>
+              <w:right w:val="single" w:color="D0D7DE" w:sz="4"/>
+            </w:tcBorders>
+            <w:tcMar>
+              <w:top w:type="dxa" w:w="60"/>
+              <w:left w:type="dxa" w:w="100"/>
+              <w:bottom w:type="dxa" w:w="60"/>
+              <w:right w:type="dxa" w:w="100"/>
+            </w:tcMar>
+          </w:tcPr>
+          <w:p>
+            <w:pPr>
+              <w:jc w:val="left"/>
+            </w:pPr>
+            <w:r>
+              <w:rPr>
+                <w:rFonts w:ascii="Calibri" w:cs="Calibri" w:eastAsia="Calibri" w:hAnsi="Calibri"/>
+                <w:color w:val="1F2328"/>
+              </w:rPr>
+              <w:t xml:space="preserve">Boombox Hi / Neon, Running Man, Neon Terry Headband, Disco Ball, Eight-O-Eight</w:t>
+            </w:r>
+          </w:p>
+        </w:tc>
+      </w:tr>
+      <w:tr>
+        <w:trPr>
+          <w:cantSplit/>
+          <w:tblHeader w:val="false"/>
+        </w:trPr>
+        <w:tc>
+          <w:tcPr>
+            <w:tcW w:type="dxa" w:w="1446"/>
+            <w:tcBorders>
+              <w:top w:val="single" w:color="D0D7DE" w:sz="4"/>
+              <w:left w:val="single" w:color="D0D7DE" w:sz="4"/>
+              <w:bottom w:val="single" w:color="D0D7DE" w:sz="4"/>
+              <w:right w:val="single" w:color="D0D7DE" w:sz="4"/>
+            </w:tcBorders>
+            <w:tcMar>
+              <w:top w:type="dxa" w:w="60"/>
+              <w:left w:type="dxa" w:w="100"/>
+              <w:bottom w:type="dxa" w:w="60"/>
+              <w:right w:type="dxa" w:w="100"/>
+            </w:tcMar>
+          </w:tcPr>
+          <w:p>
+            <w:pPr>
+              <w:jc w:val="left"/>
+            </w:pPr>
+            <w:r>
+              <w:rPr>
+                <w:rFonts w:ascii="Calibri" w:cs="Calibri" w:eastAsia="Calibri" w:hAnsi="Calibri"/>
+                <w:color w:val="1F2328"/>
+              </w:rPr>
+              <w:t xml:space="preserve">Top 10</w:t>
+            </w:r>
+          </w:p>
+        </w:tc>
+        <w:tc>
+          <w:tcPr>
+            <w:tcW w:type="dxa" w:w="1106"/>
+            <w:tcBorders>
+              <w:top w:val="single" w:color="D0D7DE" w:sz="4"/>
+              <w:left w:val="single" w:color="D0D7DE" w:sz="4"/>
+              <w:bottom w:val="single" w:color="D0D7DE" w:sz="4"/>
+              <w:right w:val="single" w:color="D0D7DE" w:sz="4"/>
+            </w:tcBorders>
+            <w:tcMar>
+              <w:top w:type="dxa" w:w="60"/>
+              <w:left w:type="dxa" w:w="100"/>
+              <w:bottom w:type="dxa" w:w="60"/>
+              <w:right w:type="dxa" w:w="100"/>
+            </w:tcMar>
+          </w:tcPr>
+          <w:p>
+            <w:pPr>
+              <w:jc w:val="center"/>
+            </w:pPr>
+            <w:r>
+              <w:rPr>
+                <w:rFonts w:ascii="Calibri" w:cs="Calibri" w:eastAsia="Calibri" w:hAnsi="Calibri"/>
+                <w:color w:val="1F2328"/>
+              </w:rPr>
+              <w:t xml:space="preserve">25,000</w:t>
+            </w:r>
+          </w:p>
+        </w:tc>
+        <w:tc>
+          <w:tcPr>
+            <w:tcW w:type="dxa" w:w="6808"/>
+            <w:tcBorders>
+              <w:top w:val="single" w:color="D0D7DE" w:sz="4"/>
+              <w:left w:val="single" w:color="D0D7DE" w:sz="4"/>
+              <w:bottom w:val="single" w:color="D0D7DE" w:sz="4"/>
+              <w:right w:val="single" w:color="D0D7DE" w:sz="4"/>
+            </w:tcBorders>
+            <w:tcMar>
+              <w:top w:type="dxa" w:w="60"/>
+              <w:left w:type="dxa" w:w="100"/>
+              <w:bottom w:type="dxa" w:w="60"/>
+              <w:right w:type="dxa" w:w="100"/>
+            </w:tcMar>
+          </w:tcPr>
+          <w:p>
+            <w:pPr>
+              <w:jc w:val="left"/>
+            </w:pPr>
+            <w:r>
+              <w:rPr>
+                <w:rFonts w:ascii="Calibri" w:cs="Calibri" w:eastAsia="Calibri" w:hAnsi="Calibri"/>
+                <w:color w:val="1F2328"/>
+              </w:rPr>
+              <w:t xml:space="preserve">Running Man, Neon Terry Headband, Eight-O-Eight</w:t>
+            </w:r>
+          </w:p>
+        </w:tc>
+      </w:tr>
+      <w:tr>
+        <w:trPr>
+          <w:cantSplit/>
+          <w:tblHeader w:val="false"/>
+        </w:trPr>
+        <w:tc>
+          <w:tcPr>
+            <w:tcW w:type="dxa" w:w="1446"/>
+            <w:tcBorders>
+              <w:top w:val="single" w:color="D0D7DE" w:sz="4"/>
+              <w:left w:val="single" w:color="D0D7DE" w:sz="4"/>
+              <w:bottom w:val="single" w:color="D0D7DE" w:sz="4"/>
+              <w:right w:val="single" w:color="D0D7DE" w:sz="4"/>
+            </w:tcBorders>
+            <w:tcMar>
+              <w:top w:type="dxa" w:w="60"/>
+              <w:left w:type="dxa" w:w="100"/>
+              <w:bottom w:type="dxa" w:w="60"/>
+              <w:right w:type="dxa" w:w="100"/>
+            </w:tcMar>
+          </w:tcPr>
+          <w:p>
+            <w:pPr>
+              <w:jc w:val="left"/>
+            </w:pPr>
+            <w:r>
+              <w:rPr>
+                <w:rFonts w:ascii="Calibri" w:cs="Calibri" w:eastAsia="Calibri" w:hAnsi="Calibri"/>
+                <w:color w:val="1F2328"/>
+              </w:rPr>
+              <w:t xml:space="preserve">Top 25</w:t>
+            </w:r>
+          </w:p>
+        </w:tc>
+        <w:tc>
+          <w:tcPr>
+            <w:tcW w:type="dxa" w:w="1106"/>
+            <w:tcBorders>
+              <w:top w:val="single" w:color="D0D7DE" w:sz="4"/>
+              <w:left w:val="single" w:color="D0D7DE" w:sz="4"/>
+              <w:bottom w:val="single" w:color="D0D7DE" w:sz="4"/>
+              <w:right w:val="single" w:color="D0D7DE" w:sz="4"/>
+            </w:tcBorders>
+            <w:tcMar>
+              <w:top w:type="dxa" w:w="60"/>
+              <w:left w:type="dxa" w:w="100"/>
+              <w:bottom w:type="dxa" w:w="60"/>
+              <w:right w:type="dxa" w:w="100"/>
+            </w:tcMar>
+          </w:tcPr>
+          <w:p>
+            <w:pPr>
+              <w:jc w:val="center"/>
+            </w:pPr>
+            <w:r>
+              <w:rPr>
+                <w:rFonts w:ascii="Calibri" w:cs="Calibri" w:eastAsia="Calibri" w:hAnsi="Calibri"/>
+                <w:color w:val="1F2328"/>
+              </w:rPr>
+              <w:t xml:space="preserve">10,000</w:t>
+            </w:r>
+          </w:p>
+        </w:tc>
+        <w:tc>
+          <w:tcPr>
+            <w:tcW w:type="dxa" w:w="6808"/>
+            <w:tcBorders>
+              <w:top w:val="single" w:color="D0D7DE" w:sz="4"/>
+              <w:left w:val="single" w:color="D0D7DE" w:sz="4"/>
+              <w:bottom w:val="single" w:color="D0D7DE" w:sz="4"/>
+              <w:right w:val="single" w:color="D0D7DE" w:sz="4"/>
+            </w:tcBorders>
+            <w:tcMar>
+              <w:top w:type="dxa" w:w="60"/>
+              <w:left w:type="dxa" w:w="100"/>
+              <w:bottom w:type="dxa" w:w="60"/>
+              <w:right w:type="dxa" w:w="100"/>
+            </w:tcMar>
+          </w:tcPr>
+          <w:p>
+            <w:pPr>
+              <w:jc w:val="left"/>
+            </w:pPr>
+            <w:r>
+              <w:rPr>
+                <w:rFonts w:ascii="Calibri" w:cs="Calibri" w:eastAsia="Calibri" w:hAnsi="Calibri"/>
+                <w:color w:val="1F2328"/>
+              </w:rPr>
+              <w:t xml:space="preserve">Neon Terry Headband</w:t>
+            </w:r>
+          </w:p>
+        </w:tc>
+      </w:tr>
+      <w:tr>
+        <w:trPr>
+          <w:cantSplit/>
+          <w:tblHeader w:val="false"/>
+        </w:trPr>
+        <w:tc>
+          <w:tcPr>
+            <w:tcW w:type="dxa" w:w="1446"/>
+            <w:tcBorders>
+              <w:top w:val="single" w:color="D0D7DE" w:sz="4"/>
+              <w:left w:val="single" w:color="D0D7DE" w:sz="4"/>
+              <w:bottom w:val="single" w:color="D0D7DE" w:sz="4"/>
+              <w:right w:val="single" w:color="D0D7DE" w:sz="4"/>
+            </w:tcBorders>
+            <w:tcMar>
+              <w:top w:type="dxa" w:w="60"/>
+              <w:left w:type="dxa" w:w="100"/>
+              <w:bottom w:type="dxa" w:w="60"/>
+              <w:right w:type="dxa" w:w="100"/>
+            </w:tcMar>
+          </w:tcPr>
+          <w:p>
+            <w:pPr>
+              <w:jc w:val="left"/>
+            </w:pPr>
+            <w:r>
+              <w:rPr>
+                <w:rFonts w:ascii="Calibri" w:cs="Calibri" w:eastAsia="Calibri" w:hAnsi="Calibri"/>
+                <w:color w:val="1F2328"/>
+              </w:rPr>
+              <w:t xml:space="preserve">Top half / played</w:t>
+            </w:r>
+          </w:p>
+        </w:tc>
+        <w:tc>
+          <w:tcPr>
+            <w:tcW w:type="dxa" w:w="1106"/>
+            <w:tcBorders>
+              <w:top w:val="single" w:color="D0D7DE" w:sz="4"/>
+              <w:left w:val="single" w:color="D0D7DE" w:sz="4"/>
+              <w:bottom w:val="single" w:color="D0D7DE" w:sz="4"/>
+              <w:right w:val="single" w:color="D0D7DE" w:sz="4"/>
+            </w:tcBorders>
+            <w:tcMar>
+              <w:top w:type="dxa" w:w="60"/>
+              <w:left w:type="dxa" w:w="100"/>
+              <w:bottom w:type="dxa" w:w="60"/>
+              <w:right w:type="dxa" w:w="100"/>
+            </w:tcMar>
+          </w:tcPr>
+          <w:p>
+            <w:pPr>
+              <w:jc w:val="center"/>
+            </w:pPr>
+            <w:r>
+              <w:rPr>
+                <w:rFonts w:ascii="Calibri" w:cs="Calibri" w:eastAsia="Calibri" w:hAnsi="Calibri"/>
+                <w:color w:val="1F2328"/>
+              </w:rPr>
+              <w:t xml:space="preserve">3,000 / 1,000</w:t>
+            </w:r>
+          </w:p>
+        </w:tc>
+        <w:tc>
+          <w:tcPr>
+            <w:tcW w:type="dxa" w:w="6808"/>
+            <w:tcBorders>
+              <w:top w:val="single" w:color="D0D7DE" w:sz="4"/>
+              <w:left w:val="single" w:color="D0D7DE" w:sz="4"/>
+              <w:bottom w:val="single" w:color="D0D7DE" w:sz="4"/>
+              <w:right w:val="single" w:color="D0D7DE" w:sz="4"/>
+            </w:tcBorders>
+            <w:tcMar>
+              <w:top w:type="dxa" w:w="60"/>
+              <w:left w:type="dxa" w:w="100"/>
+              <w:bottom w:type="dxa" w:w="60"/>
+              <w:right w:type="dxa" w:w="100"/>
+            </w:tcMar>
+          </w:tcPr>
+          <w:p>
+            <w:pPr>
+              <w:jc w:val="left"/>
+            </w:pPr>
+          </w:p>
+        </w:tc>
+      </w:tr>
+    </w:tbl>
+    <w:p>
+      <w:pPr>
+        <w:spacing w:after="80"/>
+      </w:pPr>
+    </w:p>
+    <w:p>
+      <w:pPr>
+        <w:pStyle w:val="ListParagraph"/>
+        <w:numPr>
+          <w:ilvl w:val="0"/>
+          <w:numId w:val="2"/>
+        </w:numPr>
+        <w:spacing w:after="80" w:line="276"/>
+      </w:pPr>
+      <w:r>
+        <w:rPr>
+          <w:rFonts w:ascii="Calibri" w:cs="Calibri" w:eastAsia="Calibri" w:hAnsi="Calibri"/>
+          <w:b/>
+          <w:bCs/>
+          <w:color w:val="1F2328"/>
+        </w:rPr>
+        <w:t xml:space="preserve">The Beat Goes On tracksuit</w:t>
+      </w:r>
+      <w:r>
+        <w:rPr>
+          <w:rFonts w:ascii="Calibri" w:cs="Calibri" w:eastAsia="Calibri" w:hAnsi="Calibri"/>
+          <w:color w:val="1F2328"/>
+        </w:rPr>
+        <w:t xml:space="preserve"> (grand prize, unique to this event): a shiny nylon shell-suit windbreaker in purple, cyan, hot pink and yellow. It has a cyan zig-zag yoke, a hot-pink slash across the front, neon triangles, a rib-knit stand-up collar and cuffs, and a zip. The sleeves balloon into gathered cuffs. The matching track pants have colour-blocked side panels, a yellow pinstripe and elastic ankle cuffs. Both are a new garment shape with their own shiny nylon finish.</w:t>
+      </w:r>
+    </w:p>
+    <w:p>
+      <w:pPr>
+        <w:pStyle w:val="ListParagraph"/>
+        <w:numPr>
+          <w:ilvl w:val="0"/>
+          <w:numId w:val="2"/>
+        </w:numPr>
+        <w:spacing w:after="80" w:line="276"/>
+      </w:pPr>
+      <w:r>
+        <w:rPr>
+          <w:rFonts w:ascii="Calibri" w:cs="Calibri" w:eastAsia="Calibri" w:hAnsi="Calibri"/>
+          <w:b/>
+          <w:bCs/>
+          <w:color w:val="1F2328"/>
+        </w:rPr>
+        <w:t xml:space="preserve">Boombox Hi / Neon</w:t>
+      </w:r>
+      <w:r>
+        <w:rPr>
+          <w:rFonts w:ascii="Calibri" w:cs="Calibri" w:eastAsia="Calibri" w:hAnsi="Calibri"/>
+          <w:color w:val="1F2328"/>
+        </w:rPr>
+        <w:t xml:space="preserve"> (top 3): an 80s white leather high-top with a hot-pink velcro ankle strap, a pink zig-zag bolt down the side, a cyan collar and heel, and a perforated toe.</w:t>
+      </w:r>
+    </w:p>
+    <w:p>
+      <w:pPr>
+        <w:pStyle w:val="ListParagraph"/>
+        <w:numPr>
+          <w:ilvl w:val="0"/>
+          <w:numId w:val="2"/>
+        </w:numPr>
+        <w:spacing w:after="80" w:line="276"/>
+      </w:pPr>
+      <w:r>
+        <w:rPr>
+          <w:rFonts w:ascii="Calibri" w:cs="Calibri" w:eastAsia="Calibri" w:hAnsi="Calibri"/>
+          <w:b/>
+          <w:bCs/>
+          <w:color w:val="1F2328"/>
+        </w:rPr>
+        <w:t xml:space="preserve">Neon Terry Headband</w:t>
+      </w:r>
+      <w:r>
+        <w:rPr>
+          <w:rFonts w:ascii="Calibri" w:cs="Calibri" w:eastAsia="Calibri" w:hAnsi="Calibri"/>
+          <w:color w:val="1F2328"/>
+        </w:rPr>
+        <w:t xml:space="preserve"> (top 25): a plush terry-cloth sweatband in hot pink, yellow and cyan stripes.</w:t>
+      </w:r>
+    </w:p>
+    <w:p>
+      <w:pPr>
+        <w:pStyle w:val="ListParagraph"/>
+        <w:numPr>
+          <w:ilvl w:val="0"/>
+          <w:numId w:val="2"/>
+        </w:numPr>
+        <w:spacing w:after="80" w:line="276"/>
+      </w:pPr>
+      <w:r>
+        <w:rPr>
+          <w:rFonts w:ascii="Calibri" w:cs="Calibri" w:eastAsia="Calibri" w:hAnsi="Calibri"/>
+          <w:b/>
+          <w:bCs/>
+          <w:color w:val="1F2328"/>
+        </w:rPr>
+        <w:t xml:space="preserve">Celebration: Running Man</w:t>
+      </w:r>
+      <w:r>
+        <w:rPr>
+          <w:rFonts w:ascii="Calibri" w:cs="Calibri" w:eastAsia="Calibri" w:hAnsi="Calibri"/>
+          <w:color w:val="1F2328"/>
+        </w:rPr>
+        <w:t xml:space="preserve"> (top 10): the classic dance. You hop back on one foot as the other knee comes up, side to side, with your arms pumping and your shoulders bouncing.</w:t>
+      </w:r>
+    </w:p>
+    <w:p>
+      <w:pPr>
+        <w:pStyle w:val="ListParagraph"/>
+        <w:numPr>
+          <w:ilvl w:val="0"/>
+          <w:numId w:val="2"/>
+        </w:numPr>
+        <w:spacing w:after="80" w:line="276"/>
+      </w:pPr>
+      <w:r>
+        <w:rPr>
+          <w:rFonts w:ascii="Calibri" w:cs="Calibri" w:eastAsia="Calibri" w:hAnsi="Calibri"/>
+          <w:b/>
+          <w:bCs/>
+          <w:color w:val="1F2328"/>
+        </w:rPr>
+        <w:t xml:space="preserve">Disco Ball</w:t>
+      </w:r>
+      <w:r>
+        <w:rPr>
+          <w:rFonts w:ascii="Calibri" w:cs="Calibri" w:eastAsia="Calibri" w:hAnsi="Calibri"/>
+          <w:color w:val="1F2328"/>
+        </w:rPr>
+        <w:t xml:space="preserve"> (green FX, top 3): a mirror ball drops on a line over your head on the release. It spins, throwing pink, cyan, purple and yellow light around you and across the floor. It bursts into a shower of coloured light the moment the shot drops.</w:t>
+      </w:r>
+    </w:p>
+    <w:p>
+      <w:pPr>
+        <w:pStyle w:val="ListParagraph"/>
+        <w:numPr>
+          <w:ilvl w:val="0"/>
+          <w:numId w:val="2"/>
+        </w:numPr>
+        <w:spacing w:after="80" w:line="276"/>
+      </w:pPr>
+      <w:r>
+        <w:rPr>
+          <w:rFonts w:ascii="Calibri" w:cs="Calibri" w:eastAsia="Calibri" w:hAnsi="Calibri"/>
+          <w:b/>
+          <w:bCs/>
+          <w:color w:val="1F2328"/>
+        </w:rPr>
+        <w:t xml:space="preserve">Eight-O-Eight</w:t>
+      </w:r>
+      <w:r>
+        <w:rPr>
+          <w:rFonts w:ascii="Calibri" w:cs="Calibri" w:eastAsia="Calibri" w:hAnsi="Calibri"/>
+          <w:color w:val="1F2328"/>
+        </w:rPr>
+        <w:t xml:space="preserve"> (green sound, top 10): a drum machine from 1984. You hear a synth-brass stab over an 808 kick and cowbell, then a big gated-reverb snare, then a synth arpeggio climbing out of it.</w:t>
+      </w:r>
+    </w:p>
+    <w:p>
+      <w:pPr>
+        <w:pStyle w:val="ListParagraph"/>
+        <w:numPr>
+          <w:ilvl w:val="0"/>
+          <w:numId w:val="2"/>
+        </w:numPr>
+        <w:spacing w:after="80" w:line="276"/>
+      </w:pPr>
+      <w:r>
+        <w:rPr>
+          <w:rFonts w:ascii="Calibri" w:cs="Calibri" w:eastAsia="Calibri" w:hAnsi="Calibri"/>
+          <w:color w:val="1F2328"/>
+        </w:rPr>
+        <w:t xml:space="preserve">The store lists them with ★ BEAT GOES ON, like the other event items.</w:t>
+      </w:r>
+    </w:p>
+    <w:p>
+      <w:pPr>
+        <w:pBdr>
+          <w:bottom w:val="single" w:color="D0D7DE" w:sz="4" w:space="1"/>
+        </w:pBdr>
+        <w:spacing w:after="160" w:before="80"/>
+      </w:pPr>
+    </w:p>
+    <w:p>
+      <w:pPr>
         <w:spacing w:after="140" w:line="288"/>
       </w:pPr>
       <w:r>
@@ -3567,7 +5170,7 @@
           <w:sz w:val="19"/>
           <w:szCs w:val="19"/>
         </w:rPr>
-        <w:t xml:space="preserve">(Tests: 106 Python and 272 node tests, plus browser checks of every park, the Pro-Am rank card and results, the Park screen's locks, the Inventory's locks, the Sharp Eye hop and pop-up, an off-ball screen in a Pro-Am game and the results countdown.)</w:t>
+        <w:t xml:space="preserve">(Tests: 110 Python and 294 node tests, plus browser checks of every park, the Pro-Am rank card and results, the Park screen's locks, the Inventory's locks, the Sharp Eye hop and pop-up, an off-ball screen in a Pro-Am game and the results countdown. For the quick patch: the event park in every direction, its events and streak effect; the rewards on a player and in a game, with the green sound measured against the other green sounds; and the schedule handover, the event soundtrack and the store labels.)</w:t>
       </w:r>
     </w:p>
     <w:sectPr>

</xml_diff>

<commit_message>
Monster Mash Park Patch
</commit_message>
<xml_diff>
--- a/PATCH_NOTES_v0.4.8.5.docx
+++ b/PATCH_NOTES_v0.4.8.5.docx
@@ -5159,6 +5159,1517 @@
     </w:p>
     <w:p>
       <w:pPr>
+        <w:pStyle w:val="Heading1"/>
+        <w:spacing w:after="120" w:before="280"/>
+      </w:pPr>
+      <w:r>
+        <w:rPr>
+          <w:rFonts w:ascii="Calibri" w:cs="Calibri" w:eastAsia="Calibri" w:hAnsi="Calibri"/>
+          <w:b/>
+          <w:bCs/>
+          <w:color w:val="C8102E"/>
+          <w:sz w:val="32"/>
+          <w:szCs w:val="32"/>
+        </w:rPr>
+        <w:t xml:space="preserve">Quick patch 2 (Oct 13): The Monster Mash</w:t>
+      </w:r>
+    </w:p>
+    <w:p>
+      <w:pPr>
+        <w:spacing w:after="140" w:line="288"/>
+      </w:pPr>
+      <w:r>
+        <w:rPr>
+          <w:rFonts w:ascii="Calibri" w:cs="Calibri" w:eastAsia="Calibri" w:hAnsi="Calibri"/>
+          <w:color w:val="1F2328"/>
+        </w:rPr>
+        <w:t xml:space="preserve">The park event after the Beat, </w:t>
+      </w:r>
+      <w:r>
+        <w:rPr>
+          <w:rFonts w:ascii="Calibri" w:cs="Calibri" w:eastAsia="Calibri" w:hAnsi="Calibri"/>
+          <w:b/>
+          <w:bCs/>
+          <w:color w:val="1F2328"/>
+        </w:rPr>
+        <w:t xml:space="preserve">The Monster Mash</w:t>
+      </w:r>
+      <w:r>
+        <w:rPr>
+          <w:rFonts w:ascii="Calibri" w:cs="Calibri" w:eastAsia="Calibri" w:hAnsi="Calibri"/>
+          <w:color w:val="1F2328"/>
+        </w:rPr>
+        <w:t xml:space="preserve">, takes over from And The Beat Goes On the moment the Beat's leaderboard closes: </w:t>
+      </w:r>
+      <w:r>
+        <w:rPr>
+          <w:rFonts w:ascii="Calibri" w:cs="Calibri" w:eastAsia="Calibri" w:hAnsi="Calibri"/>
+          <w:b/>
+          <w:bCs/>
+          <w:color w:val="1F2328"/>
+        </w:rPr>
+        <w:t xml:space="preserve">October 16 at 00:00 UTC</w:t>
+      </w:r>
+      <w:r>
+        <w:rPr>
+          <w:rFonts w:ascii="Calibri" w:cs="Calibri" w:eastAsia="Calibri" w:hAnsi="Calibri"/>
+          <w:color w:val="1F2328"/>
+        </w:rPr>
+        <w:t xml:space="preserve"> (8 pm Eastern, 5 pm Pacific on October 15). Until then the Beat runs its full 48 hours and pays its prizes as normal. After that its park closes, just as the Jungle's and the King Tut Cup's did. Nothing of it is deleted (the park, its rewards and its soundtrack are all kept), so it can come back for a future event.</w:t>
+      </w:r>
+    </w:p>
+    <w:p>
+      <w:pPr>
+        <w:pStyle w:val="Heading2"/>
+        <w:spacing w:after="80" w:before="200"/>
+      </w:pPr>
+      <w:r>
+        <w:rPr>
+          <w:rFonts w:ascii="Calibri" w:cs="Calibri" w:eastAsia="Calibri" w:hAnsi="Calibri"/>
+          <w:b/>
+          <w:bCs/>
+          <w:color w:val="1F2328"/>
+          <w:sz w:val="26"/>
+          <w:szCs w:val="26"/>
+        </w:rPr>
+        <w:t xml:space="preserve">The park: a haunted town on Halloween night</w:t>
+      </w:r>
+    </w:p>
+    <w:p>
+      <w:pPr>
+        <w:pStyle w:val="ListParagraph"/>
+        <w:numPr>
+          <w:ilvl w:val="0"/>
+          <w:numId w:val="2"/>
+        </w:numPr>
+        <w:spacing w:after="80" w:line="276"/>
+      </w:pPr>
+      <w:r>
+        <w:rPr>
+          <w:rFonts w:ascii="Calibri" w:cs="Calibri" w:eastAsia="Calibri" w:hAnsi="Calibri"/>
+          <w:b/>
+          <w:bCs/>
+          <w:color w:val="1F2328"/>
+        </w:rPr>
+        <w:t xml:space="preserve">Night under a full moon.</w:t>
+      </w:r>
+      <w:r>
+        <w:rPr>
+          <w:rFonts w:ascii="Calibri" w:cs="Calibri" w:eastAsia="Calibri" w:hAnsi="Calibri"/>
+          <w:color w:val="1F2328"/>
+        </w:rPr>
+        <w:t xml:space="preserve"> A huge moon with a halo hangs low in the north, right behind a haunted mansion on a hill. The sky is full of stars, thin clouds drift across it, and every so often lightning lights up the whole town. Ground fog lies over the town and the swamp, and only thinly over the courts. Each court has its own high spotlight, so the players and the ball stay easy to read.</w:t>
+      </w:r>
+    </w:p>
+    <w:p>
+      <w:pPr>
+        <w:pStyle w:val="ListParagraph"/>
+        <w:numPr>
+          <w:ilvl w:val="0"/>
+          <w:numId w:val="2"/>
+        </w:numPr>
+        <w:spacing w:after="80" w:line="276"/>
+      </w:pPr>
+      <w:r>
+        <w:rPr>
+          <w:rFonts w:ascii="Calibri" w:cs="Calibri" w:eastAsia="Calibri" w:hAnsi="Calibri"/>
+          <w:b/>
+          <w:bCs/>
+          <w:color w:val="1F2328"/>
+        </w:rPr>
+        <w:t xml:space="preserve">Graveyard courts:</w:t>
+      </w:r>
+      <w:r>
+        <w:rPr>
+          <w:rFonts w:ascii="Calibri" w:cs="Calibri" w:eastAsia="Calibri" w:hAnsi="Calibri"/>
+          <w:color w:val="1F2328"/>
+        </w:rPr>
+        <w:t xml:space="preserve"> dark mossy-green floors, purple aprons covered with tombstones, cobwebs, bats and pumpkins, orange keys and bone-white lines. At center court there's a jack-o'-lantern under the moon, and "THE MONSTER MASH" runs along the baselines in dripping slime letters. The rims are orange, and the nets are pale as old bones.</w:t>
+      </w:r>
+    </w:p>
+    <w:p>
+      <w:pPr>
+        <w:pStyle w:val="ListParagraph"/>
+        <w:numPr>
+          <w:ilvl w:val="0"/>
+          <w:numId w:val="2"/>
+        </w:numPr>
+        <w:spacing w:after="80" w:line="276"/>
+      </w:pPr>
+      <w:r>
+        <w:rPr>
+          <w:rFonts w:ascii="Calibri" w:cs="Calibri" w:eastAsia="Calibri" w:hAnsi="Calibri"/>
+          <w:b/>
+          <w:bCs/>
+          <w:color w:val="1F2328"/>
+        </w:rPr>
+        <w:t xml:space="preserve">The town:</w:t>
+      </w:r>
+    </w:p>
+    <w:p>
+      <w:pPr>
+        <w:pStyle w:val="ListParagraph"/>
+        <w:numPr>
+          <w:ilvl w:val="1"/>
+          <w:numId w:val="2"/>
+        </w:numPr>
+        <w:spacing w:after="80" w:line="276"/>
+      </w:pPr>
+      <w:r>
+        <w:rPr>
+          <w:rFonts w:ascii="Calibri" w:cs="Calibri" w:eastAsia="Calibri" w:hAnsi="Calibri"/>
+          <w:b/>
+          <w:bCs/>
+          <w:color w:val="1F2328"/>
+        </w:rPr>
+        <w:t xml:space="preserve">Hollow Hill Cemetery:</w:t>
+      </w:r>
+      <w:r>
+        <w:rPr>
+          <w:rFonts w:ascii="Calibri" w:cs="Calibri" w:eastAsia="Calibri" w:hAnsi="Calibri"/>
+          <w:color w:val="1F2328"/>
+        </w:rPr>
+        <w:t xml:space="preserve"> an iron fence and an arched gate, rows of headstones, open graves, candles, and a mausoleum with a green light glowing in its door.</w:t>
+      </w:r>
+    </w:p>
+    <w:p>
+      <w:pPr>
+        <w:pStyle w:val="ListParagraph"/>
+        <w:numPr>
+          <w:ilvl w:val="1"/>
+          <w:numId w:val="2"/>
+        </w:numPr>
+        <w:spacing w:after="80" w:line="276"/>
+      </w:pPr>
+      <w:r>
+        <w:rPr>
+          <w:rFonts w:ascii="Calibri" w:cs="Calibri" w:eastAsia="Calibri" w:hAnsi="Calibri"/>
+          <w:b/>
+          <w:bCs/>
+          <w:color w:val="1F2328"/>
+        </w:rPr>
+        <w:t xml:space="preserve">On the hills:</w:t>
+      </w:r>
+      <w:r>
+        <w:rPr>
+          <w:rFonts w:ascii="Calibri" w:cs="Calibri" w:eastAsia="Calibri" w:hAnsi="Calibri"/>
+          <w:color w:val="1F2328"/>
+        </w:rPr>
+        <w:t xml:space="preserve"> the haunted mansion against the moon, its windows lit, with shadows passing behind them. There's also an old church with a bell tower (bats live in the belfry) and a broken stone tower.</w:t>
+      </w:r>
+    </w:p>
+    <w:p>
+      <w:pPr>
+        <w:pStyle w:val="ListParagraph"/>
+        <w:numPr>
+          <w:ilvl w:val="1"/>
+          <w:numId w:val="2"/>
+        </w:numPr>
+        <w:spacing w:after="80" w:line="276"/>
+      </w:pPr>
+      <w:r>
+        <w:rPr>
+          <w:rFonts w:ascii="Calibri" w:cs="Calibri" w:eastAsia="Calibri" w:hAnsi="Calibri"/>
+          <w:b/>
+          <w:bCs/>
+          <w:color w:val="1F2328"/>
+        </w:rPr>
+        <w:t xml:space="preserve">The carnival:</w:t>
+      </w:r>
+      <w:r>
+        <w:rPr>
+          <w:rFonts w:ascii="Calibri" w:cs="Calibri" w:eastAsia="Calibri" w:hAnsi="Calibri"/>
+          <w:color w:val="1F2328"/>
+        </w:rPr>
+        <w:t xml:space="preserve"> a turning Ferris wheel, a carousel, and a HAUNTED HOUSE ride with glowing eyes over the doors.</w:t>
+      </w:r>
+    </w:p>
+    <w:p>
+      <w:pPr>
+        <w:pStyle w:val="ListParagraph"/>
+        <w:numPr>
+          <w:ilvl w:val="1"/>
+          <w:numId w:val="2"/>
+        </w:numPr>
+        <w:spacing w:after="80" w:line="276"/>
+      </w:pPr>
+      <w:r>
+        <w:rPr>
+          <w:rFonts w:ascii="Calibri" w:cs="Calibri" w:eastAsia="Calibri" w:hAnsi="Calibri"/>
+          <w:b/>
+          <w:bCs/>
+          <w:color w:val="1F2328"/>
+        </w:rPr>
+        <w:t xml:space="preserve">Around the edges:</w:t>
+      </w:r>
+      <w:r>
+        <w:rPr>
+          <w:rFonts w:ascii="Calibri" w:cs="Calibri" w:eastAsia="Calibri" w:hAnsi="Calibri"/>
+          <w:color w:val="1F2328"/>
+        </w:rPr>
+        <w:t xml:space="preserve"> a pumpkin patch with scarecrows and the edge of a corn maze. A street of houses decorated for Halloween, with string lights, a funeral home and a hearse parked out front. A foggy swamp with cypress trees, will-o'-wisps, a dock and a rowboat, and a witch's cottage with a bubbling cauldron.</w:t>
+      </w:r>
+    </w:p>
+    <w:p>
+      <w:pPr>
+        <w:pStyle w:val="ListParagraph"/>
+        <w:numPr>
+          <w:ilvl w:val="1"/>
+          <w:numId w:val="2"/>
+        </w:numPr>
+        <w:spacing w:after="80" w:line="276"/>
+      </w:pPr>
+      <w:r>
+        <w:rPr>
+          <w:rFonts w:ascii="Calibri" w:cs="Calibri" w:eastAsia="Calibri" w:hAnsi="Calibri"/>
+          <w:color w:val="1F2328"/>
+        </w:rPr>
+        <w:t xml:space="preserve">Dead trees everywhere, green fire braziers, and piles of jack-o'-lanterns round the park, all kept clear of the courts and the cameras. The park's mural is a new monster mural.</w:t>
+      </w:r>
+    </w:p>
+    <w:p>
+      <w:pPr>
+        <w:pStyle w:val="ListParagraph"/>
+        <w:numPr>
+          <w:ilvl w:val="0"/>
+          <w:numId w:val="2"/>
+        </w:numPr>
+        <w:spacing w:after="80" w:line="276"/>
+      </w:pPr>
+      <w:r>
+        <w:rPr>
+          <w:rFonts w:ascii="Calibri" w:cs="Calibri" w:eastAsia="Calibri" w:hAnsi="Calibri"/>
+          <w:b/>
+          <w:bCs/>
+          <w:color w:val="1F2328"/>
+        </w:rPr>
+        <w:t xml:space="preserve">Who's out tonight:</w:t>
+      </w:r>
+      <w:r>
+        <w:rPr>
+          <w:rFonts w:ascii="Calibri" w:cs="Calibri" w:eastAsia="Calibri" w:hAnsi="Calibri"/>
+          <w:color w:val="1F2328"/>
+        </w:rPr>
+        <w:t xml:space="preserve"> zombies shambling about, a vampire, a werewolf who howls at the moon, mummies, dancing skeletons, ghosts, black cats, bats circling the floodlights, and two groups of trick-or-treaters going door to door. The Lantern Man (a pumpkin head in a top hat) walks the town, and a slasher in a yellow raincoat and a sack mask stalks the block. Everything is spooky fun: no gore.</w:t>
+      </w:r>
+    </w:p>
+    <w:p>
+      <w:pPr>
+        <w:pStyle w:val="ListParagraph"/>
+        <w:numPr>
+          <w:ilvl w:val="0"/>
+          <w:numId w:val="2"/>
+        </w:numPr>
+        <w:spacing w:after="80" w:line="276"/>
+      </w:pPr>
+      <w:r>
+        <w:rPr>
+          <w:rFonts w:ascii="Calibri" w:cs="Calibri" w:eastAsia="Calibri" w:hAnsi="Calibri"/>
+          <w:b/>
+          <w:bCs/>
+          <w:color w:val="1F2328"/>
+        </w:rPr>
+        <w:t xml:space="preserve">Random events</w:t>
+      </w:r>
+      <w:r>
+        <w:rPr>
+          <w:rFonts w:ascii="Calibri" w:cs="Calibri" w:eastAsia="Calibri" w:hAnsi="Calibri"/>
+          <w:color w:val="1F2328"/>
+        </w:rPr>
+        <w:t xml:space="preserve"> (one every half minute or so):</w:t>
+      </w:r>
+    </w:p>
+    <w:p>
+      <w:pPr>
+        <w:pStyle w:val="ListParagraph"/>
+        <w:numPr>
+          <w:ilvl w:val="1"/>
+          <w:numId w:val="2"/>
+        </w:numPr>
+        <w:spacing w:after="80" w:line="276"/>
+      </w:pPr>
+      <w:r>
+        <w:rPr>
+          <w:rFonts w:ascii="Calibri" w:cs="Calibri" w:eastAsia="Calibri" w:hAnsi="Calibri"/>
+          <w:color w:val="1F2328"/>
+        </w:rPr>
+        <w:t xml:space="preserve">a thunderstorm, with lightning and thunder;</w:t>
+      </w:r>
+    </w:p>
+    <w:p>
+      <w:pPr>
+        <w:pStyle w:val="ListParagraph"/>
+        <w:numPr>
+          <w:ilvl w:val="1"/>
+          <w:numId w:val="2"/>
+        </w:numPr>
+        <w:spacing w:after="80" w:line="276"/>
+      </w:pPr>
+      <w:r>
+        <w:rPr>
+          <w:rFonts w:ascii="Calibri" w:cs="Calibri" w:eastAsia="Calibri" w:hAnsi="Calibri"/>
+          <w:color w:val="1F2328"/>
+        </w:rPr>
+        <w:t xml:space="preserve">the dead rising from their graves;</w:t>
+      </w:r>
+    </w:p>
+    <w:p>
+      <w:pPr>
+        <w:pStyle w:val="ListParagraph"/>
+        <w:numPr>
+          <w:ilvl w:val="1"/>
+          <w:numId w:val="2"/>
+        </w:numPr>
+        <w:spacing w:after="80" w:line="276"/>
+      </w:pPr>
+      <w:r>
+        <w:rPr>
+          <w:rFonts w:ascii="Calibri" w:cs="Calibri" w:eastAsia="Calibri" w:hAnsi="Calibri"/>
+          <w:color w:val="1F2328"/>
+        </w:rPr>
+        <w:t xml:space="preserve">a zombie dance troupe doing a routine under a stage light;</w:t>
+      </w:r>
+    </w:p>
+    <w:p>
+      <w:pPr>
+        <w:pStyle w:val="ListParagraph"/>
+        <w:numPr>
+          <w:ilvl w:val="1"/>
+          <w:numId w:val="2"/>
+        </w:numPr>
+        <w:spacing w:after="80" w:line="276"/>
+      </w:pPr>
+      <w:r>
+        <w:rPr>
+          <w:rFonts w:ascii="Calibri" w:cs="Calibri" w:eastAsia="Calibri" w:hAnsi="Calibri"/>
+          <w:color w:val="1F2328"/>
+        </w:rPr>
+        <w:t xml:space="preserve">the slasher chasing a group of screaming teenagers (one of them trips);</w:t>
+      </w:r>
+    </w:p>
+    <w:p>
+      <w:pPr>
+        <w:pStyle w:val="ListParagraph"/>
+        <w:numPr>
+          <w:ilvl w:val="1"/>
+          <w:numId w:val="2"/>
+        </w:numPr>
+        <w:spacing w:after="80" w:line="276"/>
+      </w:pPr>
+      <w:r>
+        <w:rPr>
+          <w:rFonts w:ascii="Calibri" w:cs="Calibri" w:eastAsia="Calibri" w:hAnsi="Calibri"/>
+          <w:color w:val="1F2328"/>
+        </w:rPr>
+        <w:t xml:space="preserve">a witch flying across the moon;</w:t>
+      </w:r>
+    </w:p>
+    <w:p>
+      <w:pPr>
+        <w:pStyle w:val="ListParagraph"/>
+        <w:numPr>
+          <w:ilvl w:val="1"/>
+          <w:numId w:val="2"/>
+        </w:numPr>
+        <w:spacing w:after="80" w:line="276"/>
+      </w:pPr>
+      <w:r>
+        <w:rPr>
+          <w:rFonts w:ascii="Calibri" w:cs="Calibri" w:eastAsia="Calibri" w:hAnsi="Calibri"/>
+          <w:color w:val="1F2328"/>
+        </w:rPr>
+        <w:t xml:space="preserve">bats bursting out of the church belfry;</w:t>
+      </w:r>
+    </w:p>
+    <w:p>
+      <w:pPr>
+        <w:pStyle w:val="ListParagraph"/>
+        <w:numPr>
+          <w:ilvl w:val="1"/>
+          <w:numId w:val="2"/>
+        </w:numPr>
+        <w:spacing w:after="80" w:line="276"/>
+      </w:pPr>
+      <w:r>
+        <w:rPr>
+          <w:rFonts w:ascii="Calibri" w:cs="Calibri" w:eastAsia="Calibri" w:hAnsi="Calibri"/>
+          <w:color w:val="1F2328"/>
+        </w:rPr>
+        <w:t xml:space="preserve">a ghost parade;</w:t>
+      </w:r>
+    </w:p>
+    <w:p>
+      <w:pPr>
+        <w:pStyle w:val="ListParagraph"/>
+        <w:numPr>
+          <w:ilvl w:val="1"/>
+          <w:numId w:val="2"/>
+        </w:numPr>
+        <w:spacing w:after="80" w:line="276"/>
+      </w:pPr>
+      <w:r>
+        <w:rPr>
+          <w:rFonts w:ascii="Calibri" w:cs="Calibri" w:eastAsia="Calibri" w:hAnsi="Calibri"/>
+          <w:color w:val="1F2328"/>
+        </w:rPr>
+        <w:t xml:space="preserve">the werewolf transforming on top of the broken tower;</w:t>
+      </w:r>
+    </w:p>
+    <w:p>
+      <w:pPr>
+        <w:pStyle w:val="ListParagraph"/>
+        <w:numPr>
+          <w:ilvl w:val="1"/>
+          <w:numId w:val="2"/>
+        </w:numPr>
+        <w:spacing w:after="80" w:line="276"/>
+      </w:pPr>
+      <w:r>
+        <w:rPr>
+          <w:rFonts w:ascii="Calibri" w:cs="Calibri" w:eastAsia="Calibri" w:hAnsi="Calibri"/>
+          <w:color w:val="1F2328"/>
+        </w:rPr>
+        <w:t xml:space="preserve">the HAUNTED HOUSE ride's doors bursting open;</w:t>
+      </w:r>
+    </w:p>
+    <w:p>
+      <w:pPr>
+        <w:pStyle w:val="ListParagraph"/>
+        <w:numPr>
+          <w:ilvl w:val="1"/>
+          <w:numId w:val="2"/>
+        </w:numPr>
+        <w:spacing w:after="80" w:line="276"/>
+      </w:pPr>
+      <w:r>
+        <w:rPr>
+          <w:rFonts w:ascii="Calibri" w:cs="Calibri" w:eastAsia="Calibri" w:hAnsi="Calibri"/>
+          <w:color w:val="1F2328"/>
+        </w:rPr>
+        <w:t xml:space="preserve">orange and green fireworks;</w:t>
+      </w:r>
+    </w:p>
+    <w:p>
+      <w:pPr>
+        <w:pStyle w:val="ListParagraph"/>
+        <w:numPr>
+          <w:ilvl w:val="1"/>
+          <w:numId w:val="2"/>
+        </w:numPr>
+        <w:spacing w:after="80" w:line="276"/>
+      </w:pPr>
+      <w:r>
+        <w:rPr>
+          <w:rFonts w:ascii="Calibri" w:cs="Calibri" w:eastAsia="Calibri" w:hAnsi="Calibri"/>
+          <w:color w:val="1F2328"/>
+        </w:rPr>
+        <w:t xml:space="preserve">the hearse driving by.</w:t>
+      </w:r>
+    </w:p>
+    <w:p>
+      <w:pPr>
+        <w:pStyle w:val="ListParagraph"/>
+        <w:numPr>
+          <w:ilvl w:val="0"/>
+          <w:numId w:val="2"/>
+        </w:numPr>
+        <w:spacing w:after="80" w:line="276"/>
+      </w:pPr>
+      <w:r>
+        <w:rPr>
+          <w:rFonts w:ascii="Calibri" w:cs="Calibri" w:eastAsia="Calibri" w:hAnsi="Calibri"/>
+          <w:b/>
+          <w:bCs/>
+          <w:color w:val="1F2328"/>
+        </w:rPr>
+        <w:t xml:space="preserve">Its own sounds:</w:t>
+      </w:r>
+      <w:r>
+        <w:rPr>
+          <w:rFonts w:ascii="Calibri" w:cs="Calibri" w:eastAsia="Calibri" w:hAnsi="Calibri"/>
+          <w:color w:val="1F2328"/>
+        </w:rPr>
+        <w:t xml:space="preserve"> thunder, a wolf's howl, an owl, the cemetery gate creaking, the church bell, a ghost's moan, distant screams, an organ chord, a witch's cackle and the zombie troupe's groove. They are quiet and rare so they never get in the way of the game, and they follow your sound-effects volume.</w:t>
+      </w:r>
+    </w:p>
+    <w:p>
+      <w:pPr>
+        <w:pStyle w:val="ListParagraph"/>
+        <w:numPr>
+          <w:ilvl w:val="0"/>
+          <w:numId w:val="2"/>
+        </w:numPr>
+        <w:spacing w:after="80" w:line="276"/>
+      </w:pPr>
+      <w:r>
+        <w:rPr>
+          <w:rFonts w:ascii="Calibri" w:cs="Calibri" w:eastAsia="Calibri" w:hAnsi="Calibri"/>
+          <w:b/>
+          <w:bCs/>
+          <w:color w:val="1F2328"/>
+        </w:rPr>
+        <w:t xml:space="preserve">On a win streak the court gets haunted:</w:t>
+      </w:r>
+    </w:p>
+    <w:p>
+      <w:pPr>
+        <w:pStyle w:val="ListParagraph"/>
+        <w:numPr>
+          <w:ilvl w:val="1"/>
+          <w:numId w:val="2"/>
+        </w:numPr>
+        <w:spacing w:after="80" w:line="276"/>
+      </w:pPr>
+      <w:r>
+        <w:rPr>
+          <w:rFonts w:ascii="Calibri" w:cs="Calibri" w:eastAsia="Calibri" w:hAnsi="Calibri"/>
+          <w:b/>
+          <w:bCs/>
+          <w:color w:val="1F2328"/>
+        </w:rPr>
+        <w:t xml:space="preserve">3 wins:</w:t>
+      </w:r>
+      <w:r>
+        <w:rPr>
+          <w:rFonts w:ascii="Calibri" w:cs="Calibri" w:eastAsia="Calibri" w:hAnsi="Calibri"/>
+          <w:color w:val="1F2328"/>
+        </w:rPr>
+        <w:t xml:space="preserve"> green ghost-fire flickers up all round the court.</w:t>
+      </w:r>
+    </w:p>
+    <w:p>
+      <w:pPr>
+        <w:pStyle w:val="ListParagraph"/>
+        <w:numPr>
+          <w:ilvl w:val="1"/>
+          <w:numId w:val="2"/>
+        </w:numPr>
+        <w:spacing w:after="80" w:line="276"/>
+      </w:pPr>
+      <w:r>
+        <w:rPr>
+          <w:rFonts w:ascii="Calibri" w:cs="Calibri" w:eastAsia="Calibri" w:hAnsi="Calibri"/>
+          <w:b/>
+          <w:bCs/>
+          <w:color w:val="1F2328"/>
+        </w:rPr>
+        <w:t xml:space="preserve">6 wins:</w:t>
+      </w:r>
+      <w:r>
+        <w:rPr>
+          <w:rFonts w:ascii="Calibri" w:cs="Calibri" w:eastAsia="Calibri" w:hAnsi="Calibri"/>
+          <w:color w:val="1F2328"/>
+        </w:rPr>
+        <w:t xml:space="preserve"> skeleton hands reach up out of the apron, fog creeps over the floor, and the court's floodlights flicker green.</w:t>
+      </w:r>
+    </w:p>
+    <w:p>
+      <w:pPr>
+        <w:pStyle w:val="ListParagraph"/>
+        <w:numPr>
+          <w:ilvl w:val="1"/>
+          <w:numId w:val="2"/>
+        </w:numPr>
+        <w:spacing w:after="80" w:line="276"/>
+      </w:pPr>
+      <w:r>
+        <w:rPr>
+          <w:rFonts w:ascii="Calibri" w:cs="Calibri" w:eastAsia="Calibri" w:hAnsi="Calibri"/>
+          <w:b/>
+          <w:bCs/>
+          <w:color w:val="1F2328"/>
+        </w:rPr>
+        <w:t xml:space="preserve">9 wins:</w:t>
+      </w:r>
+      <w:r>
+        <w:rPr>
+          <w:rFonts w:ascii="Calibri" w:cs="Calibri" w:eastAsia="Calibri" w:hAnsi="Calibri"/>
+          <w:color w:val="1F2328"/>
+        </w:rPr>
+        <w:t xml:space="preserve"> a ring of ghosts circles the court.</w:t>
+      </w:r>
+    </w:p>
+    <w:p>
+      <w:pPr>
+        <w:pStyle w:val="ListParagraph"/>
+        <w:numPr>
+          <w:ilvl w:val="1"/>
+          <w:numId w:val="2"/>
+        </w:numPr>
+        <w:spacing w:after="80" w:line="276"/>
+      </w:pPr>
+      <w:r>
+        <w:rPr>
+          <w:rFonts w:ascii="Calibri" w:cs="Calibri" w:eastAsia="Calibri" w:hAnsi="Calibri"/>
+          <w:b/>
+          <w:bCs/>
+          <w:color w:val="1F2328"/>
+        </w:rPr>
+        <w:t xml:space="preserve">12 wins:</w:t>
+      </w:r>
+      <w:r>
+        <w:rPr>
+          <w:rFonts w:ascii="Calibri" w:cs="Calibri" w:eastAsia="Calibri" w:hAnsi="Calibri"/>
+          <w:color w:val="1F2328"/>
+        </w:rPr>
+        <w:t xml:space="preserve"> the full haunting, with will-o'-wisps spiralling up into the sky, a giant skull whose jaw opens and shuts, and lightning striking round the court.</w:t>
+      </w:r>
+    </w:p>
+    <w:p>
+      <w:pPr>
+        <w:pStyle w:val="ListParagraph"/>
+        <w:numPr>
+          <w:ilvl w:val="1"/>
+          <w:numId w:val="2"/>
+        </w:numPr>
+        <w:spacing w:after="80" w:line="276"/>
+      </w:pPr>
+      <w:r>
+        <w:rPr>
+          <w:rFonts w:ascii="Calibri" w:cs="Calibri" w:eastAsia="Calibri" w:hAnsi="Calibri"/>
+          <w:color w:val="1F2328"/>
+        </w:rPr>
+        <w:t xml:space="preserve">The Got Next spots stay clear, the court stays readable even at 12, and the floodlights go back to normal when the streak ends.</w:t>
+      </w:r>
+    </w:p>
+    <w:p>
+      <w:pPr>
+        <w:pStyle w:val="ListParagraph"/>
+        <w:numPr>
+          <w:ilvl w:val="0"/>
+          <w:numId w:val="2"/>
+        </w:numPr>
+        <w:spacing w:after="80" w:line="276"/>
+      </w:pPr>
+      <w:r>
+        <w:rPr>
+          <w:rFonts w:ascii="Calibri" w:cs="Calibri" w:eastAsia="Calibri" w:hAnsi="Calibri"/>
+          <w:color w:val="1F2328"/>
+        </w:rPr>
+        <w:t xml:space="preserve">The event's leaderboard stands in the park on a tombstone with a green neon outline, a skull with glowing eyes on top and jack-o'-lanterns at its feet.</w:t>
+      </w:r>
+    </w:p>
+    <w:p>
+      <w:pPr>
+        <w:pStyle w:val="ListParagraph"/>
+        <w:numPr>
+          <w:ilvl w:val="0"/>
+          <w:numId w:val="2"/>
+        </w:numPr>
+        <w:spacing w:after="80" w:line="276"/>
+      </w:pPr>
+      <w:r>
+        <w:rPr>
+          <w:rFonts w:ascii="Calibri" w:cs="Calibri" w:eastAsia="Calibri" w:hAnsi="Calibri"/>
+          <w:b/>
+          <w:bCs/>
+          <w:color w:val="1F2328"/>
+        </w:rPr>
+        <w:t xml:space="preserve">Music:</w:t>
+      </w:r>
+      <w:r>
+        <w:rPr>
+          <w:rFonts w:ascii="Calibri" w:cs="Calibri" w:eastAsia="Calibri" w:hAnsi="Calibri"/>
+          <w:color w:val="1F2328"/>
+        </w:rPr>
+        <w:t xml:space="preserve"> the main soundtrack plays at the Monster Mash. No mix came with this event, so unlike the Beat it has no soundtrack of its own. Send one and it can get one the same way.</w:t>
+      </w:r>
+    </w:p>
+    <w:p>
+      <w:pPr>
+        <w:pStyle w:val="Heading2"/>
+        <w:spacing w:after="80" w:before="200"/>
+      </w:pPr>
+      <w:r>
+        <w:rPr>
+          <w:rFonts w:ascii="Calibri" w:cs="Calibri" w:eastAsia="Calibri" w:hAnsi="Calibri"/>
+          <w:b/>
+          <w:bCs/>
+          <w:color w:val="1F2328"/>
+          <w:sz w:val="26"/>
+          <w:szCs w:val="26"/>
+        </w:rPr>
+        <w:t xml:space="preserve">Rewards</w:t>
+      </w:r>
+    </w:p>
+    <w:p>
+      <w:pPr>
+        <w:spacing w:after="140" w:line="288"/>
+      </w:pPr>
+      <w:r>
+        <w:rPr>
+          <w:rFonts w:ascii="Calibri" w:cs="Calibri" w:eastAsia="Calibri" w:hAnsi="Calibri"/>
+          <w:color w:val="1F2328"/>
+        </w:rPr>
+        <w:t xml:space="preserve">The same tiers and prizes per place as every park event before it, with all-new items. None of them can be bought.</w:t>
+      </w:r>
+    </w:p>
+    <w:tbl>
+      <w:tblPr>
+        <w:tblW w:type="dxa" w:w="9360"/>
+        <w:tblBorders>
+          <w:top w:val="single" w:color="auto" w:sz="4"/>
+          <w:left w:val="single" w:color="auto" w:sz="4"/>
+          <w:bottom w:val="single" w:color="auto" w:sz="4"/>
+          <w:right w:val="single" w:color="auto" w:sz="4"/>
+          <w:insideH w:val="single" w:color="auto" w:sz="4"/>
+          <w:insideV w:val="single" w:color="auto" w:sz="4"/>
+        </w:tblBorders>
+      </w:tblPr>
+      <w:tblGrid>
+        <w:gridCol w:w="1446"/>
+        <w:gridCol w:w="1106"/>
+        <w:gridCol w:w="6808"/>
+      </w:tblGrid>
+      <w:tr>
+        <w:trPr>
+          <w:cantSplit/>
+          <w:tblHeader/>
+        </w:trPr>
+        <w:tc>
+          <w:tcPr>
+            <w:tcW w:type="dxa" w:w="1446"/>
+            <w:tcBorders>
+              <w:top w:val="single" w:color="D0D7DE" w:sz="4"/>
+              <w:left w:val="single" w:color="D0D7DE" w:sz="4"/>
+              <w:bottom w:val="single" w:color="D0D7DE" w:sz="4"/>
+              <w:right w:val="single" w:color="D0D7DE" w:sz="4"/>
+            </w:tcBorders>
+            <w:shd w:fill="F3E3E6" w:color="auto" w:val="clear"/>
+            <w:tcMar>
+              <w:top w:type="dxa" w:w="60"/>
+              <w:left w:type="dxa" w:w="100"/>
+              <w:bottom w:type="dxa" w:w="60"/>
+              <w:right w:type="dxa" w:w="100"/>
+            </w:tcMar>
+          </w:tcPr>
+          <w:p>
+            <w:pPr>
+              <w:jc w:val="left"/>
+            </w:pPr>
+            <w:r>
+              <w:rPr>
+                <w:rFonts w:ascii="Calibri" w:cs="Calibri" w:eastAsia="Calibri" w:hAnsi="Calibri"/>
+                <w:b/>
+                <w:bCs/>
+                <w:color w:val="1F2328"/>
+              </w:rPr>
+              <w:t xml:space="preserve">Place</w:t>
+            </w:r>
+          </w:p>
+        </w:tc>
+        <w:tc>
+          <w:tcPr>
+            <w:tcW w:type="dxa" w:w="1106"/>
+            <w:tcBorders>
+              <w:top w:val="single" w:color="D0D7DE" w:sz="4"/>
+              <w:left w:val="single" w:color="D0D7DE" w:sz="4"/>
+              <w:bottom w:val="single" w:color="D0D7DE" w:sz="4"/>
+              <w:right w:val="single" w:color="D0D7DE" w:sz="4"/>
+            </w:tcBorders>
+            <w:shd w:fill="F3E3E6" w:color="auto" w:val="clear"/>
+            <w:tcMar>
+              <w:top w:type="dxa" w:w="60"/>
+              <w:left w:type="dxa" w:w="100"/>
+              <w:bottom w:type="dxa" w:w="60"/>
+              <w:right w:type="dxa" w:w="100"/>
+            </w:tcMar>
+          </w:tcPr>
+          <w:p>
+            <w:pPr>
+              <w:jc w:val="center"/>
+            </w:pPr>
+            <w:r>
+              <w:rPr>
+                <w:rFonts w:ascii="Calibri" w:cs="Calibri" w:eastAsia="Calibri" w:hAnsi="Calibri"/>
+                <w:b/>
+                <w:bCs/>
+                <w:color w:val="1F2328"/>
+              </w:rPr>
+              <w:t xml:space="preserve">VC</w:t>
+            </w:r>
+          </w:p>
+        </w:tc>
+        <w:tc>
+          <w:tcPr>
+            <w:tcW w:type="dxa" w:w="6808"/>
+            <w:tcBorders>
+              <w:top w:val="single" w:color="D0D7DE" w:sz="4"/>
+              <w:left w:val="single" w:color="D0D7DE" w:sz="4"/>
+              <w:bottom w:val="single" w:color="D0D7DE" w:sz="4"/>
+              <w:right w:val="single" w:color="D0D7DE" w:sz="4"/>
+            </w:tcBorders>
+            <w:shd w:fill="F3E3E6" w:color="auto" w:val="clear"/>
+            <w:tcMar>
+              <w:top w:type="dxa" w:w="60"/>
+              <w:left w:type="dxa" w:w="100"/>
+              <w:bottom w:type="dxa" w:w="60"/>
+              <w:right w:type="dxa" w:w="100"/>
+            </w:tcMar>
+          </w:tcPr>
+          <w:p>
+            <w:pPr>
+              <w:jc w:val="left"/>
+            </w:pPr>
+            <w:r>
+              <w:rPr>
+                <w:rFonts w:ascii="Calibri" w:cs="Calibri" w:eastAsia="Calibri" w:hAnsi="Calibri"/>
+                <w:b/>
+                <w:bCs/>
+                <w:color w:val="1F2328"/>
+              </w:rPr>
+              <w:t xml:space="preserve">Items</w:t>
+            </w:r>
+          </w:p>
+        </w:tc>
+      </w:tr>
+      <w:tr>
+        <w:trPr>
+          <w:cantSplit/>
+          <w:tblHeader w:val="false"/>
+        </w:trPr>
+        <w:tc>
+          <w:tcPr>
+            <w:tcW w:type="dxa" w:w="1446"/>
+            <w:tcBorders>
+              <w:top w:val="single" w:color="D0D7DE" w:sz="4"/>
+              <w:left w:val="single" w:color="D0D7DE" w:sz="4"/>
+              <w:bottom w:val="single" w:color="D0D7DE" w:sz="4"/>
+              <w:right w:val="single" w:color="D0D7DE" w:sz="4"/>
+            </w:tcBorders>
+            <w:tcMar>
+              <w:top w:type="dxa" w:w="60"/>
+              <w:left w:type="dxa" w:w="100"/>
+              <w:bottom w:type="dxa" w:w="60"/>
+              <w:right w:type="dxa" w:w="100"/>
+            </w:tcMar>
+          </w:tcPr>
+          <w:p>
+            <w:pPr>
+              <w:jc w:val="left"/>
+            </w:pPr>
+            <w:r>
+              <w:rPr>
+                <w:rFonts w:ascii="Calibri" w:cs="Calibri" w:eastAsia="Calibri" w:hAnsi="Calibri"/>
+                <w:color w:val="1F2328"/>
+              </w:rPr>
+              <w:t xml:space="preserve">1st</w:t>
+            </w:r>
+          </w:p>
+        </w:tc>
+        <w:tc>
+          <w:tcPr>
+            <w:tcW w:type="dxa" w:w="1106"/>
+            <w:tcBorders>
+              <w:top w:val="single" w:color="D0D7DE" w:sz="4"/>
+              <w:left w:val="single" w:color="D0D7DE" w:sz="4"/>
+              <w:bottom w:val="single" w:color="D0D7DE" w:sz="4"/>
+              <w:right w:val="single" w:color="D0D7DE" w:sz="4"/>
+            </w:tcBorders>
+            <w:tcMar>
+              <w:top w:type="dxa" w:w="60"/>
+              <w:left w:type="dxa" w:w="100"/>
+              <w:bottom w:type="dxa" w:w="60"/>
+              <w:right w:type="dxa" w:w="100"/>
+            </w:tcMar>
+          </w:tcPr>
+          <w:p>
+            <w:pPr>
+              <w:jc w:val="center"/>
+            </w:pPr>
+            <w:r>
+              <w:rPr>
+                <w:rFonts w:ascii="Calibri" w:cs="Calibri" w:eastAsia="Calibri" w:hAnsi="Calibri"/>
+                <w:color w:val="1F2328"/>
+              </w:rPr>
+              <w:t xml:space="preserve">150,000</w:t>
+            </w:r>
+          </w:p>
+        </w:tc>
+        <w:tc>
+          <w:tcPr>
+            <w:tcW w:type="dxa" w:w="6808"/>
+            <w:tcBorders>
+              <w:top w:val="single" w:color="D0D7DE" w:sz="4"/>
+              <w:left w:val="single" w:color="D0D7DE" w:sz="4"/>
+              <w:bottom w:val="single" w:color="D0D7DE" w:sz="4"/>
+              <w:right w:val="single" w:color="D0D7DE" w:sz="4"/>
+            </w:tcBorders>
+            <w:tcMar>
+              <w:top w:type="dxa" w:w="60"/>
+              <w:left w:type="dxa" w:w="100"/>
+              <w:bottom w:type="dxa" w:w="60"/>
+              <w:right w:type="dxa" w:w="100"/>
+            </w:tcMar>
+          </w:tcPr>
+          <w:p>
+            <w:pPr>
+              <w:jc w:val="left"/>
+            </w:pPr>
+            <w:r>
+              <w:rPr>
+                <w:rFonts w:ascii="Calibri" w:cs="Calibri" w:eastAsia="Calibri" w:hAnsi="Calibri"/>
+                <w:color w:val="1F2328"/>
+              </w:rPr>
+              <w:t xml:space="preserve">the Bone Suit (top and tights), Coffin Hi / Graveyard, Zombie Shuffle, Jack-o'-Lantern Headband, Jack-o'-Lantern, Haunted Organ</w:t>
+            </w:r>
+          </w:p>
+        </w:tc>
+      </w:tr>
+      <w:tr>
+        <w:trPr>
+          <w:cantSplit/>
+          <w:tblHeader w:val="false"/>
+        </w:trPr>
+        <w:tc>
+          <w:tcPr>
+            <w:tcW w:type="dxa" w:w="1446"/>
+            <w:tcBorders>
+              <w:top w:val="single" w:color="D0D7DE" w:sz="4"/>
+              <w:left w:val="single" w:color="D0D7DE" w:sz="4"/>
+              <w:bottom w:val="single" w:color="D0D7DE" w:sz="4"/>
+              <w:right w:val="single" w:color="D0D7DE" w:sz="4"/>
+            </w:tcBorders>
+            <w:tcMar>
+              <w:top w:type="dxa" w:w="60"/>
+              <w:left w:type="dxa" w:w="100"/>
+              <w:bottom w:type="dxa" w:w="60"/>
+              <w:right w:type="dxa" w:w="100"/>
+            </w:tcMar>
+          </w:tcPr>
+          <w:p>
+            <w:pPr>
+              <w:jc w:val="left"/>
+            </w:pPr>
+            <w:r>
+              <w:rPr>
+                <w:rFonts w:ascii="Calibri" w:cs="Calibri" w:eastAsia="Calibri" w:hAnsi="Calibri"/>
+                <w:color w:val="1F2328"/>
+              </w:rPr>
+              <w:t xml:space="preserve">Top 3</w:t>
+            </w:r>
+          </w:p>
+        </w:tc>
+        <w:tc>
+          <w:tcPr>
+            <w:tcW w:type="dxa" w:w="1106"/>
+            <w:tcBorders>
+              <w:top w:val="single" w:color="D0D7DE" w:sz="4"/>
+              <w:left w:val="single" w:color="D0D7DE" w:sz="4"/>
+              <w:bottom w:val="single" w:color="D0D7DE" w:sz="4"/>
+              <w:right w:val="single" w:color="D0D7DE" w:sz="4"/>
+            </w:tcBorders>
+            <w:tcMar>
+              <w:top w:type="dxa" w:w="60"/>
+              <w:left w:type="dxa" w:w="100"/>
+              <w:bottom w:type="dxa" w:w="60"/>
+              <w:right w:type="dxa" w:w="100"/>
+            </w:tcMar>
+          </w:tcPr>
+          <w:p>
+            <w:pPr>
+              <w:jc w:val="center"/>
+            </w:pPr>
+            <w:r>
+              <w:rPr>
+                <w:rFonts w:ascii="Calibri" w:cs="Calibri" w:eastAsia="Calibri" w:hAnsi="Calibri"/>
+                <w:color w:val="1F2328"/>
+              </w:rPr>
+              <w:t xml:space="preserve">60,000</w:t>
+            </w:r>
+          </w:p>
+        </w:tc>
+        <w:tc>
+          <w:tcPr>
+            <w:tcW w:type="dxa" w:w="6808"/>
+            <w:tcBorders>
+              <w:top w:val="single" w:color="D0D7DE" w:sz="4"/>
+              <w:left w:val="single" w:color="D0D7DE" w:sz="4"/>
+              <w:bottom w:val="single" w:color="D0D7DE" w:sz="4"/>
+              <w:right w:val="single" w:color="D0D7DE" w:sz="4"/>
+            </w:tcBorders>
+            <w:tcMar>
+              <w:top w:type="dxa" w:w="60"/>
+              <w:left w:type="dxa" w:w="100"/>
+              <w:bottom w:type="dxa" w:w="60"/>
+              <w:right w:type="dxa" w:w="100"/>
+            </w:tcMar>
+          </w:tcPr>
+          <w:p>
+            <w:pPr>
+              <w:jc w:val="left"/>
+            </w:pPr>
+            <w:r>
+              <w:rPr>
+                <w:rFonts w:ascii="Calibri" w:cs="Calibri" w:eastAsia="Calibri" w:hAnsi="Calibri"/>
+                <w:color w:val="1F2328"/>
+              </w:rPr>
+              <w:t xml:space="preserve">Coffin Hi / Graveyard, Zombie Shuffle, Jack-o'-Lantern Headband, Jack-o'-Lantern, Haunted Organ</w:t>
+            </w:r>
+          </w:p>
+        </w:tc>
+      </w:tr>
+      <w:tr>
+        <w:trPr>
+          <w:cantSplit/>
+          <w:tblHeader w:val="false"/>
+        </w:trPr>
+        <w:tc>
+          <w:tcPr>
+            <w:tcW w:type="dxa" w:w="1446"/>
+            <w:tcBorders>
+              <w:top w:val="single" w:color="D0D7DE" w:sz="4"/>
+              <w:left w:val="single" w:color="D0D7DE" w:sz="4"/>
+              <w:bottom w:val="single" w:color="D0D7DE" w:sz="4"/>
+              <w:right w:val="single" w:color="D0D7DE" w:sz="4"/>
+            </w:tcBorders>
+            <w:tcMar>
+              <w:top w:type="dxa" w:w="60"/>
+              <w:left w:type="dxa" w:w="100"/>
+              <w:bottom w:type="dxa" w:w="60"/>
+              <w:right w:type="dxa" w:w="100"/>
+            </w:tcMar>
+          </w:tcPr>
+          <w:p>
+            <w:pPr>
+              <w:jc w:val="left"/>
+            </w:pPr>
+            <w:r>
+              <w:rPr>
+                <w:rFonts w:ascii="Calibri" w:cs="Calibri" w:eastAsia="Calibri" w:hAnsi="Calibri"/>
+                <w:color w:val="1F2328"/>
+              </w:rPr>
+              <w:t xml:space="preserve">Top 10</w:t>
+            </w:r>
+          </w:p>
+        </w:tc>
+        <w:tc>
+          <w:tcPr>
+            <w:tcW w:type="dxa" w:w="1106"/>
+            <w:tcBorders>
+              <w:top w:val="single" w:color="D0D7DE" w:sz="4"/>
+              <w:left w:val="single" w:color="D0D7DE" w:sz="4"/>
+              <w:bottom w:val="single" w:color="D0D7DE" w:sz="4"/>
+              <w:right w:val="single" w:color="D0D7DE" w:sz="4"/>
+            </w:tcBorders>
+            <w:tcMar>
+              <w:top w:type="dxa" w:w="60"/>
+              <w:left w:type="dxa" w:w="100"/>
+              <w:bottom w:type="dxa" w:w="60"/>
+              <w:right w:type="dxa" w:w="100"/>
+            </w:tcMar>
+          </w:tcPr>
+          <w:p>
+            <w:pPr>
+              <w:jc w:val="center"/>
+            </w:pPr>
+            <w:r>
+              <w:rPr>
+                <w:rFonts w:ascii="Calibri" w:cs="Calibri" w:eastAsia="Calibri" w:hAnsi="Calibri"/>
+                <w:color w:val="1F2328"/>
+              </w:rPr>
+              <w:t xml:space="preserve">25,000</w:t>
+            </w:r>
+          </w:p>
+        </w:tc>
+        <w:tc>
+          <w:tcPr>
+            <w:tcW w:type="dxa" w:w="6808"/>
+            <w:tcBorders>
+              <w:top w:val="single" w:color="D0D7DE" w:sz="4"/>
+              <w:left w:val="single" w:color="D0D7DE" w:sz="4"/>
+              <w:bottom w:val="single" w:color="D0D7DE" w:sz="4"/>
+              <w:right w:val="single" w:color="D0D7DE" w:sz="4"/>
+            </w:tcBorders>
+            <w:tcMar>
+              <w:top w:type="dxa" w:w="60"/>
+              <w:left w:type="dxa" w:w="100"/>
+              <w:bottom w:type="dxa" w:w="60"/>
+              <w:right w:type="dxa" w:w="100"/>
+            </w:tcMar>
+          </w:tcPr>
+          <w:p>
+            <w:pPr>
+              <w:jc w:val="left"/>
+            </w:pPr>
+            <w:r>
+              <w:rPr>
+                <w:rFonts w:ascii="Calibri" w:cs="Calibri" w:eastAsia="Calibri" w:hAnsi="Calibri"/>
+                <w:color w:val="1F2328"/>
+              </w:rPr>
+              <w:t xml:space="preserve">Zombie Shuffle, Jack-o'-Lantern Headband, Haunted Organ</w:t>
+            </w:r>
+          </w:p>
+        </w:tc>
+      </w:tr>
+      <w:tr>
+        <w:trPr>
+          <w:cantSplit/>
+          <w:tblHeader w:val="false"/>
+        </w:trPr>
+        <w:tc>
+          <w:tcPr>
+            <w:tcW w:type="dxa" w:w="1446"/>
+            <w:tcBorders>
+              <w:top w:val="single" w:color="D0D7DE" w:sz="4"/>
+              <w:left w:val="single" w:color="D0D7DE" w:sz="4"/>
+              <w:bottom w:val="single" w:color="D0D7DE" w:sz="4"/>
+              <w:right w:val="single" w:color="D0D7DE" w:sz="4"/>
+            </w:tcBorders>
+            <w:tcMar>
+              <w:top w:type="dxa" w:w="60"/>
+              <w:left w:type="dxa" w:w="100"/>
+              <w:bottom w:type="dxa" w:w="60"/>
+              <w:right w:type="dxa" w:w="100"/>
+            </w:tcMar>
+          </w:tcPr>
+          <w:p>
+            <w:pPr>
+              <w:jc w:val="left"/>
+            </w:pPr>
+            <w:r>
+              <w:rPr>
+                <w:rFonts w:ascii="Calibri" w:cs="Calibri" w:eastAsia="Calibri" w:hAnsi="Calibri"/>
+                <w:color w:val="1F2328"/>
+              </w:rPr>
+              <w:t xml:space="preserve">Top 25</w:t>
+            </w:r>
+          </w:p>
+        </w:tc>
+        <w:tc>
+          <w:tcPr>
+            <w:tcW w:type="dxa" w:w="1106"/>
+            <w:tcBorders>
+              <w:top w:val="single" w:color="D0D7DE" w:sz="4"/>
+              <w:left w:val="single" w:color="D0D7DE" w:sz="4"/>
+              <w:bottom w:val="single" w:color="D0D7DE" w:sz="4"/>
+              <w:right w:val="single" w:color="D0D7DE" w:sz="4"/>
+            </w:tcBorders>
+            <w:tcMar>
+              <w:top w:type="dxa" w:w="60"/>
+              <w:left w:type="dxa" w:w="100"/>
+              <w:bottom w:type="dxa" w:w="60"/>
+              <w:right w:type="dxa" w:w="100"/>
+            </w:tcMar>
+          </w:tcPr>
+          <w:p>
+            <w:pPr>
+              <w:jc w:val="center"/>
+            </w:pPr>
+            <w:r>
+              <w:rPr>
+                <w:rFonts w:ascii="Calibri" w:cs="Calibri" w:eastAsia="Calibri" w:hAnsi="Calibri"/>
+                <w:color w:val="1F2328"/>
+              </w:rPr>
+              <w:t xml:space="preserve">10,000</w:t>
+            </w:r>
+          </w:p>
+        </w:tc>
+        <w:tc>
+          <w:tcPr>
+            <w:tcW w:type="dxa" w:w="6808"/>
+            <w:tcBorders>
+              <w:top w:val="single" w:color="D0D7DE" w:sz="4"/>
+              <w:left w:val="single" w:color="D0D7DE" w:sz="4"/>
+              <w:bottom w:val="single" w:color="D0D7DE" w:sz="4"/>
+              <w:right w:val="single" w:color="D0D7DE" w:sz="4"/>
+            </w:tcBorders>
+            <w:tcMar>
+              <w:top w:type="dxa" w:w="60"/>
+              <w:left w:type="dxa" w:w="100"/>
+              <w:bottom w:type="dxa" w:w="60"/>
+              <w:right w:type="dxa" w:w="100"/>
+            </w:tcMar>
+          </w:tcPr>
+          <w:p>
+            <w:pPr>
+              <w:jc w:val="left"/>
+            </w:pPr>
+            <w:r>
+              <w:rPr>
+                <w:rFonts w:ascii="Calibri" w:cs="Calibri" w:eastAsia="Calibri" w:hAnsi="Calibri"/>
+                <w:color w:val="1F2328"/>
+              </w:rPr>
+              <w:t xml:space="preserve">Jack-o'-Lantern Headband</w:t>
+            </w:r>
+          </w:p>
+        </w:tc>
+      </w:tr>
+      <w:tr>
+        <w:trPr>
+          <w:cantSplit/>
+          <w:tblHeader w:val="false"/>
+        </w:trPr>
+        <w:tc>
+          <w:tcPr>
+            <w:tcW w:type="dxa" w:w="1446"/>
+            <w:tcBorders>
+              <w:top w:val="single" w:color="D0D7DE" w:sz="4"/>
+              <w:left w:val="single" w:color="D0D7DE" w:sz="4"/>
+              <w:bottom w:val="single" w:color="D0D7DE" w:sz="4"/>
+              <w:right w:val="single" w:color="D0D7DE" w:sz="4"/>
+            </w:tcBorders>
+            <w:tcMar>
+              <w:top w:type="dxa" w:w="60"/>
+              <w:left w:type="dxa" w:w="100"/>
+              <w:bottom w:type="dxa" w:w="60"/>
+              <w:right w:type="dxa" w:w="100"/>
+            </w:tcMar>
+          </w:tcPr>
+          <w:p>
+            <w:pPr>
+              <w:jc w:val="left"/>
+            </w:pPr>
+            <w:r>
+              <w:rPr>
+                <w:rFonts w:ascii="Calibri" w:cs="Calibri" w:eastAsia="Calibri" w:hAnsi="Calibri"/>
+                <w:color w:val="1F2328"/>
+              </w:rPr>
+              <w:t xml:space="preserve">Top half / played</w:t>
+            </w:r>
+          </w:p>
+        </w:tc>
+        <w:tc>
+          <w:tcPr>
+            <w:tcW w:type="dxa" w:w="1106"/>
+            <w:tcBorders>
+              <w:top w:val="single" w:color="D0D7DE" w:sz="4"/>
+              <w:left w:val="single" w:color="D0D7DE" w:sz="4"/>
+              <w:bottom w:val="single" w:color="D0D7DE" w:sz="4"/>
+              <w:right w:val="single" w:color="D0D7DE" w:sz="4"/>
+            </w:tcBorders>
+            <w:tcMar>
+              <w:top w:type="dxa" w:w="60"/>
+              <w:left w:type="dxa" w:w="100"/>
+              <w:bottom w:type="dxa" w:w="60"/>
+              <w:right w:type="dxa" w:w="100"/>
+            </w:tcMar>
+          </w:tcPr>
+          <w:p>
+            <w:pPr>
+              <w:jc w:val="center"/>
+            </w:pPr>
+            <w:r>
+              <w:rPr>
+                <w:rFonts w:ascii="Calibri" w:cs="Calibri" w:eastAsia="Calibri" w:hAnsi="Calibri"/>
+                <w:color w:val="1F2328"/>
+              </w:rPr>
+              <w:t xml:space="preserve">3,000 / 1,000</w:t>
+            </w:r>
+          </w:p>
+        </w:tc>
+        <w:tc>
+          <w:tcPr>
+            <w:tcW w:type="dxa" w:w="6808"/>
+            <w:tcBorders>
+              <w:top w:val="single" w:color="D0D7DE" w:sz="4"/>
+              <w:left w:val="single" w:color="D0D7DE" w:sz="4"/>
+              <w:bottom w:val="single" w:color="D0D7DE" w:sz="4"/>
+              <w:right w:val="single" w:color="D0D7DE" w:sz="4"/>
+            </w:tcBorders>
+            <w:tcMar>
+              <w:top w:type="dxa" w:w="60"/>
+              <w:left w:type="dxa" w:w="100"/>
+              <w:bottom w:type="dxa" w:w="60"/>
+              <w:right w:type="dxa" w:w="100"/>
+            </w:tcMar>
+          </w:tcPr>
+          <w:p>
+            <w:pPr>
+              <w:jc w:val="left"/>
+            </w:pPr>
+          </w:p>
+        </w:tc>
+      </w:tr>
+    </w:tbl>
+    <w:p>
+      <w:pPr>
+        <w:spacing w:after="80"/>
+      </w:pPr>
+    </w:p>
+    <w:p>
+      <w:pPr>
+        <w:pStyle w:val="ListParagraph"/>
+        <w:numPr>
+          <w:ilvl w:val="0"/>
+          <w:numId w:val="2"/>
+        </w:numPr>
+        <w:spacing w:after="80" w:line="276"/>
+      </w:pPr>
+      <w:r>
+        <w:rPr>
+          <w:rFonts w:ascii="Calibri" w:cs="Calibri" w:eastAsia="Calibri" w:hAnsi="Calibri"/>
+          <w:b/>
+          <w:bCs/>
+          <w:color w:val="1F2328"/>
+        </w:rPr>
+        <w:t xml:space="preserve">The Bone Suit</w:t>
+      </w:r>
+      <w:r>
+        <w:rPr>
+          <w:rFonts w:ascii="Calibri" w:cs="Calibri" w:eastAsia="Calibri" w:hAnsi="Calibri"/>
+          <w:color w:val="1F2328"/>
+        </w:rPr>
+        <w:t xml:space="preserve"> (grand prize, unique to this event): a skin-tight black bodysuit with a skeleton on it that glows in the dark. The front has the collarbones, the sternum and the ribcage, the back has the spine and the shoulder blades, and the bones of the arms run down the sleeves. It comes with gloves that show every finger bone. The matching tights have the pelvis, the thigh bones, the kneecaps and the shin bones. The bones are bone-white in the light and glow ghost-green at night.</w:t>
+      </w:r>
+    </w:p>
+    <w:p>
+      <w:pPr>
+        <w:pStyle w:val="ListParagraph"/>
+        <w:numPr>
+          <w:ilvl w:val="0"/>
+          <w:numId w:val="2"/>
+        </w:numPr>
+        <w:spacing w:after="80" w:line="276"/>
+      </w:pPr>
+      <w:r>
+        <w:rPr>
+          <w:rFonts w:ascii="Calibri" w:cs="Calibri" w:eastAsia="Calibri" w:hAnsi="Calibri"/>
+          <w:b/>
+          <w:bCs/>
+          <w:color w:val="1F2328"/>
+        </w:rPr>
+        <w:t xml:space="preserve">Coffin Hi / Graveyard</w:t>
+      </w:r>
+      <w:r>
+        <w:rPr>
+          <w:rFonts w:ascii="Calibri" w:cs="Calibri" w:eastAsia="Calibri" w:hAnsi="Calibri"/>
+          <w:color w:val="1F2328"/>
+        </w:rPr>
+        <w:t xml:space="preserve"> (top 3): a black high-top with a deep purple coffin on each side, a skull and crossbones on the coffin, bone-white laces and stitching, and slime-green drips glowing round the sole. A little skull charm with glowing eyes hangs on the laces.</w:t>
+      </w:r>
+    </w:p>
+    <w:p>
+      <w:pPr>
+        <w:pStyle w:val="ListParagraph"/>
+        <w:numPr>
+          <w:ilvl w:val="0"/>
+          <w:numId w:val="2"/>
+        </w:numPr>
+        <w:spacing w:after="80" w:line="276"/>
+      </w:pPr>
+      <w:r>
+        <w:rPr>
+          <w:rFonts w:ascii="Calibri" w:cs="Calibri" w:eastAsia="Calibri" w:hAnsi="Calibri"/>
+          <w:b/>
+          <w:bCs/>
+          <w:color w:val="1F2328"/>
+        </w:rPr>
+        <w:t xml:space="preserve">Jack-o'-Lantern Headband</w:t>
+      </w:r>
+      <w:r>
+        <w:rPr>
+          <w:rFonts w:ascii="Calibri" w:cs="Calibri" w:eastAsia="Calibri" w:hAnsi="Calibri"/>
+          <w:color w:val="1F2328"/>
+        </w:rPr>
+        <w:t xml:space="preserve"> (top 25): a pumpkin-orange band with a small carved pumpkin on the forehead, lit from inside by a flickering candle.</w:t>
+      </w:r>
+    </w:p>
+    <w:p>
+      <w:pPr>
+        <w:pStyle w:val="ListParagraph"/>
+        <w:numPr>
+          <w:ilvl w:val="0"/>
+          <w:numId w:val="2"/>
+        </w:numPr>
+        <w:spacing w:after="80" w:line="276"/>
+      </w:pPr>
+      <w:r>
+        <w:rPr>
+          <w:rFonts w:ascii="Calibri" w:cs="Calibri" w:eastAsia="Calibri" w:hAnsi="Calibri"/>
+          <w:b/>
+          <w:bCs/>
+          <w:color w:val="1F2328"/>
+        </w:rPr>
+        <w:t xml:space="preserve">Celebration: Zombie Shuffle</w:t>
+      </w:r>
+      <w:r>
+        <w:rPr>
+          <w:rFonts w:ascii="Calibri" w:cs="Calibri" w:eastAsia="Calibri" w:hAnsi="Calibri"/>
+          <w:color w:val="1F2328"/>
+        </w:rPr>
+        <w:t xml:space="preserve"> (top 10): arms locked straight out in front and the head lolling to one side. You drag one foot forward and back, twitch twice, then lunge forward with a snarl.</w:t>
+      </w:r>
+    </w:p>
+    <w:p>
+      <w:pPr>
+        <w:pStyle w:val="ListParagraph"/>
+        <w:numPr>
+          <w:ilvl w:val="0"/>
+          <w:numId w:val="2"/>
+        </w:numPr>
+        <w:spacing w:after="80" w:line="276"/>
+      </w:pPr>
+      <w:r>
+        <w:rPr>
+          <w:rFonts w:ascii="Calibri" w:cs="Calibri" w:eastAsia="Calibri" w:hAnsi="Calibri"/>
+          <w:b/>
+          <w:bCs/>
+          <w:color w:val="1F2328"/>
+        </w:rPr>
+        <w:t xml:space="preserve">Jack-o'-Lantern</w:t>
+      </w:r>
+      <w:r>
+        <w:rPr>
+          <w:rFonts w:ascii="Calibri" w:cs="Calibri" w:eastAsia="Calibri" w:hAnsi="Calibri"/>
+          <w:color w:val="1F2328"/>
+        </w:rPr>
+        <w:t xml:space="preserve"> (green FX, top 3): a dark pumpkin rises over your head on the release and swells as its candle catches and its face lights up. The moment the shot drops it bursts open, and a swarm of bats flies out in every direction in a puff of ghost-green smoke.</w:t>
+      </w:r>
+    </w:p>
+    <w:p>
+      <w:pPr>
+        <w:pStyle w:val="ListParagraph"/>
+        <w:numPr>
+          <w:ilvl w:val="0"/>
+          <w:numId w:val="2"/>
+        </w:numPr>
+        <w:spacing w:after="80" w:line="276"/>
+      </w:pPr>
+      <w:r>
+        <w:rPr>
+          <w:rFonts w:ascii="Calibri" w:cs="Calibri" w:eastAsia="Calibri" w:hAnsi="Calibri"/>
+          <w:b/>
+          <w:bCs/>
+          <w:color w:val="1F2328"/>
+        </w:rPr>
+        <w:t xml:space="preserve">Haunted Organ</w:t>
+      </w:r>
+      <w:r>
+        <w:rPr>
+          <w:rFonts w:ascii="Calibri" w:cs="Calibri" w:eastAsia="Calibri" w:hAnsi="Calibri"/>
+          <w:color w:val="1F2328"/>
+        </w:rPr>
+        <w:t xml:space="preserve"> (green sound, top 10): a haunted pipe organ hits a big minor chord over a crack of thunder. Then a graveyard gate creaks open, a chain rattles, and a ghostly theremin rises out of it all.</w:t>
+      </w:r>
+    </w:p>
+    <w:p>
+      <w:pPr>
+        <w:pStyle w:val="ListParagraph"/>
+        <w:numPr>
+          <w:ilvl w:val="0"/>
+          <w:numId w:val="2"/>
+        </w:numPr>
+        <w:spacing w:after="80" w:line="276"/>
+      </w:pPr>
+      <w:r>
+        <w:rPr>
+          <w:rFonts w:ascii="Calibri" w:cs="Calibri" w:eastAsia="Calibri" w:hAnsi="Calibri"/>
+          <w:color w:val="1F2328"/>
+        </w:rPr>
+        <w:t xml:space="preserve">The store lists them with ★ MONSTER MASH, like the other event items.</w:t>
+      </w:r>
+    </w:p>
+    <w:p>
+      <w:pPr>
+        <w:pBdr>
+          <w:bottom w:val="single" w:color="D0D7DE" w:sz="4" w:space="1"/>
+        </w:pBdr>
+        <w:spacing w:after="160" w:before="80"/>
+      </w:pPr>
+    </w:p>
+    <w:p>
+      <w:pPr>
         <w:spacing w:after="140" w:line="288"/>
       </w:pPr>
       <w:r>
@@ -5170,7 +6681,7 @@
           <w:sz w:val="19"/>
           <w:szCs w:val="19"/>
         </w:rPr>
-        <w:t xml:space="preserve">(Tests: 110 Python and 294 node tests, plus browser checks of every park, the Pro-Am rank card and results, the Park screen's locks, the Inventory's locks, the Sharp Eye hop and pop-up, an off-ball screen in a Pro-Am game and the results countdown. For the quick patch: the event park in every direction, its events and streak effect; the rewards on a player and in a game, with the green sound measured against the other green sounds; and the schedule handover, the event soundtrack and the store labels.)</w:t>
+        <w:t xml:space="preserve">(Tests: 115 Python and 315 node tests, plus browser checks of every park, the Pro-Am rank card and results, the Park screen's locks, the Inventory's locks, the Sharp Eye hop and pop-up, an off-ball screen in a Pro-Am game and the results countdown. For the quick patches: each event park in every direction, its events and streak effect; the rewards on a player and in a game, with the green sounds measured against the other green sounds; and each schedule handover, the event soundtrack and the store labels.)</w:t>
       </w:r>
     </w:p>
     <w:sectPr>

</xml_diff>

<commit_message>
Monster Mash Soundtrack Update + Gameplay changes
</commit_message>
<xml_diff>
--- a/PATCH_NOTES_v0.4.8.5.docx
+++ b/PATCH_NOTES_v0.4.8.5.docx
@@ -5872,7 +5872,7 @@
           <w:rFonts w:ascii="Calibri" w:cs="Calibri" w:eastAsia="Calibri" w:hAnsi="Calibri"/>
           <w:color w:val="1F2328"/>
         </w:rPr>
-        <w:t xml:space="preserve"> the main soundtrack plays at the Monster Mash. No mix came with this event, so unlike the Beat it has no soundtrack of its own. Send one and it can get one the same way.</w:t>
+        <w:t xml:space="preserve"> it has its own soundtrack since quick patch 3 (below), from the Halloween party mix you sent.</w:t>
       </w:r>
     </w:p>
     <w:p>
@@ -6670,6 +6670,1455 @@
     </w:p>
     <w:p>
       <w:pPr>
+        <w:pStyle w:val="Heading1"/>
+        <w:spacing w:after="120" w:before="280"/>
+      </w:pPr>
+      <w:r>
+        <w:rPr>
+          <w:rFonts w:ascii="Calibri" w:cs="Calibri" w:eastAsia="Calibri" w:hAnsi="Calibri"/>
+          <w:b/>
+          <w:bCs/>
+          <w:color w:val="C8102E"/>
+          <w:sz w:val="32"/>
+          <w:szCs w:val="32"/>
+        </w:rPr>
+        <w:t xml:space="preserve">Quick patch 3 (Oct 16): ICON status, Open Arms, the Mash's soundtrack</w:t>
+      </w:r>
+    </w:p>
+    <w:p>
+      <w:pPr>
+        <w:pStyle w:val="Heading2"/>
+        <w:spacing w:after="80" w:before="200"/>
+      </w:pPr>
+      <w:r>
+        <w:rPr>
+          <w:rFonts w:ascii="Calibri" w:cs="Calibri" w:eastAsia="Calibri" w:hAnsi="Calibri"/>
+          <w:b/>
+          <w:bCs/>
+          <w:color w:val="1F2328"/>
+          <w:sz w:val="26"/>
+          <w:szCs w:val="26"/>
+        </w:rPr>
+        <w:t xml:space="preserve">ICON status: the endgame</w:t>
+      </w:r>
+    </w:p>
+    <w:p>
+      <w:pPr>
+        <w:spacing w:after="140" w:line="288"/>
+      </w:pPr>
+      <w:r>
+        <w:rPr>
+          <w:rFonts w:ascii="Calibri" w:cs="Calibri" w:eastAsia="Calibri" w:hAnsi="Calibri"/>
+          <w:color w:val="1F2328"/>
+        </w:rPr>
+        <w:t xml:space="preserve">A build becomes an </w:t>
+      </w:r>
+      <w:r>
+        <w:rPr>
+          <w:rFonts w:ascii="Calibri" w:cs="Calibri" w:eastAsia="Calibri" w:hAnsi="Calibri"/>
+          <w:b/>
+          <w:bCs/>
+          <w:color w:val="1F2328"/>
+        </w:rPr>
+        <w:t xml:space="preserve">ICON</w:t>
+      </w:r>
+      <w:r>
+        <w:rPr>
+          <w:rFonts w:ascii="Calibri" w:cs="Calibri" w:eastAsia="Calibri" w:hAnsi="Calibri"/>
+          <w:color w:val="1F2328"/>
+        </w:rPr>
+        <w:t xml:space="preserve"> once it has done everything a build can do:</w:t>
+      </w:r>
+    </w:p>
+    <w:p>
+      <w:pPr>
+        <w:pStyle w:val="ListParagraph"/>
+        <w:numPr>
+          <w:ilvl w:val="0"/>
+          <w:numId w:val="2"/>
+        </w:numPr>
+        <w:spacing w:after="80" w:line="276"/>
+      </w:pPr>
+      <w:r>
+        <w:rPr>
+          <w:rFonts w:ascii="Calibri" w:cs="Calibri" w:eastAsia="Calibri" w:hAnsi="Calibri"/>
+          <w:b/>
+          <w:bCs/>
+          <w:color w:val="1F2328"/>
+        </w:rPr>
+        <w:t xml:space="preserve">Every cap breaker unlocked.</w:t>
+      </w:r>
+      <w:r>
+        <w:rPr>
+          <w:rFonts w:ascii="Calibri" w:cs="Calibri" w:eastAsia="Calibri" w:hAnsi="Calibri"/>
+          <w:color w:val="1F2328"/>
+        </w:rPr>
+        <w:t xml:space="preserve"> Cap breakers open at 90 max OVR, and the first 5 Hall of Fame badges bring 5 each, so 25 on most builds (fewer on a build that can't reach 5 Hall of Fames).</w:t>
+      </w:r>
+    </w:p>
+    <w:p>
+      <w:pPr>
+        <w:pStyle w:val="ListParagraph"/>
+        <w:numPr>
+          <w:ilvl w:val="0"/>
+          <w:numId w:val="2"/>
+        </w:numPr>
+        <w:spacing w:after="80" w:line="276"/>
+      </w:pPr>
+      <w:r>
+        <w:rPr>
+          <w:rFonts w:ascii="Calibri" w:cs="Calibri" w:eastAsia="Calibri" w:hAnsi="Calibri"/>
+          <w:b/>
+          <w:bCs/>
+          <w:color w:val="1F2328"/>
+        </w:rPr>
+        <w:t xml:space="preserve">Every badge maxed</w:t>
+      </w:r>
+      <w:r>
+        <w:rPr>
+          <w:rFonts w:ascii="Calibri" w:cs="Calibri" w:eastAsia="Calibri" w:hAnsi="Calibri"/>
+          <w:color w:val="1F2328"/>
+        </w:rPr>
+        <w:t xml:space="preserve"> as far as this build can take it: each badge at its cap, all 7 Hall of Fame slots filled (or as many as the build can reach), and the rest at Gold.</w:t>
+      </w:r>
+    </w:p>
+    <w:p>
+      <w:pPr>
+        <w:pStyle w:val="ListParagraph"/>
+        <w:numPr>
+          <w:ilvl w:val="0"/>
+          <w:numId w:val="2"/>
+        </w:numPr>
+        <w:spacing w:after="80" w:line="276"/>
+      </w:pPr>
+      <w:r>
+        <w:rPr>
+          <w:rFonts w:ascii="Calibri" w:cs="Calibri" w:eastAsia="Calibri" w:hAnsi="Calibri"/>
+          <w:b/>
+          <w:bCs/>
+          <w:color w:val="1F2328"/>
+        </w:rPr>
+        <w:t xml:space="preserve">99 overall.</w:t>
+      </w:r>
+    </w:p>
+    <w:p>
+      <w:pPr>
+        <w:spacing w:after="140" w:line="288"/>
+      </w:pPr>
+      <w:r>
+        <w:rPr>
+          <w:rFonts w:ascii="Calibri" w:cs="Calibri" w:eastAsia="Calibri" w:hAnsi="Calibri"/>
+          <w:color w:val="1F2328"/>
+        </w:rPr>
+        <w:t xml:space="preserve">What it brings:</w:t>
+      </w:r>
+    </w:p>
+    <w:p>
+      <w:pPr>
+        <w:pStyle w:val="ListParagraph"/>
+        <w:numPr>
+          <w:ilvl w:val="0"/>
+          <w:numId w:val="2"/>
+        </w:numPr>
+        <w:spacing w:after="80" w:line="276"/>
+      </w:pPr>
+      <w:r>
+        <w:rPr>
+          <w:rFonts w:ascii="Calibri" w:cs="Calibri" w:eastAsia="Calibri" w:hAnsi="Calibri"/>
+          <w:b/>
+          <w:bCs/>
+          <w:color w:val="1F2328"/>
+        </w:rPr>
+        <w:t xml:space="preserve">ICON goes in front of the archetype everywhere</w:t>
+      </w:r>
+      <w:r>
+        <w:rPr>
+          <w:rFonts w:ascii="Calibri" w:cs="Calibri" w:eastAsia="Calibri" w:hAnsi="Calibri"/>
+          <w:color w:val="1F2328"/>
+        </w:rPr>
+        <w:t xml:space="preserve"> the archetype shows: MyPlayer, the player list, the home screen, Stats, the social phone, rosters and the team intros. It's written in the same moving spectrum colours as the Icon badges ("ICON Stretch Big").</w:t>
+      </w:r>
+    </w:p>
+    <w:p>
+      <w:pPr>
+        <w:pStyle w:val="ListParagraph"/>
+        <w:numPr>
+          <w:ilvl w:val="0"/>
+          <w:numId w:val="2"/>
+        </w:numPr>
+        <w:spacing w:after="80" w:line="276"/>
+      </w:pPr>
+      <w:r>
+        <w:rPr>
+          <w:rFonts w:ascii="Calibri" w:cs="Calibri" w:eastAsia="Calibri" w:hAnsi="Calibri"/>
+          <w:b/>
+          <w:bCs/>
+          <w:color w:val="1F2328"/>
+        </w:rPr>
+        <w:t xml:space="preserve">The Icon badge replaces the ring under you in every mode:</w:t>
+      </w:r>
+      <w:r>
+        <w:rPr>
+          <w:rFonts w:ascii="Calibri" w:cs="Calibri" w:eastAsia="Calibri" w:hAnsi="Calibri"/>
+          <w:color w:val="1F2328"/>
+        </w:rPr>
+        <w:t xml:space="preserve"> the park, event parks, Pro-Am, the Pro Run, the Crew HQ and online games, for every ICON player (you, teammates, opponents). It's your build's own Icon badge, with a spectrum rim that turns and a glow that pulses, plus a thin ring in your team colour (gold for you, blue for teammates, red for opponents online). Being hot or cold still takes its place while it lasts.</w:t>
+      </w:r>
+    </w:p>
+    <w:p>
+      <w:pPr>
+        <w:pStyle w:val="ListParagraph"/>
+        <w:numPr>
+          <w:ilvl w:val="0"/>
+          <w:numId w:val="2"/>
+        </w:numPr>
+        <w:spacing w:after="80" w:line="276"/>
+      </w:pPr>
+      <w:r>
+        <w:rPr>
+          <w:rFonts w:ascii="Calibri" w:cs="Calibri" w:eastAsia="Calibri" w:hAnsi="Calibri"/>
+          <w:b/>
+          <w:bCs/>
+          <w:color w:val="1F2328"/>
+        </w:rPr>
+        <w:t xml:space="preserve">A dark aura.</w:t>
+      </w:r>
+      <w:r>
+        <w:rPr>
+          <w:rFonts w:ascii="Calibri" w:cs="Calibri" w:eastAsia="Calibri" w:hAnsi="Calibri"/>
+          <w:color w:val="1F2328"/>
+        </w:rPr>
+        <w:t xml:space="preserve"> It's a black and deep-violet flame aura that wraps the player and licks upward, with a faint purple edge so it reads on bright courts and at night. It follows him as he moves, crouches and jumps. It grows with the build's win streak, which counts wins in every mode together. A loss, a forfeit or leaving a game ends the streak.</w:t>
+      </w:r>
+    </w:p>
+    <w:tbl>
+      <w:tblPr>
+        <w:tblW w:type="dxa" w:w="9360"/>
+        <w:tblBorders>
+          <w:top w:val="single" w:color="auto" w:sz="4"/>
+          <w:left w:val="single" w:color="auto" w:sz="4"/>
+          <w:bottom w:val="single" w:color="auto" w:sz="4"/>
+          <w:right w:val="single" w:color="auto" w:sz="4"/>
+          <w:insideH w:val="single" w:color="auto" w:sz="4"/>
+          <w:insideV w:val="single" w:color="auto" w:sz="4"/>
+        </w:tblBorders>
+      </w:tblPr>
+      <w:tblGrid>
+        <w:gridCol w:w="1040"/>
+        <w:gridCol w:w="8320"/>
+      </w:tblGrid>
+      <w:tr>
+        <w:trPr>
+          <w:cantSplit/>
+          <w:tblHeader/>
+        </w:trPr>
+        <w:tc>
+          <w:tcPr>
+            <w:tcW w:type="dxa" w:w="1040"/>
+            <w:tcBorders>
+              <w:top w:val="single" w:color="D0D7DE" w:sz="4"/>
+              <w:left w:val="single" w:color="D0D7DE" w:sz="4"/>
+              <w:bottom w:val="single" w:color="D0D7DE" w:sz="4"/>
+              <w:right w:val="single" w:color="D0D7DE" w:sz="4"/>
+            </w:tcBorders>
+            <w:shd w:fill="F3E3E6" w:color="auto" w:val="clear"/>
+            <w:tcMar>
+              <w:top w:type="dxa" w:w="60"/>
+              <w:left w:type="dxa" w:w="100"/>
+              <w:bottom w:type="dxa" w:w="60"/>
+              <w:right w:type="dxa" w:w="100"/>
+            </w:tcMar>
+          </w:tcPr>
+          <w:p>
+            <w:pPr>
+              <w:jc w:val="left"/>
+            </w:pPr>
+            <w:r>
+              <w:rPr>
+                <w:rFonts w:ascii="Calibri" w:cs="Calibri" w:eastAsia="Calibri" w:hAnsi="Calibri"/>
+                <w:b/>
+                <w:bCs/>
+                <w:color w:val="1F2328"/>
+              </w:rPr>
+              <w:t xml:space="preserve">Win streak</w:t>
+            </w:r>
+          </w:p>
+        </w:tc>
+        <w:tc>
+          <w:tcPr>
+            <w:tcW w:type="dxa" w:w="8320"/>
+            <w:tcBorders>
+              <w:top w:val="single" w:color="D0D7DE" w:sz="4"/>
+              <w:left w:val="single" w:color="D0D7DE" w:sz="4"/>
+              <w:bottom w:val="single" w:color="D0D7DE" w:sz="4"/>
+              <w:right w:val="single" w:color="D0D7DE" w:sz="4"/>
+            </w:tcBorders>
+            <w:shd w:fill="F3E3E6" w:color="auto" w:val="clear"/>
+            <w:tcMar>
+              <w:top w:type="dxa" w:w="60"/>
+              <w:left w:type="dxa" w:w="100"/>
+              <w:bottom w:type="dxa" w:w="60"/>
+              <w:right w:type="dxa" w:w="100"/>
+            </w:tcMar>
+          </w:tcPr>
+          <w:p>
+            <w:pPr>
+              <w:jc w:val="left"/>
+            </w:pPr>
+            <w:r>
+              <w:rPr>
+                <w:rFonts w:ascii="Calibri" w:cs="Calibri" w:eastAsia="Calibri" w:hAnsi="Calibri"/>
+                <w:b/>
+                <w:bCs/>
+                <w:color w:val="1F2328"/>
+              </w:rPr>
+              <w:t xml:space="preserve">Aura</w:t>
+            </w:r>
+          </w:p>
+        </w:tc>
+      </w:tr>
+      <w:tr>
+        <w:trPr>
+          <w:cantSplit/>
+          <w:tblHeader w:val="false"/>
+        </w:trPr>
+        <w:tc>
+          <w:tcPr>
+            <w:tcW w:type="dxa" w:w="1040"/>
+            <w:tcBorders>
+              <w:top w:val="single" w:color="D0D7DE" w:sz="4"/>
+              <w:left w:val="single" w:color="D0D7DE" w:sz="4"/>
+              <w:bottom w:val="single" w:color="D0D7DE" w:sz="4"/>
+              <w:right w:val="single" w:color="D0D7DE" w:sz="4"/>
+            </w:tcBorders>
+            <w:tcMar>
+              <w:top w:type="dxa" w:w="60"/>
+              <w:left w:type="dxa" w:w="100"/>
+              <w:bottom w:type="dxa" w:w="60"/>
+              <w:right w:type="dxa" w:w="100"/>
+            </w:tcMar>
+          </w:tcPr>
+          <w:p>
+            <w:pPr>
+              <w:jc w:val="left"/>
+            </w:pPr>
+            <w:r>
+              <w:rPr>
+                <w:rFonts w:ascii="Calibri" w:cs="Calibri" w:eastAsia="Calibri" w:hAnsi="Calibri"/>
+                <w:color w:val="1F2328"/>
+              </w:rPr>
+              <w:t xml:space="preserve">0–2</w:t>
+            </w:r>
+          </w:p>
+        </w:tc>
+        <w:tc>
+          <w:tcPr>
+            <w:tcW w:type="dxa" w:w="8320"/>
+            <w:tcBorders>
+              <w:top w:val="single" w:color="D0D7DE" w:sz="4"/>
+              <w:left w:val="single" w:color="D0D7DE" w:sz="4"/>
+              <w:bottom w:val="single" w:color="D0D7DE" w:sz="4"/>
+              <w:right w:val="single" w:color="D0D7DE" w:sz="4"/>
+            </w:tcBorders>
+            <w:tcMar>
+              <w:top w:type="dxa" w:w="60"/>
+              <w:left w:type="dxa" w:w="100"/>
+              <w:bottom w:type="dxa" w:w="60"/>
+              <w:right w:type="dxa" w:w="100"/>
+            </w:tcMar>
+          </w:tcPr>
+          <w:p>
+            <w:pPr>
+              <w:jc w:val="left"/>
+            </w:pPr>
+            <w:r>
+              <w:rPr>
+                <w:rFonts w:ascii="Calibri" w:cs="Calibri" w:eastAsia="Calibri" w:hAnsi="Calibri"/>
+                <w:color w:val="1F2328"/>
+              </w:rPr>
+              <w:t xml:space="preserve">Hidden</w:t>
+            </w:r>
+          </w:p>
+        </w:tc>
+      </w:tr>
+      <w:tr>
+        <w:trPr>
+          <w:cantSplit/>
+          <w:tblHeader w:val="false"/>
+        </w:trPr>
+        <w:tc>
+          <w:tcPr>
+            <w:tcW w:type="dxa" w:w="1040"/>
+            <w:tcBorders>
+              <w:top w:val="single" w:color="D0D7DE" w:sz="4"/>
+              <w:left w:val="single" w:color="D0D7DE" w:sz="4"/>
+              <w:bottom w:val="single" w:color="D0D7DE" w:sz="4"/>
+              <w:right w:val="single" w:color="D0D7DE" w:sz="4"/>
+            </w:tcBorders>
+            <w:tcMar>
+              <w:top w:type="dxa" w:w="60"/>
+              <w:left w:type="dxa" w:w="100"/>
+              <w:bottom w:type="dxa" w:w="60"/>
+              <w:right w:type="dxa" w:w="100"/>
+            </w:tcMar>
+          </w:tcPr>
+          <w:p>
+            <w:pPr>
+              <w:jc w:val="left"/>
+            </w:pPr>
+            <w:r>
+              <w:rPr>
+                <w:rFonts w:ascii="Calibri" w:cs="Calibri" w:eastAsia="Calibri" w:hAnsi="Calibri"/>
+                <w:color w:val="1F2328"/>
+              </w:rPr>
+              <w:t xml:space="preserve">3–5</w:t>
+            </w:r>
+          </w:p>
+        </w:tc>
+        <w:tc>
+          <w:tcPr>
+            <w:tcW w:type="dxa" w:w="8320"/>
+            <w:tcBorders>
+              <w:top w:val="single" w:color="D0D7DE" w:sz="4"/>
+              <w:left w:val="single" w:color="D0D7DE" w:sz="4"/>
+              <w:bottom w:val="single" w:color="D0D7DE" w:sz="4"/>
+              <w:right w:val="single" w:color="D0D7DE" w:sz="4"/>
+            </w:tcBorders>
+            <w:tcMar>
+              <w:top w:type="dxa" w:w="60"/>
+              <w:left w:type="dxa" w:w="100"/>
+              <w:bottom w:type="dxa" w:w="60"/>
+              <w:right w:type="dxa" w:w="100"/>
+            </w:tcMar>
+          </w:tcPr>
+          <w:p>
+            <w:pPr>
+              <w:jc w:val="left"/>
+            </w:pPr>
+            <w:r>
+              <w:rPr>
+                <w:rFonts w:ascii="Calibri" w:cs="Calibri" w:eastAsia="Calibri" w:hAnsi="Calibri"/>
+                <w:color w:val="1F2328"/>
+              </w:rPr>
+              <w:t xml:space="preserve">Level 1: low dark wisps</w:t>
+            </w:r>
+          </w:p>
+        </w:tc>
+      </w:tr>
+      <w:tr>
+        <w:trPr>
+          <w:cantSplit/>
+          <w:tblHeader w:val="false"/>
+        </w:trPr>
+        <w:tc>
+          <w:tcPr>
+            <w:tcW w:type="dxa" w:w="1040"/>
+            <w:tcBorders>
+              <w:top w:val="single" w:color="D0D7DE" w:sz="4"/>
+              <w:left w:val="single" w:color="D0D7DE" w:sz="4"/>
+              <w:bottom w:val="single" w:color="D0D7DE" w:sz="4"/>
+              <w:right w:val="single" w:color="D0D7DE" w:sz="4"/>
+            </w:tcBorders>
+            <w:tcMar>
+              <w:top w:type="dxa" w:w="60"/>
+              <w:left w:type="dxa" w:w="100"/>
+              <w:bottom w:type="dxa" w:w="60"/>
+              <w:right w:type="dxa" w:w="100"/>
+            </w:tcMar>
+          </w:tcPr>
+          <w:p>
+            <w:pPr>
+              <w:jc w:val="left"/>
+            </w:pPr>
+            <w:r>
+              <w:rPr>
+                <w:rFonts w:ascii="Calibri" w:cs="Calibri" w:eastAsia="Calibri" w:hAnsi="Calibri"/>
+                <w:color w:val="1F2328"/>
+              </w:rPr>
+              <w:t xml:space="preserve">6–8</w:t>
+            </w:r>
+          </w:p>
+        </w:tc>
+        <w:tc>
+          <w:tcPr>
+            <w:tcW w:type="dxa" w:w="8320"/>
+            <w:tcBorders>
+              <w:top w:val="single" w:color="D0D7DE" w:sz="4"/>
+              <w:left w:val="single" w:color="D0D7DE" w:sz="4"/>
+              <w:bottom w:val="single" w:color="D0D7DE" w:sz="4"/>
+              <w:right w:val="single" w:color="D0D7DE" w:sz="4"/>
+            </w:tcBorders>
+            <w:tcMar>
+              <w:top w:type="dxa" w:w="60"/>
+              <w:left w:type="dxa" w:w="100"/>
+              <w:bottom w:type="dxa" w:w="60"/>
+              <w:right w:type="dxa" w:w="100"/>
+            </w:tcMar>
+          </w:tcPr>
+          <w:p>
+            <w:pPr>
+              <w:jc w:val="left"/>
+            </w:pPr>
+            <w:r>
+              <w:rPr>
+                <w:rFonts w:ascii="Calibri" w:cs="Calibri" w:eastAsia="Calibri" w:hAnsi="Calibri"/>
+                <w:color w:val="1F2328"/>
+              </w:rPr>
+              <w:t xml:space="preserve">Level 2: fuller, with embers rising</w:t>
+            </w:r>
+          </w:p>
+        </w:tc>
+      </w:tr>
+      <w:tr>
+        <w:trPr>
+          <w:cantSplit/>
+          <w:tblHeader w:val="false"/>
+        </w:trPr>
+        <w:tc>
+          <w:tcPr>
+            <w:tcW w:type="dxa" w:w="1040"/>
+            <w:tcBorders>
+              <w:top w:val="single" w:color="D0D7DE" w:sz="4"/>
+              <w:left w:val="single" w:color="D0D7DE" w:sz="4"/>
+              <w:bottom w:val="single" w:color="D0D7DE" w:sz="4"/>
+              <w:right w:val="single" w:color="D0D7DE" w:sz="4"/>
+            </w:tcBorders>
+            <w:tcMar>
+              <w:top w:type="dxa" w:w="60"/>
+              <w:left w:type="dxa" w:w="100"/>
+              <w:bottom w:type="dxa" w:w="60"/>
+              <w:right w:type="dxa" w:w="100"/>
+            </w:tcMar>
+          </w:tcPr>
+          <w:p>
+            <w:pPr>
+              <w:jc w:val="left"/>
+            </w:pPr>
+            <w:r>
+              <w:rPr>
+                <w:rFonts w:ascii="Calibri" w:cs="Calibri" w:eastAsia="Calibri" w:hAnsi="Calibri"/>
+                <w:color w:val="1F2328"/>
+              </w:rPr>
+              <w:t xml:space="preserve">9–11</w:t>
+            </w:r>
+          </w:p>
+        </w:tc>
+        <w:tc>
+          <w:tcPr>
+            <w:tcW w:type="dxa" w:w="8320"/>
+            <w:tcBorders>
+              <w:top w:val="single" w:color="D0D7DE" w:sz="4"/>
+              <w:left w:val="single" w:color="D0D7DE" w:sz="4"/>
+              <w:bottom w:val="single" w:color="D0D7DE" w:sz="4"/>
+              <w:right w:val="single" w:color="D0D7DE" w:sz="4"/>
+            </w:tcBorders>
+            <w:tcMar>
+              <w:top w:type="dxa" w:w="60"/>
+              <w:left w:type="dxa" w:w="100"/>
+              <w:bottom w:type="dxa" w:w="60"/>
+              <w:right w:type="dxa" w:w="100"/>
+            </w:tcMar>
+          </w:tcPr>
+          <w:p>
+            <w:pPr>
+              <w:jc w:val="left"/>
+            </w:pPr>
+            <w:r>
+              <w:rPr>
+                <w:rFonts w:ascii="Calibri" w:cs="Calibri" w:eastAsia="Calibri" w:hAnsi="Calibri"/>
+                <w:color w:val="1F2328"/>
+              </w:rPr>
+              <w:t xml:space="preserve">Level 3: bigger, a wide dark haze behind him and black crackles</w:t>
+            </w:r>
+          </w:p>
+        </w:tc>
+      </w:tr>
+      <w:tr>
+        <w:trPr>
+          <w:cantSplit/>
+          <w:tblHeader w:val="false"/>
+        </w:trPr>
+        <w:tc>
+          <w:tcPr>
+            <w:tcW w:type="dxa" w:w="1040"/>
+            <w:tcBorders>
+              <w:top w:val="single" w:color="D0D7DE" w:sz="4"/>
+              <w:left w:val="single" w:color="D0D7DE" w:sz="4"/>
+              <w:bottom w:val="single" w:color="D0D7DE" w:sz="4"/>
+              <w:right w:val="single" w:color="D0D7DE" w:sz="4"/>
+            </w:tcBorders>
+            <w:tcMar>
+              <w:top w:type="dxa" w:w="60"/>
+              <w:left w:type="dxa" w:w="100"/>
+              <w:bottom w:type="dxa" w:w="60"/>
+              <w:right w:type="dxa" w:w="100"/>
+            </w:tcMar>
+          </w:tcPr>
+          <w:p>
+            <w:pPr>
+              <w:jc w:val="left"/>
+            </w:pPr>
+            <w:r>
+              <w:rPr>
+                <w:rFonts w:ascii="Calibri" w:cs="Calibri" w:eastAsia="Calibri" w:hAnsi="Calibri"/>
+                <w:color w:val="1F2328"/>
+              </w:rPr>
+              <w:t xml:space="preserve">12+</w:t>
+            </w:r>
+          </w:p>
+        </w:tc>
+        <w:tc>
+          <w:tcPr>
+            <w:tcW w:type="dxa" w:w="8320"/>
+            <w:tcBorders>
+              <w:top w:val="single" w:color="D0D7DE" w:sz="4"/>
+              <w:left w:val="single" w:color="D0D7DE" w:sz="4"/>
+              <w:bottom w:val="single" w:color="D0D7DE" w:sz="4"/>
+              <w:right w:val="single" w:color="D0D7DE" w:sz="4"/>
+            </w:tcBorders>
+            <w:tcMar>
+              <w:top w:type="dxa" w:w="60"/>
+              <w:left w:type="dxa" w:w="100"/>
+              <w:bottom w:type="dxa" w:w="60"/>
+              <w:right w:type="dxa" w:w="100"/>
+            </w:tcMar>
+          </w:tcPr>
+          <w:p>
+            <w:pPr>
+              <w:jc w:val="left"/>
+            </w:pPr>
+            <w:r>
+              <w:rPr>
+                <w:rFonts w:ascii="Calibri" w:cs="Calibri" w:eastAsia="Calibri" w:hAnsi="Calibri"/>
+                <w:color w:val="1F2328"/>
+              </w:rPr>
+              <w:t xml:space="preserve">Level 4 (ultimate): about 2 m of roaring flame over his head, constant crackles and a dark shockwave rolling across the floor</w:t>
+            </w:r>
+          </w:p>
+        </w:tc>
+      </w:tr>
+    </w:tbl>
+    <w:p>
+      <w:pPr>
+        <w:spacing w:after="80"/>
+      </w:pPr>
+    </w:p>
+    <w:p>
+      <w:pPr>
+        <w:pStyle w:val="ListParagraph"/>
+        <w:numPr>
+          <w:ilvl w:val="0"/>
+          <w:numId w:val="2"/>
+        </w:numPr>
+        <w:spacing w:after="80" w:line="276"/>
+      </w:pPr>
+      <w:r>
+        <w:rPr>
+          <w:rFonts w:ascii="Calibri" w:cs="Calibri" w:eastAsia="Calibri" w:hAnsi="Calibri"/>
+          <w:color w:val="1F2328"/>
+        </w:rPr>
+        <w:t xml:space="preserve">In a game the aura uses the streak you brought into it. In the park it updates as soon as a game ends, and other people see your new level too.</w:t>
+      </w:r>
+    </w:p>
+    <w:p>
+      <w:pPr>
+        <w:pStyle w:val="ListParagraph"/>
+        <w:numPr>
+          <w:ilvl w:val="0"/>
+          <w:numId w:val="2"/>
+        </w:numPr>
+        <w:spacing w:after="80" w:line="276"/>
+      </w:pPr>
+      <w:r>
+        <w:rPr>
+          <w:rFonts w:ascii="Calibri" w:cs="Calibri" w:eastAsia="Calibri" w:hAnsi="Calibri"/>
+          <w:b/>
+          <w:bCs/>
+          <w:color w:val="1F2328"/>
+        </w:rPr>
+        <w:t xml:space="preserve">MyPlayer → Badges</w:t>
+      </w:r>
+      <w:r>
+        <w:rPr>
+          <w:rFonts w:ascii="Calibri" w:cs="Calibri" w:eastAsia="Calibri" w:hAnsi="Calibri"/>
+          <w:color w:val="1F2328"/>
+        </w:rPr>
+        <w:t xml:space="preserve"> has a new ICON status card. It shows what's left before you get there (cap breakers, badges, overall). Once you're an ICON, it shows your aura level and how many wins it takes to reach the next one.</w:t>
+      </w:r>
+    </w:p>
+    <w:p>
+      <w:pPr>
+        <w:pStyle w:val="Heading2"/>
+        <w:spacing w:after="80" w:before="200"/>
+      </w:pPr>
+      <w:r>
+        <w:rPr>
+          <w:rFonts w:ascii="Calibri" w:cs="Calibri" w:eastAsia="Calibri" w:hAnsi="Calibri"/>
+          <w:b/>
+          <w:bCs/>
+          <w:color w:val="1F2328"/>
+          <w:sz w:val="26"/>
+          <w:szCs w:val="26"/>
+        </w:rPr>
+        <w:t xml:space="preserve">Open Arms, fixed</w:t>
+      </w:r>
+    </w:p>
+    <w:p>
+      <w:pPr>
+        <w:spacing w:after="140" w:line="288"/>
+      </w:pPr>
+      <w:r>
+        <w:rPr>
+          <w:rFonts w:ascii="Calibri" w:cs="Calibri" w:eastAsia="Calibri" w:hAnsi="Calibri"/>
+          <w:b/>
+          <w:bCs/>
+          <w:color w:val="1F2328"/>
+        </w:rPr>
+        <w:t xml:space="preserve">Open Arms</w:t>
+      </w:r>
+      <w:r>
+        <w:rPr>
+          <w:rFonts w:ascii="Calibri" w:cs="Calibri" w:eastAsia="Calibri" w:hAnsi="Calibri"/>
+          <w:color w:val="1F2328"/>
+        </w:rPr>
+        <w:t xml:space="preserve"> (the Stretch Big Icon badge) now does exactly what it says: "+3% to every shooting and defense attribute (can pass 99). Unlocks exclusive ultra-flashy rebound snags."</w:t>
+      </w:r>
+    </w:p>
+    <w:p>
+      <w:pPr>
+        <w:pStyle w:val="ListParagraph"/>
+        <w:numPr>
+          <w:ilvl w:val="0"/>
+          <w:numId w:val="2"/>
+        </w:numPr>
+        <w:spacing w:after="80" w:line="276"/>
+      </w:pPr>
+      <w:r>
+        <w:rPr>
+          <w:rFonts w:ascii="Calibri" w:cs="Calibri" w:eastAsia="Calibri" w:hAnsi="Calibri"/>
+          <w:b/>
+          <w:bCs/>
+          <w:color w:val="1F2328"/>
+        </w:rPr>
+        <w:t xml:space="preserve">The +3%</w:t>
+      </w:r>
+      <w:r>
+        <w:rPr>
+          <w:rFonts w:ascii="Calibri" w:cs="Calibri" w:eastAsia="Calibri" w:hAnsi="Calibri"/>
+          <w:color w:val="1F2328"/>
+        </w:rPr>
+        <w:t xml:space="preserve"> was already applied in every mode, to all eight shooting and defense attributes. One spot capped it: post defense held Interior D at 99. That's fixed, so it now passes 99 everywhere. The Attributes screen shows a small "+3%" next to each boosted rating (for every Icon badge's boosts).</w:t>
+      </w:r>
+    </w:p>
+    <w:p>
+      <w:pPr>
+        <w:pStyle w:val="ListParagraph"/>
+        <w:numPr>
+          <w:ilvl w:val="0"/>
+          <w:numId w:val="2"/>
+        </w:numPr>
+        <w:spacing w:after="80" w:line="276"/>
+      </w:pPr>
+      <w:r>
+        <w:rPr>
+          <w:rFonts w:ascii="Calibri" w:cs="Calibri" w:eastAsia="Calibri" w:hAnsi="Calibri"/>
+          <w:b/>
+          <w:bCs/>
+          <w:color w:val="1F2328"/>
+        </w:rPr>
+        <w:t xml:space="preserve">The rebound snags almost never showed.</w:t>
+      </w:r>
+      <w:r>
+        <w:rPr>
+          <w:rFonts w:ascii="Calibri" w:cs="Calibri" w:eastAsia="Calibri" w:hAnsi="Calibri"/>
+          <w:color w:val="1F2328"/>
+        </w:rPr>
+        <w:t xml:space="preserve"> Before, the snag only played when the jump had started as a rebound jump while the ball was in the air: in a test, 30 of 68 boards. Floor grabs and boards out of a block jump got the plain catch. Even then the ball jumped to his chest in one frame, so the rip was never seen.</w:t>
+      </w:r>
+    </w:p>
+    <w:p>
+      <w:pPr>
+        <w:pStyle w:val="ListParagraph"/>
+        <w:numPr>
+          <w:ilvl w:val="0"/>
+          <w:numId w:val="2"/>
+        </w:numPr>
+        <w:spacing w:after="80" w:line="276"/>
+      </w:pPr>
+      <w:r>
+        <w:rPr>
+          <w:rFonts w:ascii="Calibri" w:cs="Calibri" w:eastAsia="Calibri" w:hAnsi="Calibri"/>
+          <w:b/>
+          <w:bCs/>
+          <w:color w:val="1F2328"/>
+        </w:rPr>
+        <w:t xml:space="preserve">Now every board an Open Arms holder secures off a shot is a snag:</w:t>
+      </w:r>
+      <w:r>
+        <w:rPr>
+          <w:rFonts w:ascii="Calibri" w:cs="Calibri" w:eastAsia="Calibri" w:hAnsi="Calibri"/>
+          <w:color w:val="1F2328"/>
+        </w:rPr>
+        <w:t xml:space="preserve"> offensive or defensive, on the floor or in the air, user or AI, online too (every screen plays the same snag). The ball stays in his hands through the whole move.</w:t>
+      </w:r>
+    </w:p>
+    <w:p>
+      <w:pPr>
+        <w:pStyle w:val="ListParagraph"/>
+        <w:numPr>
+          <w:ilvl w:val="0"/>
+          <w:numId w:val="2"/>
+        </w:numPr>
+        <w:spacing w:after="80" w:line="276"/>
+      </w:pPr>
+      <w:r>
+        <w:rPr>
+          <w:rFonts w:ascii="Calibri" w:cs="Calibri" w:eastAsia="Calibri" w:hAnsi="Calibri"/>
+          <w:b/>
+          <w:bCs/>
+          <w:color w:val="1F2328"/>
+        </w:rPr>
+        <w:t xml:space="preserve">The landing gesture lasts at most half a second,</w:t>
+      </w:r>
+      <w:r>
+        <w:rPr>
+          <w:rFonts w:ascii="Calibri" w:cs="Calibri" w:eastAsia="Calibri" w:hAnsi="Calibri"/>
+          <w:color w:val="1F2328"/>
+        </w:rPr>
+        <w:t xml:space="preserve"> and moving, dribbling, passing, shooting or jumping cuts it short.</w:t>
+      </w:r>
+    </w:p>
+    <w:p>
+      <w:pPr>
+        <w:pStyle w:val="Heading2"/>
+        <w:spacing w:after="80" w:before="200"/>
+      </w:pPr>
+      <w:r>
+        <w:rPr>
+          <w:rFonts w:ascii="Calibri" w:cs="Calibri" w:eastAsia="Calibri" w:hAnsi="Calibri"/>
+          <w:b/>
+          <w:bCs/>
+          <w:color w:val="1F2328"/>
+          <w:sz w:val="26"/>
+          <w:szCs w:val="26"/>
+        </w:rPr>
+        <w:t xml:space="preserve">Rebound Package: Open Arms</w:t>
+      </w:r>
+    </w:p>
+    <w:p>
+      <w:pPr>
+        <w:spacing w:after="140" w:line="288"/>
+      </w:pPr>
+      <w:r>
+        <w:rPr>
+          <w:rFonts w:ascii="Calibri" w:cs="Calibri" w:eastAsia="Calibri" w:hAnsi="Calibri"/>
+          <w:color w:val="1F2328"/>
+        </w:rPr>
+        <w:t xml:space="preserve">A new animation category, </w:t>
+      </w:r>
+      <w:r>
+        <w:rPr>
+          <w:rFonts w:ascii="Calibri" w:cs="Calibri" w:eastAsia="Calibri" w:hAnsi="Calibri"/>
+          <w:b/>
+          <w:bCs/>
+          <w:color w:val="1F2328"/>
+        </w:rPr>
+        <w:t xml:space="preserve">Rebounds</w:t>
+      </w:r>
+      <w:r>
+        <w:rPr>
+          <w:rFonts w:ascii="Calibri" w:cs="Calibri" w:eastAsia="Calibri" w:hAnsi="Calibri"/>
+          <w:color w:val="1F2328"/>
+        </w:rPr>
+        <w:t xml:space="preserve">, for Stretch Bigs who have unlocked Open Arms, and for nobody else. It's never in the store, it doesn't show in anyone else's Inventory, and the game refuses to equip it on anyone else ("Requires the Open Arms Icon badge"). It comes with the badge and is put on for you, including builds that already held Open Arms. It shows in the Inventory's Rebounds tab and as "Rebound package" under MyPlayer → Animations, where you can preview it.</w:t>
+      </w:r>
+    </w:p>
+    <w:p>
+      <w:pPr>
+        <w:spacing w:after="140" w:line="288"/>
+      </w:pPr>
+      <w:r>
+        <w:rPr>
+          <w:rFonts w:ascii="Calibri" w:cs="Calibri" w:eastAsia="Calibri" w:hAnsi="Calibri"/>
+          <w:color w:val="1F2328"/>
+        </w:rPr>
+        <w:t xml:space="preserve">Six all-new streetball snags, a different one on each board:</w:t>
+      </w:r>
+    </w:p>
+    <w:p>
+      <w:pPr>
+        <w:pStyle w:val="ListParagraph"/>
+        <w:numPr>
+          <w:ilvl w:val="0"/>
+          <w:numId w:val="2"/>
+        </w:numPr>
+        <w:spacing w:after="80" w:line="276"/>
+      </w:pPr>
+      <w:r>
+        <w:rPr>
+          <w:rFonts w:ascii="Calibri" w:cs="Calibri" w:eastAsia="Calibri" w:hAnsi="Calibri"/>
+          <w:b/>
+          <w:bCs/>
+          <w:color w:val="1F2328"/>
+        </w:rPr>
+        <w:t xml:space="preserve">Chin Check:</w:t>
+      </w:r>
+      <w:r>
+        <w:rPr>
+          <w:rFonts w:ascii="Calibri" w:cs="Calibri" w:eastAsia="Calibri" w:hAnsi="Calibri"/>
+          <w:color w:val="1F2328"/>
+        </w:rPr>
+        <w:t xml:space="preserve"> ripped down to the chin, elbows swung hard both ways, then he throws his head back and screams.</w:t>
+      </w:r>
+    </w:p>
+    <w:p>
+      <w:pPr>
+        <w:pStyle w:val="ListParagraph"/>
+        <w:numPr>
+          <w:ilvl w:val="0"/>
+          <w:numId w:val="2"/>
+        </w:numPr>
+        <w:spacing w:after="80" w:line="276"/>
+      </w:pPr>
+      <w:r>
+        <w:rPr>
+          <w:rFonts w:ascii="Calibri" w:cs="Calibri" w:eastAsia="Calibri" w:hAnsi="Calibri"/>
+          <w:b/>
+          <w:bCs/>
+          <w:color w:val="1F2328"/>
+        </w:rPr>
+        <w:t xml:space="preserve">Cuff &amp; Holster:</w:t>
+      </w:r>
+      <w:r>
+        <w:rPr>
+          <w:rFonts w:ascii="Calibri" w:cs="Calibri" w:eastAsia="Calibri" w:hAnsi="Calibri"/>
+          <w:color w:val="1F2328"/>
+        </w:rPr>
+        <w:t xml:space="preserve"> cuffed one-handed at the top and swung straight-armed down to the hip, the other arm flung out; he lands pointing at the floor twice.</w:t>
+      </w:r>
+    </w:p>
+    <w:p>
+      <w:pPr>
+        <w:pStyle w:val="ListParagraph"/>
+        <w:numPr>
+          <w:ilvl w:val="0"/>
+          <w:numId w:val="2"/>
+        </w:numPr>
+        <w:spacing w:after="80" w:line="276"/>
+      </w:pPr>
+      <w:r>
+        <w:rPr>
+          <w:rFonts w:ascii="Calibri" w:cs="Calibri" w:eastAsia="Calibri" w:hAnsi="Calibri"/>
+          <w:b/>
+          <w:bCs/>
+          <w:color w:val="1F2328"/>
+        </w:rPr>
+        <w:t xml:space="preserve">Pterodactyl:</w:t>
+      </w:r>
+      <w:r>
+        <w:rPr>
+          <w:rFonts w:ascii="Calibri" w:cs="Calibri" w:eastAsia="Calibri" w:hAnsi="Calibri"/>
+          <w:color w:val="1F2328"/>
+        </w:rPr>
+        <w:t xml:space="preserve"> legs split wide, the ball swung out to arm's length as both arms spread like wings; he lands holding the wings and gives them a flap.</w:t>
+      </w:r>
+    </w:p>
+    <w:p>
+      <w:pPr>
+        <w:pStyle w:val="ListParagraph"/>
+        <w:numPr>
+          <w:ilvl w:val="0"/>
+          <w:numId w:val="2"/>
+        </w:numPr>
+        <w:spacing w:after="80" w:line="276"/>
+      </w:pPr>
+      <w:r>
+        <w:rPr>
+          <w:rFonts w:ascii="Calibri" w:cs="Calibri" w:eastAsia="Calibri" w:hAnsi="Calibri"/>
+          <w:b/>
+          <w:bCs/>
+          <w:color w:val="1F2328"/>
+        </w:rPr>
+        <w:t xml:space="preserve">360 Rip-Through:</w:t>
+      </w:r>
+      <w:r>
+        <w:rPr>
+          <w:rFonts w:ascii="Calibri" w:cs="Calibri" w:eastAsia="Calibri" w:hAnsi="Calibri"/>
+          <w:color w:val="1F2328"/>
+        </w:rPr>
+        <w:t xml:space="preserve"> a full turn in the air with the ball low through the hips, knees tucked; he lands in a crouch swinging it knee to knee.</w:t>
+      </w:r>
+    </w:p>
+    <w:p>
+      <w:pPr>
+        <w:pStyle w:val="ListParagraph"/>
+        <w:numPr>
+          <w:ilvl w:val="0"/>
+          <w:numId w:val="2"/>
+        </w:numPr>
+        <w:spacing w:after="80" w:line="276"/>
+      </w:pPr>
+      <w:r>
+        <w:rPr>
+          <w:rFonts w:ascii="Calibri" w:cs="Calibri" w:eastAsia="Calibri" w:hAnsi="Calibri"/>
+          <w:b/>
+          <w:bCs/>
+          <w:color w:val="1F2328"/>
+        </w:rPr>
+        <w:t xml:space="preserve">Tomahawk Yank:</w:t>
+      </w:r>
+      <w:r>
+        <w:rPr>
+          <w:rFonts w:ascii="Calibri" w:cs="Calibri" w:eastAsia="Calibri" w:hAnsi="Calibri"/>
+          <w:color w:val="1F2328"/>
+        </w:rPr>
+        <w:t xml:space="preserve"> yanked behind the head with the opposite knee up, then whipped down; he lands bent over it, barking.</w:t>
+      </w:r>
+    </w:p>
+    <w:p>
+      <w:pPr>
+        <w:pStyle w:val="ListParagraph"/>
+        <w:numPr>
+          <w:ilvl w:val="0"/>
+          <w:numId w:val="2"/>
+        </w:numPr>
+        <w:spacing w:after="80" w:line="276"/>
+      </w:pPr>
+      <w:r>
+        <w:rPr>
+          <w:rFonts w:ascii="Calibri" w:cs="Calibri" w:eastAsia="Calibri" w:hAnsi="Calibri"/>
+          <w:b/>
+          <w:bCs/>
+          <w:color w:val="1F2328"/>
+        </w:rPr>
+        <w:t xml:space="preserve">Hammer Down:</w:t>
+      </w:r>
+      <w:r>
+        <w:rPr>
+          <w:rFonts w:ascii="Calibri" w:cs="Calibri" w:eastAsia="Calibri" w:hAnsi="Calibri"/>
+          <w:color w:val="1F2328"/>
+        </w:rPr>
+        <w:t xml:space="preserve"> lifted overhead, hammered down on the landing and pounded twice, then a bicep flex with the ball on the hip.</w:t>
+      </w:r>
+    </w:p>
+    <w:p>
+      <w:pPr>
+        <w:spacing w:after="140" w:line="288"/>
+      </w:pPr>
+      <w:r>
+        <w:rPr>
+          <w:rFonts w:ascii="Calibri" w:cs="Calibri" w:eastAsia="Calibri" w:hAnsi="Calibri"/>
+          <w:color w:val="1F2328"/>
+        </w:rPr>
+        <w:t xml:space="preserve">With the package off, an Open Arms holder still gets a basic snag, the Open Arms Rip.</w:t>
+      </w:r>
+    </w:p>
+    <w:p>
+      <w:pPr>
+        <w:pStyle w:val="Heading2"/>
+        <w:spacing w:after="80" w:before="200"/>
+      </w:pPr>
+      <w:r>
+        <w:rPr>
+          <w:rFonts w:ascii="Calibri" w:cs="Calibri" w:eastAsia="Calibri" w:hAnsi="Calibri"/>
+          <w:b/>
+          <w:bCs/>
+          <w:color w:val="1F2328"/>
+          <w:sz w:val="26"/>
+          <w:szCs w:val="26"/>
+        </w:rPr>
+        <w:t xml:space="preserve">Sharp Eye: the release matches the hop</w:t>
+      </w:r>
+    </w:p>
+    <w:p>
+      <w:pPr>
+        <w:spacing w:after="140" w:line="288"/>
+      </w:pPr>
+      <w:r>
+        <w:rPr>
+          <w:rFonts w:ascii="Calibri" w:cs="Calibri" w:eastAsia="Calibri" w:hAnsi="Calibri"/>
+          <w:color w:val="1F2328"/>
+        </w:rPr>
+        <w:t xml:space="preserve">The Sharp Eye base hops twice as high since v0.4.8.5. Now </w:t>
+      </w:r>
+      <w:r>
+        <w:rPr>
+          <w:rFonts w:ascii="Calibri" w:cs="Calibri" w:eastAsia="Calibri" w:hAnsi="Calibri"/>
+          <w:b/>
+          <w:bCs/>
+          <w:color w:val="1F2328"/>
+        </w:rPr>
+        <w:t xml:space="preserve">the ball leaves at the top of that doubled hop, twice as high above his standing release point as on the old hop.</w:t>
+      </w:r>
+      <w:r>
+        <w:rPr>
+          <w:rFonts w:ascii="Calibri" w:cs="Calibri" w:eastAsia="Calibri" w:hAnsi="Calibri"/>
+          <w:color w:val="1F2328"/>
+        </w:rPr>
+        <w:t xml:space="preserve"> Before:</w:t>
+      </w:r>
+    </w:p>
+    <w:p>
+      <w:pPr>
+        <w:pStyle w:val="ListParagraph"/>
+        <w:numPr>
+          <w:ilvl w:val="0"/>
+          <w:numId w:val="2"/>
+        </w:numPr>
+        <w:spacing w:after="80" w:line="276"/>
+      </w:pPr>
+      <w:r>
+        <w:rPr>
+          <w:rFonts w:ascii="Calibri" w:cs="Calibri" w:eastAsia="Calibri" w:hAnsi="Calibri"/>
+          <w:b/>
+          <w:bCs/>
+          <w:color w:val="1F2328"/>
+        </w:rPr>
+        <w:t xml:space="preserve">Quick shots let go early.</w:t>
+      </w:r>
+      <w:r>
+        <w:rPr>
+          <w:rFonts w:ascii="Calibri" w:cs="Calibri" w:eastAsia="Calibri" w:hAnsi="Calibri"/>
+          <w:color w:val="1F2328"/>
+        </w:rPr>
+        <w:t xml:space="preserve"> Pull-ups and moving shots let go up to 67 ms before the top. They now go at the top.</w:t>
+      </w:r>
+    </w:p>
+    <w:p>
+      <w:pPr>
+        <w:pStyle w:val="ListParagraph"/>
+        <w:numPr>
+          <w:ilvl w:val="0"/>
+          <w:numId w:val="2"/>
+        </w:numPr>
+        <w:spacing w:after="80" w:line="276"/>
+      </w:pPr>
+      <w:r>
+        <w:rPr>
+          <w:rFonts w:ascii="Calibri" w:cs="Calibri" w:eastAsia="Calibri" w:hAnsi="Calibri"/>
+          <w:b/>
+          <w:bCs/>
+          <w:color w:val="1F2328"/>
+        </w:rPr>
+        <w:t xml:space="preserve">The store and MyPlayer preview</w:t>
+      </w:r>
+      <w:r>
+        <w:rPr>
+          <w:rFonts w:ascii="Calibri" w:cs="Calibri" w:eastAsia="Calibri" w:hAnsi="Calibri"/>
+          <w:color w:val="1F2328"/>
+        </w:rPr>
+        <w:t xml:space="preserve"> used its own timing and released up to 105 ms early. It now matches the game exactly. A Sharp Eye holder trying on another base in the store now sees that base, not his Sharp Eye jumper.</w:t>
+      </w:r>
+    </w:p>
+    <w:p>
+      <w:pPr>
+        <w:pStyle w:val="ListParagraph"/>
+        <w:numPr>
+          <w:ilvl w:val="0"/>
+          <w:numId w:val="2"/>
+        </w:numPr>
+        <w:spacing w:after="80" w:line="276"/>
+      </w:pPr>
+      <w:r>
+        <w:rPr>
+          <w:rFonts w:ascii="Calibri" w:cs="Calibri" w:eastAsia="Calibri" w:hAnsi="Calibri"/>
+          <w:b/>
+          <w:bCs/>
+          <w:color w:val="1F2328"/>
+        </w:rPr>
+        <w:t xml:space="preserve">The heels floated</w:t>
+      </w:r>
+      <w:r>
+        <w:rPr>
+          <w:rFonts w:ascii="Calibri" w:cs="Calibri" w:eastAsia="Calibri" w:hAnsi="Calibri"/>
+          <w:color w:val="1F2328"/>
+        </w:rPr>
+        <w:t xml:space="preserve"> on the old hop's timing. They now peak at the top of the doubled hop.</w:t>
+      </w:r>
+    </w:p>
+    <w:p>
+      <w:pPr>
+        <w:pStyle w:val="ListParagraph"/>
+        <w:numPr>
+          <w:ilvl w:val="0"/>
+          <w:numId w:val="2"/>
+        </w:numPr>
+        <w:spacing w:after="80" w:line="276"/>
+      </w:pPr>
+      <w:r>
+        <w:rPr>
+          <w:rFonts w:ascii="Calibri" w:cs="Calibri" w:eastAsia="Calibri" w:hAnsi="Calibri"/>
+          <w:b/>
+          <w:bCs/>
+          <w:color w:val="1F2328"/>
+        </w:rPr>
+        <w:t xml:space="preserve">AI Sharp Eye holders</w:t>
+      </w:r>
+      <w:r>
+        <w:rPr>
+          <w:rFonts w:ascii="Calibri" w:cs="Calibri" w:eastAsia="Calibri" w:hAnsi="Calibri"/>
+          <w:color w:val="1F2328"/>
+        </w:rPr>
+        <w:t xml:space="preserve"> now judge contests the way the defense measures them.</w:t>
+      </w:r>
+    </w:p>
+    <w:p>
+      <w:pPr>
+        <w:spacing w:after="140" w:line="288"/>
+      </w:pPr>
+      <w:r>
+        <w:rPr>
+          <w:rFonts w:ascii="Calibri" w:cs="Calibri" w:eastAsia="Calibri" w:hAnsi="Calibri"/>
+          <w:color w:val="1F2328"/>
+        </w:rPr>
+        <w:t xml:space="preserve">The green window, the release timing and the rule that the defense measures you as if from the old hop height are unchanged. Taking off a little sooner shortens the pump-fake window on quick Sharp Eye shots.</w:t>
+      </w:r>
+    </w:p>
+    <w:p>
+      <w:pPr>
+        <w:pStyle w:val="Heading2"/>
+        <w:spacing w:after="80" w:before="200"/>
+      </w:pPr>
+      <w:r>
+        <w:rPr>
+          <w:rFonts w:ascii="Calibri" w:cs="Calibri" w:eastAsia="Calibri" w:hAnsi="Calibri"/>
+          <w:b/>
+          <w:bCs/>
+          <w:color w:val="1F2328"/>
+          <w:sz w:val="26"/>
+          <w:szCs w:val="26"/>
+        </w:rPr>
+        <w:t xml:space="preserve">Gameplay</w:t>
+      </w:r>
+    </w:p>
+    <w:p>
+      <w:pPr>
+        <w:pStyle w:val="ListParagraph"/>
+        <w:numPr>
+          <w:ilvl w:val="0"/>
+          <w:numId w:val="2"/>
+        </w:numPr>
+        <w:spacing w:after="80" w:line="276"/>
+      </w:pPr>
+      <w:r>
+        <w:rPr>
+          <w:rFonts w:ascii="Calibri" w:cs="Calibri" w:eastAsia="Calibri" w:hAnsi="Calibri"/>
+          <w:b/>
+          <w:bCs/>
+          <w:color w:val="1F2328"/>
+        </w:rPr>
+        <w:t xml:space="preserve">Y / Triangle jumps for a rebound off the ball on offense.</w:t>
+      </w:r>
+      <w:r>
+        <w:rPr>
+          <w:rFonts w:ascii="Calibri" w:cs="Calibri" w:eastAsia="Calibri" w:hAnsi="Calibri"/>
+          <w:color w:val="1F2328"/>
+        </w:rPr>
+        <w:t xml:space="preserve"> It's the block / rebound button, so it now jumps for the board on offense too. It's only ever a jump: with a pass on its way to you, it won't turn into a catch-and-shoot the way the shoot button does. With the ball, Y is still the lob pass; on defense, still the block.</w:t>
+      </w:r>
+    </w:p>
+    <w:p>
+      <w:pPr>
+        <w:pStyle w:val="ListParagraph"/>
+        <w:numPr>
+          <w:ilvl w:val="0"/>
+          <w:numId w:val="2"/>
+        </w:numPr>
+        <w:spacing w:after="80" w:line="276"/>
+      </w:pPr>
+      <w:r>
+        <w:rPr>
+          <w:rFonts w:ascii="Calibri" w:cs="Calibri" w:eastAsia="Calibri" w:hAnsi="Calibri"/>
+          <w:b/>
+          <w:bCs/>
+          <w:color w:val="1F2328"/>
+        </w:rPr>
+        <w:t xml:space="preserve">Half as many fouls in the park.</w:t>
+      </w:r>
+      <w:r>
+        <w:rPr>
+          <w:rFonts w:ascii="Calibri" w:cs="Calibri" w:eastAsia="Calibri" w:hAnsi="Calibri"/>
+          <w:color w:val="1F2328"/>
+        </w:rPr>
+        <w:t xml:space="preserve"> Shooting fouls and reach-ins are called half as often as before (0.375 of the Pro-Am rate, was 0.75). Pro-Am and the Pro Run are unchanged.</w:t>
+      </w:r>
+    </w:p>
+    <w:p>
+      <w:pPr>
+        <w:pStyle w:val="Heading2"/>
+        <w:spacing w:after="80" w:before="200"/>
+      </w:pPr>
+      <w:r>
+        <w:rPr>
+          <w:rFonts w:ascii="Calibri" w:cs="Calibri" w:eastAsia="Calibri" w:hAnsi="Calibri"/>
+          <w:b/>
+          <w:bCs/>
+          <w:color w:val="1F2328"/>
+          <w:sz w:val="26"/>
+          <w:szCs w:val="26"/>
+        </w:rPr>
+        <w:t xml:space="preserve">The Monster Mash gets its own soundtrack</w:t>
+      </w:r>
+    </w:p>
+    <w:p>
+      <w:pPr>
+        <w:spacing w:after="140" w:line="288"/>
+      </w:pPr>
+      <w:r>
+        <w:rPr>
+          <w:rFonts w:ascii="Calibri" w:cs="Calibri" w:eastAsia="Calibri" w:hAnsi="Calibri"/>
+          <w:color w:val="1F2328"/>
+        </w:rPr>
+        <w:t xml:space="preserve">The Monster Mash went live on schedule on October 16 at 00:00 UTC. It now has its own soundtrack, like the Beat:</w:t>
+      </w:r>
+    </w:p>
+    <w:p>
+      <w:pPr>
+        <w:pStyle w:val="ListParagraph"/>
+        <w:numPr>
+          <w:ilvl w:val="0"/>
+          <w:numId w:val="2"/>
+        </w:numPr>
+        <w:spacing w:after="80" w:line="276"/>
+      </w:pPr>
+      <w:r>
+        <w:rPr>
+          <w:rFonts w:ascii="Calibri" w:cs="Calibri" w:eastAsia="Calibri" w:hAnsi="Calibri"/>
+          <w:b/>
+          <w:bCs/>
+          <w:color w:val="1F2328"/>
+        </w:rPr>
+        <w:t xml:space="preserve">27 tracks</w:t>
+      </w:r>
+      <w:r>
+        <w:rPr>
+          <w:rFonts w:ascii="Calibri" w:cs="Calibri" w:eastAsia="Calibri" w:hAnsi="Calibri"/>
+          <w:color w:val="1F2328"/>
+        </w:rPr>
+        <w:t xml:space="preserve"> cut from the Halloween party mix you sent (horror movie themes and Halloween remixes, 77½ minutes).</w:t>
+      </w:r>
+    </w:p>
+    <w:p>
+      <w:pPr>
+        <w:pStyle w:val="ListParagraph"/>
+        <w:numPr>
+          <w:ilvl w:val="0"/>
+          <w:numId w:val="2"/>
+        </w:numPr>
+        <w:spacing w:after="80" w:line="276"/>
+      </w:pPr>
+      <w:r>
+        <w:rPr>
+          <w:rFonts w:ascii="Calibri" w:cs="Calibri" w:eastAsia="Calibri" w:hAnsi="Calibri"/>
+          <w:b/>
+          <w:bCs/>
+          <w:color w:val="1F2328"/>
+        </w:rPr>
+        <w:t xml:space="preserve">They play only at the Monster Mash park,</w:t>
+      </w:r>
+      <w:r>
+        <w:rPr>
+          <w:rFonts w:ascii="Calibri" w:cs="Calibri" w:eastAsia="Calibri" w:hAnsi="Calibri"/>
+          <w:color w:val="1F2328"/>
+        </w:rPr>
+        <w:t xml:space="preserve"> park games included, in a new shuffle every time you arrive. The main soundtrack picks up where it left off when you leave, and the Beat's tracks and the Mash's never mix.</w:t>
+      </w:r>
+    </w:p>
+    <w:p>
+      <w:pPr>
+        <w:pStyle w:val="ListParagraph"/>
+        <w:numPr>
+          <w:ilvl w:val="0"/>
+          <w:numId w:val="2"/>
+        </w:numPr>
+        <w:spacing w:after="80" w:line="276"/>
+      </w:pPr>
+      <w:r>
+        <w:rPr>
+          <w:rFonts w:ascii="Calibri" w:cs="Calibri" w:eastAsia="Calibri" w:hAnsi="Calibri"/>
+          <w:b/>
+          <w:bCs/>
+          <w:color w:val="1F2328"/>
+        </w:rPr>
+        <w:t xml:space="preserve">How the split was made:</w:t>
+      </w:r>
+      <w:r>
+        <w:rPr>
+          <w:rFonts w:ascii="Calibri" w:cs="Calibri" w:eastAsia="Calibri" w:hAnsi="Calibri"/>
+          <w:color w:val="1F2328"/>
+        </w:rPr>
+        <w:t xml:space="preserve"> the mix is almost continuous and beat-matched at about 129 bpm. The cuts are at its one real silence, at four near-silent breaks, and elsewhere where one song hands over to the next. A song's own verse and chorus changes don't count as a cut. Some cuts may still land in the middle of a blend.</w:t>
+      </w:r>
+    </w:p>
+    <w:p>
+      <w:pPr>
+        <w:pStyle w:val="ListParagraph"/>
+        <w:numPr>
+          <w:ilvl w:val="0"/>
+          <w:numId w:val="2"/>
+        </w:numPr>
+        <w:spacing w:after="80" w:line="276"/>
+      </w:pPr>
+      <w:r>
+        <w:rPr>
+          <w:rFonts w:ascii="Calibri" w:cs="Calibri" w:eastAsia="Calibri" w:hAnsi="Calibri"/>
+          <w:b/>
+          <w:bCs/>
+          <w:color w:val="1F2328"/>
+        </w:rPr>
+        <w:t xml:space="preserve">The ticker</w:t>
+      </w:r>
+      <w:r>
+        <w:rPr>
+          <w:rFonts w:ascii="Calibri" w:cs="Calibri" w:eastAsia="Calibri" w:hAnsi="Calibri"/>
+          <w:color w:val="1F2328"/>
+        </w:rPr>
+        <w:t xml:space="preserve"> shows the tracks as "Halloween Party Mix · Cut 1 of 27" and so on, since the mix doesn't name its songs. To put song names on them, edit </w:t>
+      </w:r>
+      <w:r>
+        <w:rPr>
+          <w:rFonts w:ascii="Consolas" w:cs="Consolas" w:eastAsia="Consolas" w:hAnsi="Consolas"/>
+          <w:color w:val="0B5394"/>
+          <w:sz w:val="19"/>
+          <w:szCs w:val="19"/>
+        </w:rPr>
+        <w:t xml:space="preserve">client/audio/monster/tracks.json</w:t>
+      </w:r>
+      <w:r>
+        <w:rPr>
+          <w:rFonts w:ascii="Calibri" w:cs="Calibri" w:eastAsia="Calibri" w:hAnsi="Calibri"/>
+          <w:color w:val="1F2328"/>
+        </w:rPr>
+        <w:t xml:space="preserve">.</w:t>
+      </w:r>
+    </w:p>
+    <w:p>
+      <w:pPr>
+        <w:pStyle w:val="ListParagraph"/>
+        <w:numPr>
+          <w:ilvl w:val="0"/>
+          <w:numId w:val="2"/>
+        </w:numPr>
+        <w:spacing w:after="80" w:line="276"/>
+      </w:pPr>
+      <w:r>
+        <w:rPr>
+          <w:rFonts w:ascii="Calibri" w:cs="Calibri" w:eastAsia="Calibri" w:hAnsi="Calibri"/>
+          <w:color w:val="1F2328"/>
+        </w:rPr>
+        <w:t xml:space="preserve">The last 41 seconds of the file are pure silence, so they were left off.</w:t>
+      </w:r>
+    </w:p>
+    <w:p>
+      <w:pPr>
+        <w:pBdr>
+          <w:bottom w:val="single" w:color="D0D7DE" w:sz="4" w:space="1"/>
+        </w:pBdr>
+        <w:spacing w:after="160" w:before="80"/>
+      </w:pPr>
+    </w:p>
+    <w:p>
+      <w:pPr>
         <w:spacing w:after="140" w:line="288"/>
       </w:pPr>
       <w:r>
@@ -6681,7 +8130,7 @@
           <w:sz w:val="19"/>
           <w:szCs w:val="19"/>
         </w:rPr>
-        <w:t xml:space="preserve">(Tests: 115 Python and 315 node tests, plus browser checks of every park, the Pro-Am rank card and results, the Park screen's locks, the Inventory's locks, the Sharp Eye hop and pop-up, an off-ball screen in a Pro-Am game and the results countdown. For the quick patches: each event park in every direction, its events and streak effect; the rewards on a player and in a game, with the green sounds measured against the other green sounds; and each schedule handover, the event soundtrack and the store labels.)</w:t>
+        <w:t xml:space="preserve">(Tests: 128 Python and 346 node tests, plus browser checks of every park, the Pro-Am rank card and results, the Park screen's locks, the Inventory's locks, the Sharp Eye hop and pop-up, an off-ball screen in a Pro-Am game and the results countdown. For the quick patches: each event park in every direction, its events and streak effect; the rewards on a player and in a game, with the green sounds measured against the other green sounds; each schedule handover, the event soundtracks and the store labels; the ICON cursor and aura at every level in the park, a park game and practice, day and night; every Open Arms snag in the showroom and in games; and the Sharp Eye release frame by frame against the old hop.)</w:t>
       </w:r>
     </w:p>
     <w:sectPr>

</xml_diff>

<commit_message>
QP For better Park AI
</commit_message>
<xml_diff>
--- a/PATCH_NOTES_v0.4.8.5.docx
+++ b/PATCH_NOTES_v0.4.8.5.docx
@@ -8119,6 +8119,194 @@
     </w:p>
     <w:p>
       <w:pPr>
+        <w:pStyle w:val="Heading1"/>
+        <w:spacing w:after="120" w:before="280"/>
+      </w:pPr>
+      <w:r>
+        <w:rPr>
+          <w:rFonts w:ascii="Calibri" w:cs="Calibri" w:eastAsia="Calibri" w:hAnsi="Calibri"/>
+          <w:b/>
+          <w:bCs/>
+          <w:color w:val="C8102E"/>
+          <w:sz w:val="32"/>
+          <w:szCs w:val="32"/>
+        </w:rPr>
+        <w:t xml:space="preserve">Quick patch 4 (Oct 16): event parks keep their crowd through a handover</w:t>
+      </w:r>
+    </w:p>
+    <w:p>
+      <w:pPr>
+        <w:spacing w:after="140" w:line="288"/>
+      </w:pPr>
+      <w:r>
+        <w:rPr>
+          <w:rFonts w:ascii="Calibri" w:cs="Calibri" w:eastAsia="Calibri" w:hAnsi="Calibri"/>
+          <w:b/>
+          <w:bCs/>
+          <w:color w:val="1F2328"/>
+        </w:rPr>
+        <w:t xml:space="preserve">The bug:</w:t>
+      </w:r>
+      <w:r>
+        <w:rPr>
+          <w:rFonts w:ascii="Calibri" w:cs="Calibri" w:eastAsia="Calibri" w:hAnsi="Calibri"/>
+          <w:color w:val="1F2328"/>
+        </w:rPr>
+        <w:t xml:space="preserve"> online players found And The Beat Goes On empty right after it took over from The Jungle Ballers at 5 pm Pacific, when the park should have been busy. The game decided which event was on </w:t>
+      </w:r>
+      <w:r>
+        <w:rPr>
+          <w:rFonts w:ascii="Calibri" w:cs="Calibri" w:eastAsia="Calibri" w:hAnsi="Calibri"/>
+          <w:b/>
+          <w:bCs/>
+          <w:color w:val="1F2328"/>
+        </w:rPr>
+        <w:t xml:space="preserve">once, when it was started.</w:t>
+      </w:r>
+      <w:r>
+        <w:rPr>
+          <w:rFonts w:ascii="Calibri" w:cs="Calibri" w:eastAsia="Calibri" w:hAnsi="Calibri"/>
+          <w:color w:val="1F2328"/>
+        </w:rPr>
+        <w:t xml:space="preserve"> Anyone who had the game open through the switch kept sending the event's AI players to the park that had just closed. The Park screen did move on to the Beat, but its AI world still sent everyone to the Jungle, so the Beat stood empty. That lasted until the game was restarted. A game started after 5 pm was fine.</w:t>
+      </w:r>
+    </w:p>
+    <w:p>
+      <w:pPr>
+        <w:pStyle w:val="ListParagraph"/>
+        <w:numPr>
+          <w:ilvl w:val="0"/>
+          <w:numId w:val="2"/>
+        </w:numPr>
+        <w:spacing w:after="80" w:line="276"/>
+      </w:pPr>
+      <w:r>
+        <w:rPr>
+          <w:rFonts w:ascii="Calibri" w:cs="Calibri" w:eastAsia="Calibri" w:hAnsi="Calibri"/>
+          <w:color w:val="1F2328"/>
+        </w:rPr>
+        <w:t xml:space="preserve">Measured on the evening of the switch: with the event set right, about 30–35 AI players were at the Beat from 5 pm on (busy, as the schedule rules intend). With the stale setting there were none.</w:t>
+      </w:r>
+    </w:p>
+    <w:p>
+      <w:pPr>
+        <w:spacing w:after="140" w:line="288"/>
+      </w:pPr>
+      <w:r>
+        <w:rPr>
+          <w:rFonts w:ascii="Calibri" w:cs="Calibri" w:eastAsia="Calibri" w:hAnsi="Calibri"/>
+          <w:b/>
+          <w:bCs/>
+          <w:color w:val="1F2328"/>
+        </w:rPr>
+        <w:t xml:space="preserve">The fix:</w:t>
+      </w:r>
+    </w:p>
+    <w:p>
+      <w:pPr>
+        <w:pStyle w:val="ListParagraph"/>
+        <w:numPr>
+          <w:ilvl w:val="0"/>
+          <w:numId w:val="2"/>
+        </w:numPr>
+        <w:spacing w:after="80" w:line="276"/>
+      </w:pPr>
+      <w:r>
+        <w:rPr>
+          <w:rFonts w:ascii="Calibri" w:cs="Calibri" w:eastAsia="Calibri" w:hAnsi="Calibri"/>
+          <w:b/>
+          <w:bCs/>
+          <w:color w:val="1F2328"/>
+        </w:rPr>
+        <w:t xml:space="preserve">The game now knows the whole event schedule,</w:t>
+      </w:r>
+      <w:r>
+        <w:rPr>
+          <w:rFonts w:ascii="Calibri" w:cs="Calibri" w:eastAsia="Calibri" w:hAnsi="Calibri"/>
+          <w:color w:val="1F2328"/>
+        </w:rPr>
+        <w:t xml:space="preserve"> not just the event that was on when it started. The AI world follows it to the second: the moment one event hands over to the next, the entrants go to the new park and the closed one empties.</w:t>
+      </w:r>
+    </w:p>
+    <w:p>
+      <w:pPr>
+        <w:pStyle w:val="ListParagraph"/>
+        <w:numPr>
+          <w:ilvl w:val="0"/>
+          <w:numId w:val="2"/>
+        </w:numPr>
+        <w:spacing w:after="80" w:line="276"/>
+      </w:pPr>
+      <w:r>
+        <w:rPr>
+          <w:rFonts w:ascii="Calibri" w:cs="Calibri" w:eastAsia="Calibri" w:hAnsi="Calibri"/>
+          <w:b/>
+          <w:bCs/>
+          <w:color w:val="1F2328"/>
+        </w:rPr>
+        <w:t xml:space="preserve">The Park screen, its event card and the leaderboard switch on their own</w:t>
+      </w:r>
+      <w:r>
+        <w:rPr>
+          <w:rFonts w:ascii="Calibri" w:cs="Calibri" w:eastAsia="Calibri" w:hAnsi="Calibri"/>
+          <w:color w:val="1F2328"/>
+        </w:rPr>
+        <w:t xml:space="preserve"> within a few seconds of a handover, and the game tells you ("And The Beat Goes On is live now"). If you're standing in the park that just closed, it says so ("The Jungle Ballers has closed: its leaderboard is final").</w:t>
+      </w:r>
+    </w:p>
+    <w:p>
+      <w:pPr>
+        <w:pStyle w:val="ListParagraph"/>
+        <w:numPr>
+          <w:ilvl w:val="0"/>
+          <w:numId w:val="2"/>
+        </w:numPr>
+        <w:spacing w:after="80" w:line="276"/>
+      </w:pPr>
+      <w:r>
+        <w:rPr>
+          <w:rFonts w:ascii="Calibri" w:cs="Calibri" w:eastAsia="Calibri" w:hAnsi="Calibri"/>
+          <w:b/>
+          <w:bCs/>
+          <w:color w:val="1F2328"/>
+        </w:rPr>
+        <w:t xml:space="preserve">The handover uses the server's clock,</w:t>
+      </w:r>
+      <w:r>
+        <w:rPr>
+          <w:rFonts w:ascii="Calibri" w:cs="Calibri" w:eastAsia="Calibri" w:hAnsi="Calibri"/>
+          <w:color w:val="1F2328"/>
+        </w:rPr>
+        <w:t xml:space="preserve"> so a PC clock that's a few minutes off still switches at the right moment. The server has the last word if the schedule is ever edited while people are playing.</w:t>
+      </w:r>
+    </w:p>
+    <w:p>
+      <w:pPr>
+        <w:pStyle w:val="ListParagraph"/>
+        <w:numPr>
+          <w:ilvl w:val="0"/>
+          <w:numId w:val="2"/>
+        </w:numPr>
+        <w:spacing w:after="80" w:line="276"/>
+      </w:pPr>
+      <w:r>
+        <w:rPr>
+          <w:rFonts w:ascii="Calibri" w:cs="Calibri" w:eastAsia="Calibri" w:hAnsi="Calibri"/>
+          <w:color w:val="1F2328"/>
+        </w:rPr>
+        <w:t xml:space="preserve">Tested live: a game started before a handover switched 8 seconds after it. The new event park then had 35 AI players online, all 6 courts in play and people walking around, and the old park had none.</w:t>
+      </w:r>
+    </w:p>
+    <w:p>
+      <w:pPr>
+        <w:pBdr>
+          <w:bottom w:val="single" w:color="D0D7DE" w:sz="4" w:space="1"/>
+        </w:pBdr>
+        <w:spacing w:after="160" w:before="80"/>
+      </w:pPr>
+    </w:p>
+    <w:p>
+      <w:pPr>
         <w:spacing w:after="140" w:line="288"/>
       </w:pPr>
       <w:r>
@@ -8130,7 +8318,7 @@
           <w:sz w:val="19"/>
           <w:szCs w:val="19"/>
         </w:rPr>
-        <w:t xml:space="preserve">(Tests: 128 Python and 346 node tests, plus browser checks of every park, the Pro-Am rank card and results, the Park screen's locks, the Inventory's locks, the Sharp Eye hop and pop-up, an off-ball screen in a Pro-Am game and the results countdown. For the quick patches: each event park in every direction, its events and streak effect; the rewards on a player and in a game, with the green sounds measured against the other green sounds; each schedule handover, the event soundtracks and the store labels; the ICON cursor and aura at every level in the park, a park game and practice, day and night; every Open Arms snag in the showroom and in games; and the Sharp Eye release frame by frame against the old hop.)</w:t>
+        <w:t xml:space="preserve">(Tests: 130 Python and 351 node tests, plus browser checks of every park, the Pro-Am rank card and results, the Park screen's locks, the Inventory's locks, the Sharp Eye hop and pop-up, an off-ball screen in a Pro-Am game and the results countdown. For the quick patches: each event park in every direction, its events and streak effect; the rewards on a player and in a game, with the green sounds measured against the other green sounds; each schedule handover, the event soundtracks and the store labels; the ICON cursor and aura at every level in the park, a park game and practice, day and night; every Open Arms snag in the showroom and in games; the Sharp Eye release frame by frame against the old hop; and a live event handover with the game left running.)</w:t>
       </w:r>
     </w:p>
     <w:sectPr>

</xml_diff>